<commit_message>
feat(naranjo): incorporar horario oficial 42h (L-V), regimen de patio y los 8 diagramas tecnicos en alta resolucion
</commit_message>
<xml_diff>
--- a/Plan_Sistema_Acceso_Recuperaciones_Naranjo_Cartagena.docx
+++ b/Plan_Sistema_Acceso_Recuperaciones_Naranjo_Cartagena.docx
@@ -27,11 +27,11 @@
           <w:rFonts w:ascii="Segoe UI" w:hAnsi="Segoe UI"/>
           <w:b/>
           <w:color w:val="0F172A"/>
-          <w:sz w:val="40"/>
+          <w:sz w:val="38"/>
         </w:rPr>
-        <w:t>SISTEMA INTEGRAL DE CONTROL DE ACCESO, ASISTENCIA Y PORTERÍA INDUSTRIAL</w:t>
+        <w:t>SISTEMA INTEGRAL DE CONTROL DE ACCESO, ASISTENCIA 42H Y PORTERÍA INDUSTRIAL</w:t>
         <w:br/>
-        <w:t>RECUPERACIONES NARANJO S.A.S.</w:t>
+        <w:t>RECUPERACIONES NARANJO RECYCLING S.A.S.</w:t>
       </w:r>
     </w:p>
     <w:p>
@@ -44,16 +44,16 @@
     </w:p>
     <w:p>
       <w:pPr>
-        <w:spacing w:before="120" w:after="400"/>
+        <w:spacing w:before="120" w:after="360"/>
         <w:jc w:val="center"/>
       </w:pPr>
       <w:r>
         <w:rPr>
           <w:rFonts w:ascii="Segoe UI" w:hAnsi="Segoe UI"/>
           <w:color w:val="334155"/>
-          <w:sz w:val="20"/>
+          <w:sz w:val="19"/>
         </w:rPr>
-        <w:t>Sede Industrial Cartagena de Indias (Bolívar, Colombia) — Solución personalizada para el control ágil de ingreso y salida de operarios mediante Cédula de Ciudadanía en Pantalla Kiosco Táctil, Monitoreo en Vivo de Cuadrilla para Jefes de Patio, Pre-Liquidación Automática de Jornadas y Recargos según el Código Sustantivo del Trabajo de Colombia, Gestión de Visitantes/Contratistas y Modo Garita Offline-First.</w:t>
+        <w:t>Sede Industrial Cartagena de Indias (Bolívar, Colombia) — Solución especializada para el registro ágil de ingreso y salida de operarios mediante Cédula de Ciudadanía en Pantalla Kiosco Táctil, Horario Oficial Lunes a Viernes de 42 Horas Semanales (según Memorando Corporativo y Ley 2101 / CST), Gestión de Jornadas Extraordinarias de Patio en Sábados, Domingos y Festivos, Monitoreo de Cuadrilla en Vivo para Jefes de Patio, Pre-Liquidación de Nómina para Gestión Humana y Modo Garita Offline-First.</w:t>
       </w:r>
     </w:p>
     <w:tbl>
@@ -192,7 +192,7 @@
                 <w:color w:val="334155"/>
                 <w:sz w:val="17"/>
               </w:rPr>
-              <w:t>Recuperaciones Naranjo S.A.S.</w:t>
+              <w:t>Recuperaciones Naranjo Recycling S.A.S.</w:t>
             </w:r>
           </w:p>
         </w:tc>
@@ -356,7 +356,7 @@
                 <w:color w:val="0F172A"/>
                 <w:sz w:val="17"/>
               </w:rPr>
-              <w:t>Población Usuaria</w:t>
+              <w:t>Horario Oficial Lunes a Viernes</w:t>
             </w:r>
           </w:p>
         </w:tc>
@@ -387,7 +387,7 @@
                 <w:color w:val="334155"/>
                 <w:sz w:val="17"/>
               </w:rPr>
-              <w:t>Operarios de Patio, Oxigenistas, Choferes de Grúa/Tractomula, Supervisores, Vigilancia y Personal Administrativo</w:t>
+              <w:t>42 Horas Semanales: Lunes (8:00–16:30, alm 1.5h), Mar/Vie (7:30–17:00, alm 1h), Mié/Jue (7:30–17:30, alm 1h)</w:t>
             </w:r>
           </w:p>
         </w:tc>
@@ -421,7 +421,7 @@
                 <w:color w:val="0F172A"/>
                 <w:sz w:val="17"/>
               </w:rPr>
-              <w:t>Mecanismo Principal de Fichaje</w:t>
+              <w:t>Régimen Fin de Semana (Patio)</w:t>
             </w:r>
           </w:p>
         </w:tc>
@@ -452,7 +452,7 @@
                 <w:color w:val="334155"/>
                 <w:sz w:val="17"/>
               </w:rPr>
-              <w:t>Digitación de Cédula de Ciudadanía en Kiosco Táctil Industrial + Lector de Código de Barras / QR</w:t>
+              <w:t>Sábados, Domingos y Festivos: NO laboral para Administración. Laboral extraordinario para Patio con recargos de Ley (HED 25%, HEN 75%, Dominical 75%/100%)</w:t>
             </w:r>
           </w:p>
         </w:tc>
@@ -486,7 +486,7 @@
                 <w:color w:val="0F172A"/>
                 <w:sz w:val="17"/>
               </w:rPr>
-              <w:t>Lógica de Cálculo Laboral</w:t>
+              <w:t>Mecanismo Principal de Fichaje</w:t>
             </w:r>
           </w:p>
         </w:tc>
@@ -517,7 +517,7 @@
                 <w:color w:val="334155"/>
                 <w:sz w:val="17"/>
               </w:rPr>
-              <w:t>Legislación Laboral Colombiana (CST): Horas Ordinarias, Extras Diurnas (25%), Extras Nocturnas (75%), Recargos Nocturnos (35%) y Festivos</w:t>
+              <w:t>Digitación de Cédula de Ciudadanía en Kiosco Táctil Industrial + Lector de Código de Barras / QR</w:t>
             </w:r>
           </w:p>
         </w:tc>
@@ -551,7 +551,7 @@
                 <w:color w:val="0F172A"/>
                 <w:sz w:val="17"/>
               </w:rPr>
-              <w:t>Monitoreo para Jefes de Área</w:t>
+              <w:t>Monitoreo para Jefes de Patio</w:t>
             </w:r>
           </w:p>
         </w:tc>
@@ -582,7 +582,7 @@
                 <w:color w:val="334155"/>
                 <w:sz w:val="17"/>
               </w:rPr>
-              <w:t>Tablero Móvil y Web en Vivo (Presentes, Tardanzas, Ausentes, Horas trabajadas en el día)</w:t>
+              <w:t>Tablero Móvil y Web 'Mi Cuadrilla en Vivo' (Presentes, Tardanzas, Ausentes y Alertas a 15 min)</w:t>
             </w:r>
           </w:p>
         </w:tc>
@@ -616,7 +616,7 @@
                 <w:color w:val="0F172A"/>
                 <w:sz w:val="17"/>
               </w:rPr>
-              <w:t>Continuidad de Servicio</w:t>
+              <w:t>Consola de Vigilante y Aforo</w:t>
             </w:r>
           </w:p>
         </w:tc>
@@ -647,7 +647,7 @@
                 <w:color w:val="334155"/>
                 <w:sz w:val="17"/>
               </w:rPr>
-              <w:t>Arquitectura Garita Offline-First con base de datos local SQLite y respaldo de energía UPS</w:t>
+              <w:t>Monitor espejo con foto del colaborador, registro de camiones de chatarra/báscula y aforo en vivo</w:t>
             </w:r>
           </w:p>
         </w:tc>
@@ -681,6 +681,71 @@
                 <w:color w:val="0F172A"/>
                 <w:sz w:val="17"/>
               </w:rPr>
+              <w:t>Continuidad de Servicio</w:t>
+            </w:r>
+          </w:p>
+        </w:tc>
+        <w:tc>
+          <w:tcPr>
+            <w:tcW w:type="dxa" w:w="4816"/>
+            <w:shd w:val="clear" w:color="auto" w:fill="FFFFFF"/>
+            <w:tcBorders>
+              <w:top w:val="single" w:sz="4" w:space="0" w:color="CBD5E1"/>
+              <w:left w:val="single" w:sz="4" w:space="0" w:color="CBD5E1"/>
+              <w:bottom w:val="single" w:sz="4" w:space="0" w:color="CBD5E1"/>
+              <w:right w:val="single" w:sz="4" w:space="0" w:color="CBD5E1"/>
+            </w:tcBorders>
+            <w:tcMar>
+              <w:top w:w="80" w:type="dxa"/>
+              <w:bottom w:w="80" w:type="dxa"/>
+              <w:left w:w="100" w:type="dxa"/>
+              <w:right w:w="100" w:type="dxa"/>
+            </w:tcMar>
+          </w:tcPr>
+          <w:p>
+            <w:pPr>
+              <w:spacing w:before="0" w:after="0"/>
+            </w:pPr>
+            <w:r>
+              <w:rPr>
+                <w:rFonts w:ascii="Segoe UI" w:hAnsi="Segoe UI"/>
+                <w:color w:val="334155"/>
+                <w:sz w:val="17"/>
+              </w:rPr>
+              <w:t>Arquitectura Garita Offline-First con base de datos local SQLite y respaldo de energía UPS</w:t>
+            </w:r>
+          </w:p>
+        </w:tc>
+      </w:tr>
+      <w:tr>
+        <w:tc>
+          <w:tcPr>
+            <w:tcW w:type="dxa" w:w="4816"/>
+            <w:shd w:val="clear" w:color="auto" w:fill="F8FAFC"/>
+            <w:tcBorders>
+              <w:top w:val="single" w:sz="4" w:space="0" w:color="CBD5E1"/>
+              <w:left w:val="single" w:sz="4" w:space="0" w:color="CBD5E1"/>
+              <w:bottom w:val="single" w:sz="4" w:space="0" w:color="CBD5E1"/>
+              <w:right w:val="single" w:sz="4" w:space="0" w:color="CBD5E1"/>
+            </w:tcBorders>
+            <w:tcMar>
+              <w:top w:w="80" w:type="dxa"/>
+              <w:bottom w:w="80" w:type="dxa"/>
+              <w:left w:w="100" w:type="dxa"/>
+              <w:right w:w="100" w:type="dxa"/>
+            </w:tcMar>
+          </w:tcPr>
+          <w:p>
+            <w:pPr>
+              <w:spacing w:before="0" w:after="0"/>
+            </w:pPr>
+            <w:r>
+              <w:rPr>
+                <w:rFonts w:ascii="Segoe UI" w:hAnsi="Segoe UI"/>
+                <w:b/>
+                <w:color w:val="0F172A"/>
+                <w:sz w:val="17"/>
+              </w:rPr>
               <w:t>Fecha de Formulación</w:t>
             </w:r>
           </w:p>
@@ -688,7 +753,7 @@
         <w:tc>
           <w:tcPr>
             <w:tcW w:type="dxa" w:w="4816"/>
-            <w:shd w:val="clear" w:color="auto" w:fill="FFFFFF"/>
+            <w:shd w:val="clear" w:color="auto" w:fill="F8FAFC"/>
             <w:tcBorders>
               <w:top w:val="single" w:sz="4" w:space="0" w:color="CBD5E1"/>
               <w:left w:val="single" w:sz="4" w:space="0" w:color="CBD5E1"/>
@@ -761,7 +826,7 @@
           <w:color w:val="334155"/>
           <w:sz w:val="19"/>
         </w:rPr>
-        <w:t>Recuperaciones Naranjo S.A.S. es una empresa líder en la recuperación ambiental de metales ferrosos y no ferrosos, chatarrización pesada y desintegración vehicular en Cartagena de Indias. Las instalaciones de la planta industrial combinan el ingreso continuo de vehículos de carga pesada (tractomulas, camiones recolectores) con el flujo de personal operativo en turnos diurnos, mixtos y nocturnos. Implementar un sistema de control de acceso integral responde a tres necesidades críticas: exactitud en el control de asistencia para la nómina, supervisión en tiempo real por parte de los jefes de cuadrilla y cumplimiento estricto de los estándares de Seguridad y Salud en el Trabajo (SST/ARL).</w:t>
+        <w:t>Recuperaciones Naranjo Recycling S.A.S. es una empresa líder en la recuperación ambiental de metales ferrosos y no ferrosos, chatarrización pesada y desintegración vehicular en Cartagena de Indias. Las instalaciones de la planta combinan el ingreso continuo de vehículos de carga pesada (tractomulas, camiones recolectores) con el flujo de personal operativo de patio (clasificadores, oxigenistas, choferes de grúa/retroexcavadora) y personal administrativo. La automatización del control de acceso garantiza exactitud en el pago de nómina, control de aforo para SST/ARL y supervisión en tiempo real de cuadrillas.</w:t>
       </w:r>
     </w:p>
     <w:tbl>
@@ -811,7 +876,7 @@
                 <w:color w:val="334155"/>
                 <w:sz w:val="18"/>
               </w:rPr>
-              <w:t>Garantizar que todo operario y colaborador que ingrese a las instalaciones de Recuperaciones Naranjo en Cartagena registre su entrada y salida en menos de 1 segundo mediante su Cédula de Ciudadanía en una pantalla táctil industrial, calculando al instante su puntualidad, informando en tiempo real al jefe de área sobre la disponibilidad de su equipo y suministrando al Administrador/Gestión Humana un consolidado exacto de horas extras y recargos para nómina.</w:t>
+              <w:t>Permitir que todo operario y colaborador que ingrese a las instalaciones de Recuperaciones Naranjo en Cartagena registre su entrada y salida en menos de 1 segundo mediante su Cédula de Ciudadanía en una pantalla táctil industrial, controlando la puntualidad frente al horario oficial de 42 horas semanales, informando en tiempo real al jefe de patio sobre la disponibilidad de su equipo y suministrando a Gestión Humana la pre-liquidación exacta de horas extras y recargos.</w:t>
             </w:r>
           </w:p>
         </w:tc>
@@ -821,6 +886,61 @@
       <w:pPr>
         <w:spacing w:after="80"/>
       </w:pPr>
+    </w:p>
+    <w:p>
+      <w:pPr>
+        <w:spacing w:before="120" w:after="40"/>
+        <w:jc w:val="center"/>
+      </w:pPr>
+      <w:r>
+        <w:drawing>
+          <wp:inline xmlns:a="http://schemas.openxmlformats.org/drawingml/2006/main" xmlns:pic="http://schemas.openxmlformats.org/drawingml/2006/picture">
+            <wp:extent cx="5852160" cy="3657600"/>
+            <wp:docPr id="1" name="Picture 1"/>
+            <wp:cNvGraphicFramePr>
+              <a:graphicFrameLocks noChangeAspect="1"/>
+            </wp:cNvGraphicFramePr>
+            <a:graphic>
+              <a:graphicData uri="http://schemas.openxmlformats.org/drawingml/2006/picture">
+                <pic:pic>
+                  <pic:nvPicPr>
+                    <pic:cNvPr id="0" name="01_Casos_De_Uso_Recuperaciones_Naranjo.png"/>
+                    <pic:cNvPicPr/>
+                  </pic:nvPicPr>
+                  <pic:blipFill>
+                    <a:blip r:embed="rId11"/>
+                    <a:stretch>
+                      <a:fillRect/>
+                    </a:stretch>
+                  </pic:blipFill>
+                  <pic:spPr>
+                    <a:xfrm>
+                      <a:off x="0" y="0"/>
+                      <a:ext cx="5852160" cy="3657600"/>
+                    </a:xfrm>
+                    <a:prstGeom prst="rect"/>
+                  </pic:spPr>
+                </pic:pic>
+              </a:graphicData>
+            </a:graphic>
+          </wp:inline>
+        </w:drawing>
+      </w:r>
+    </w:p>
+    <w:p>
+      <w:pPr>
+        <w:spacing w:after="200"/>
+        <w:jc w:val="center"/>
+      </w:pPr>
+      <w:r>
+        <w:rPr>
+          <w:rFonts w:ascii="Segoe UI" w:hAnsi="Segoe UI"/>
+          <w:i/>
+          <w:color w:val="EA580C"/>
+          <w:sz w:val="17"/>
+        </w:rPr>
+        <w:t>Figura Oficial: Diagrama 01: Casos de Uso del Sistema de Control de Acceso y Asistencia (docs/diagramas_naranjo_png/01_Casos_De_Uso_Recuperaciones_Naranjo.png)</w:t>
+      </w:r>
     </w:p>
     <w:p>
       <w:pPr>
@@ -834,7 +954,7 @@
           <w:color w:val="0F172A"/>
           <w:sz w:val="31"/>
         </w:rPr>
-        <w:t>2. El Kiosco de Garita: Experiencia del Trabajador con Cédula</w:t>
+        <w:t>2. Horario Laboral Oficial de la Empresa (Memorando Septiembre 2026)</w:t>
       </w:r>
     </w:p>
     <w:p>
@@ -855,8 +975,1734 @@
           <w:color w:val="334155"/>
           <w:sz w:val="19"/>
         </w:rPr>
-        <w:t>En la portería peatonal se ubicará una pantalla táctil industrial (All-in-One de 15 a 21 pulgadas) empotrada a la pared o instalada en tótem metálico. La interfaz estará diseñada con una estética de alto impacto y usabilidad intuitiva:</w:t>
+        <w:t>Conforme al Comunicado Oficial emitido por la Gerencia de Recuperaciones Naranjo Recycling S.A.S., el horario de trabajo de lunes a viernes distribuye exactamente 42 horas semanales ordinarias, en estricto cumplimiento del Código Sustantivo del Trabajo y la Ley 2101 de Colombia:</w:t>
       </w:r>
+    </w:p>
+    <w:tbl>
+      <w:tblPr>
+        <w:tblW w:type="auto" w:w="0"/>
+        <w:jc w:val="center"/>
+        <w:tblLook w:firstColumn="1" w:firstRow="1" w:lastColumn="0" w:lastRow="0" w:noHBand="0" w:noVBand="1" w:val="04A0"/>
+      </w:tblPr>
+      <w:tblGrid>
+        <w:gridCol w:w="1605"/>
+        <w:gridCol w:w="1605"/>
+        <w:gridCol w:w="1605"/>
+        <w:gridCol w:w="1605"/>
+        <w:gridCol w:w="1605"/>
+        <w:gridCol w:w="1605"/>
+      </w:tblGrid>
+      <w:tr>
+        <w:tc>
+          <w:tcPr>
+            <w:tcW w:type="dxa" w:w="1605"/>
+            <w:shd w:val="clear" w:color="auto" w:fill="1E293B"/>
+            <w:tcBorders>
+              <w:top w:val="single" w:sz="6" w:space="0" w:color="334155"/>
+              <w:left w:val="single" w:sz="6" w:space="0" w:color="334155"/>
+              <w:bottom w:val="single" w:sz="6" w:space="0" w:color="334155"/>
+              <w:right w:val="single" w:sz="6" w:space="0" w:color="334155"/>
+            </w:tcBorders>
+            <w:tcMar>
+              <w:top w:w="90" w:type="dxa"/>
+              <w:bottom w:w="90" w:type="dxa"/>
+              <w:left w:w="110" w:type="dxa"/>
+              <w:right w:w="110" w:type="dxa"/>
+            </w:tcMar>
+          </w:tcPr>
+          <w:p>
+            <w:pPr>
+              <w:spacing w:before="0" w:after="0"/>
+            </w:pPr>
+            <w:r>
+              <w:rPr>
+                <w:rFonts w:ascii="Segoe UI" w:hAnsi="Segoe UI"/>
+                <w:b/>
+                <w:color w:val="FFFFFF"/>
+                <w:sz w:val="18"/>
+              </w:rPr>
+              <w:t>Día de la Semana</w:t>
+            </w:r>
+          </w:p>
+        </w:tc>
+        <w:tc>
+          <w:tcPr>
+            <w:tcW w:type="dxa" w:w="1605"/>
+            <w:shd w:val="clear" w:color="auto" w:fill="1E293B"/>
+            <w:tcBorders>
+              <w:top w:val="single" w:sz="6" w:space="0" w:color="334155"/>
+              <w:left w:val="single" w:sz="6" w:space="0" w:color="334155"/>
+              <w:bottom w:val="single" w:sz="6" w:space="0" w:color="334155"/>
+              <w:right w:val="single" w:sz="6" w:space="0" w:color="334155"/>
+            </w:tcBorders>
+            <w:tcMar>
+              <w:top w:w="90" w:type="dxa"/>
+              <w:bottom w:w="90" w:type="dxa"/>
+              <w:left w:w="110" w:type="dxa"/>
+              <w:right w:w="110" w:type="dxa"/>
+            </w:tcMar>
+          </w:tcPr>
+          <w:p>
+            <w:pPr>
+              <w:spacing w:before="0" w:after="0"/>
+            </w:pPr>
+            <w:r>
+              <w:rPr>
+                <w:rFonts w:ascii="Segoe UI" w:hAnsi="Segoe UI"/>
+                <w:b/>
+                <w:color w:val="FFFFFF"/>
+                <w:sz w:val="18"/>
+              </w:rPr>
+              <w:t>Hora de Entrada</w:t>
+            </w:r>
+          </w:p>
+        </w:tc>
+        <w:tc>
+          <w:tcPr>
+            <w:tcW w:type="dxa" w:w="1605"/>
+            <w:shd w:val="clear" w:color="auto" w:fill="1E293B"/>
+            <w:tcBorders>
+              <w:top w:val="single" w:sz="6" w:space="0" w:color="334155"/>
+              <w:left w:val="single" w:sz="6" w:space="0" w:color="334155"/>
+              <w:bottom w:val="single" w:sz="6" w:space="0" w:color="334155"/>
+              <w:right w:val="single" w:sz="6" w:space="0" w:color="334155"/>
+            </w:tcBorders>
+            <w:tcMar>
+              <w:top w:w="90" w:type="dxa"/>
+              <w:bottom w:w="90" w:type="dxa"/>
+              <w:left w:w="110" w:type="dxa"/>
+              <w:right w:w="110" w:type="dxa"/>
+            </w:tcMar>
+          </w:tcPr>
+          <w:p>
+            <w:pPr>
+              <w:spacing w:before="0" w:after="0"/>
+            </w:pPr>
+            <w:r>
+              <w:rPr>
+                <w:rFonts w:ascii="Segoe UI" w:hAnsi="Segoe UI"/>
+                <w:b/>
+                <w:color w:val="FFFFFF"/>
+                <w:sz w:val="18"/>
+              </w:rPr>
+              <w:t>Inicio Almuerzo</w:t>
+            </w:r>
+          </w:p>
+        </w:tc>
+        <w:tc>
+          <w:tcPr>
+            <w:tcW w:type="dxa" w:w="1605"/>
+            <w:shd w:val="clear" w:color="auto" w:fill="1E293B"/>
+            <w:tcBorders>
+              <w:top w:val="single" w:sz="6" w:space="0" w:color="334155"/>
+              <w:left w:val="single" w:sz="6" w:space="0" w:color="334155"/>
+              <w:bottom w:val="single" w:sz="6" w:space="0" w:color="334155"/>
+              <w:right w:val="single" w:sz="6" w:space="0" w:color="334155"/>
+            </w:tcBorders>
+            <w:tcMar>
+              <w:top w:w="90" w:type="dxa"/>
+              <w:bottom w:w="90" w:type="dxa"/>
+              <w:left w:w="110" w:type="dxa"/>
+              <w:right w:w="110" w:type="dxa"/>
+            </w:tcMar>
+          </w:tcPr>
+          <w:p>
+            <w:pPr>
+              <w:spacing w:before="0" w:after="0"/>
+            </w:pPr>
+            <w:r>
+              <w:rPr>
+                <w:rFonts w:ascii="Segoe UI" w:hAnsi="Segoe UI"/>
+                <w:b/>
+                <w:color w:val="FFFFFF"/>
+                <w:sz w:val="18"/>
+              </w:rPr>
+              <w:t>Fin Almuerzo</w:t>
+            </w:r>
+          </w:p>
+        </w:tc>
+        <w:tc>
+          <w:tcPr>
+            <w:tcW w:type="dxa" w:w="1605"/>
+            <w:shd w:val="clear" w:color="auto" w:fill="1E293B"/>
+            <w:tcBorders>
+              <w:top w:val="single" w:sz="6" w:space="0" w:color="334155"/>
+              <w:left w:val="single" w:sz="6" w:space="0" w:color="334155"/>
+              <w:bottom w:val="single" w:sz="6" w:space="0" w:color="334155"/>
+              <w:right w:val="single" w:sz="6" w:space="0" w:color="334155"/>
+            </w:tcBorders>
+            <w:tcMar>
+              <w:top w:w="90" w:type="dxa"/>
+              <w:bottom w:w="90" w:type="dxa"/>
+              <w:left w:w="110" w:type="dxa"/>
+              <w:right w:w="110" w:type="dxa"/>
+            </w:tcMar>
+          </w:tcPr>
+          <w:p>
+            <w:pPr>
+              <w:spacing w:before="0" w:after="0"/>
+            </w:pPr>
+            <w:r>
+              <w:rPr>
+                <w:rFonts w:ascii="Segoe UI" w:hAnsi="Segoe UI"/>
+                <w:b/>
+                <w:color w:val="FFFFFF"/>
+                <w:sz w:val="18"/>
+              </w:rPr>
+              <w:t>Hora de Salida</w:t>
+            </w:r>
+          </w:p>
+        </w:tc>
+        <w:tc>
+          <w:tcPr>
+            <w:tcW w:type="dxa" w:w="1605"/>
+            <w:shd w:val="clear" w:color="auto" w:fill="1E293B"/>
+            <w:tcBorders>
+              <w:top w:val="single" w:sz="6" w:space="0" w:color="334155"/>
+              <w:left w:val="single" w:sz="6" w:space="0" w:color="334155"/>
+              <w:bottom w:val="single" w:sz="6" w:space="0" w:color="334155"/>
+              <w:right w:val="single" w:sz="6" w:space="0" w:color="334155"/>
+            </w:tcBorders>
+            <w:tcMar>
+              <w:top w:w="90" w:type="dxa"/>
+              <w:bottom w:w="90" w:type="dxa"/>
+              <w:left w:w="110" w:type="dxa"/>
+              <w:right w:w="110" w:type="dxa"/>
+            </w:tcMar>
+          </w:tcPr>
+          <w:p>
+            <w:pPr>
+              <w:spacing w:before="0" w:after="0"/>
+            </w:pPr>
+            <w:r>
+              <w:rPr>
+                <w:rFonts w:ascii="Segoe UI" w:hAnsi="Segoe UI"/>
+                <w:b/>
+                <w:color w:val="FFFFFF"/>
+                <w:sz w:val="18"/>
+              </w:rPr>
+              <w:t>Horas Netas Ordinarias</w:t>
+            </w:r>
+          </w:p>
+        </w:tc>
+      </w:tr>
+      <w:tr>
+        <w:tc>
+          <w:tcPr>
+            <w:tcW w:type="dxa" w:w="1605"/>
+            <w:shd w:val="clear" w:color="auto" w:fill="FFFFFF"/>
+            <w:tcBorders>
+              <w:top w:val="single" w:sz="4" w:space="0" w:color="CBD5E1"/>
+              <w:left w:val="single" w:sz="4" w:space="0" w:color="CBD5E1"/>
+              <w:bottom w:val="single" w:sz="4" w:space="0" w:color="CBD5E1"/>
+              <w:right w:val="single" w:sz="4" w:space="0" w:color="CBD5E1"/>
+            </w:tcBorders>
+            <w:tcMar>
+              <w:top w:w="80" w:type="dxa"/>
+              <w:bottom w:w="80" w:type="dxa"/>
+              <w:left w:w="100" w:type="dxa"/>
+              <w:right w:w="100" w:type="dxa"/>
+            </w:tcMar>
+          </w:tcPr>
+          <w:p>
+            <w:pPr>
+              <w:spacing w:before="0" w:after="0"/>
+            </w:pPr>
+            <w:r>
+              <w:rPr>
+                <w:rFonts w:ascii="Segoe UI" w:hAnsi="Segoe UI"/>
+                <w:b/>
+                <w:color w:val="0F172A"/>
+                <w:sz w:val="17"/>
+              </w:rPr>
+              <w:t>Lunes</w:t>
+            </w:r>
+          </w:p>
+        </w:tc>
+        <w:tc>
+          <w:tcPr>
+            <w:tcW w:type="dxa" w:w="1605"/>
+            <w:shd w:val="clear" w:color="auto" w:fill="FFFFFF"/>
+            <w:tcBorders>
+              <w:top w:val="single" w:sz="4" w:space="0" w:color="CBD5E1"/>
+              <w:left w:val="single" w:sz="4" w:space="0" w:color="CBD5E1"/>
+              <w:bottom w:val="single" w:sz="4" w:space="0" w:color="CBD5E1"/>
+              <w:right w:val="single" w:sz="4" w:space="0" w:color="CBD5E1"/>
+            </w:tcBorders>
+            <w:tcMar>
+              <w:top w:w="80" w:type="dxa"/>
+              <w:bottom w:w="80" w:type="dxa"/>
+              <w:left w:w="100" w:type="dxa"/>
+              <w:right w:w="100" w:type="dxa"/>
+            </w:tcMar>
+          </w:tcPr>
+          <w:p>
+            <w:pPr>
+              <w:spacing w:before="0" w:after="0"/>
+            </w:pPr>
+            <w:r>
+              <w:rPr>
+                <w:rFonts w:ascii="Segoe UI" w:hAnsi="Segoe UI"/>
+                <w:color w:val="334155"/>
+                <w:sz w:val="17"/>
+              </w:rPr>
+              <w:t>8:00 AM</w:t>
+            </w:r>
+          </w:p>
+        </w:tc>
+        <w:tc>
+          <w:tcPr>
+            <w:tcW w:type="dxa" w:w="1605"/>
+            <w:shd w:val="clear" w:color="auto" w:fill="FFFFFF"/>
+            <w:tcBorders>
+              <w:top w:val="single" w:sz="4" w:space="0" w:color="CBD5E1"/>
+              <w:left w:val="single" w:sz="4" w:space="0" w:color="CBD5E1"/>
+              <w:bottom w:val="single" w:sz="4" w:space="0" w:color="CBD5E1"/>
+              <w:right w:val="single" w:sz="4" w:space="0" w:color="CBD5E1"/>
+            </w:tcBorders>
+            <w:tcMar>
+              <w:top w:w="80" w:type="dxa"/>
+              <w:bottom w:w="80" w:type="dxa"/>
+              <w:left w:w="100" w:type="dxa"/>
+              <w:right w:w="100" w:type="dxa"/>
+            </w:tcMar>
+          </w:tcPr>
+          <w:p>
+            <w:pPr>
+              <w:spacing w:before="0" w:after="0"/>
+            </w:pPr>
+            <w:r>
+              <w:rPr>
+                <w:rFonts w:ascii="Segoe UI" w:hAnsi="Segoe UI"/>
+                <w:color w:val="334155"/>
+                <w:sz w:val="17"/>
+              </w:rPr>
+              <w:t>12:00 PM</w:t>
+            </w:r>
+          </w:p>
+        </w:tc>
+        <w:tc>
+          <w:tcPr>
+            <w:tcW w:type="dxa" w:w="1605"/>
+            <w:shd w:val="clear" w:color="auto" w:fill="FFFFFF"/>
+            <w:tcBorders>
+              <w:top w:val="single" w:sz="4" w:space="0" w:color="CBD5E1"/>
+              <w:left w:val="single" w:sz="4" w:space="0" w:color="CBD5E1"/>
+              <w:bottom w:val="single" w:sz="4" w:space="0" w:color="CBD5E1"/>
+              <w:right w:val="single" w:sz="4" w:space="0" w:color="CBD5E1"/>
+            </w:tcBorders>
+            <w:tcMar>
+              <w:top w:w="80" w:type="dxa"/>
+              <w:bottom w:w="80" w:type="dxa"/>
+              <w:left w:w="100" w:type="dxa"/>
+              <w:right w:w="100" w:type="dxa"/>
+            </w:tcMar>
+          </w:tcPr>
+          <w:p>
+            <w:pPr>
+              <w:spacing w:before="0" w:after="0"/>
+            </w:pPr>
+            <w:r>
+              <w:rPr>
+                <w:rFonts w:ascii="Segoe UI" w:hAnsi="Segoe UI"/>
+                <w:color w:val="334155"/>
+                <w:sz w:val="17"/>
+              </w:rPr>
+              <w:t>1:30 PM (1.5 h)</w:t>
+            </w:r>
+          </w:p>
+        </w:tc>
+        <w:tc>
+          <w:tcPr>
+            <w:tcW w:type="dxa" w:w="1605"/>
+            <w:shd w:val="clear" w:color="auto" w:fill="FFFFFF"/>
+            <w:tcBorders>
+              <w:top w:val="single" w:sz="4" w:space="0" w:color="CBD5E1"/>
+              <w:left w:val="single" w:sz="4" w:space="0" w:color="CBD5E1"/>
+              <w:bottom w:val="single" w:sz="4" w:space="0" w:color="CBD5E1"/>
+              <w:right w:val="single" w:sz="4" w:space="0" w:color="CBD5E1"/>
+            </w:tcBorders>
+            <w:tcMar>
+              <w:top w:w="80" w:type="dxa"/>
+              <w:bottom w:w="80" w:type="dxa"/>
+              <w:left w:w="100" w:type="dxa"/>
+              <w:right w:w="100" w:type="dxa"/>
+            </w:tcMar>
+          </w:tcPr>
+          <w:p>
+            <w:pPr>
+              <w:spacing w:before="0" w:after="0"/>
+            </w:pPr>
+            <w:r>
+              <w:rPr>
+                <w:rFonts w:ascii="Segoe UI" w:hAnsi="Segoe UI"/>
+                <w:color w:val="334155"/>
+                <w:sz w:val="17"/>
+              </w:rPr>
+              <w:t>4:30 PM</w:t>
+            </w:r>
+          </w:p>
+        </w:tc>
+        <w:tc>
+          <w:tcPr>
+            <w:tcW w:type="dxa" w:w="1605"/>
+            <w:shd w:val="clear" w:color="auto" w:fill="FFFFFF"/>
+            <w:tcBorders>
+              <w:top w:val="single" w:sz="4" w:space="0" w:color="CBD5E1"/>
+              <w:left w:val="single" w:sz="4" w:space="0" w:color="CBD5E1"/>
+              <w:bottom w:val="single" w:sz="4" w:space="0" w:color="CBD5E1"/>
+              <w:right w:val="single" w:sz="4" w:space="0" w:color="CBD5E1"/>
+            </w:tcBorders>
+            <w:tcMar>
+              <w:top w:w="80" w:type="dxa"/>
+              <w:bottom w:w="80" w:type="dxa"/>
+              <w:left w:w="100" w:type="dxa"/>
+              <w:right w:w="100" w:type="dxa"/>
+            </w:tcMar>
+          </w:tcPr>
+          <w:p>
+            <w:pPr>
+              <w:spacing w:before="0" w:after="0"/>
+            </w:pPr>
+            <w:r>
+              <w:rPr>
+                <w:rFonts w:ascii="Segoe UI" w:hAnsi="Segoe UI"/>
+                <w:color w:val="334155"/>
+                <w:sz w:val="17"/>
+              </w:rPr>
+              <w:t>7.0 Horas</w:t>
+            </w:r>
+          </w:p>
+        </w:tc>
+      </w:tr>
+      <w:tr>
+        <w:tc>
+          <w:tcPr>
+            <w:tcW w:type="dxa" w:w="1605"/>
+            <w:shd w:val="clear" w:color="auto" w:fill="F8FAFC"/>
+            <w:tcBorders>
+              <w:top w:val="single" w:sz="4" w:space="0" w:color="CBD5E1"/>
+              <w:left w:val="single" w:sz="4" w:space="0" w:color="CBD5E1"/>
+              <w:bottom w:val="single" w:sz="4" w:space="0" w:color="CBD5E1"/>
+              <w:right w:val="single" w:sz="4" w:space="0" w:color="CBD5E1"/>
+            </w:tcBorders>
+            <w:tcMar>
+              <w:top w:w="80" w:type="dxa"/>
+              <w:bottom w:w="80" w:type="dxa"/>
+              <w:left w:w="100" w:type="dxa"/>
+              <w:right w:w="100" w:type="dxa"/>
+            </w:tcMar>
+          </w:tcPr>
+          <w:p>
+            <w:pPr>
+              <w:spacing w:before="0" w:after="0"/>
+            </w:pPr>
+            <w:r>
+              <w:rPr>
+                <w:rFonts w:ascii="Segoe UI" w:hAnsi="Segoe UI"/>
+                <w:b/>
+                <w:color w:val="0F172A"/>
+                <w:sz w:val="17"/>
+              </w:rPr>
+              <w:t>Martes</w:t>
+            </w:r>
+          </w:p>
+        </w:tc>
+        <w:tc>
+          <w:tcPr>
+            <w:tcW w:type="dxa" w:w="1605"/>
+            <w:shd w:val="clear" w:color="auto" w:fill="F8FAFC"/>
+            <w:tcBorders>
+              <w:top w:val="single" w:sz="4" w:space="0" w:color="CBD5E1"/>
+              <w:left w:val="single" w:sz="4" w:space="0" w:color="CBD5E1"/>
+              <w:bottom w:val="single" w:sz="4" w:space="0" w:color="CBD5E1"/>
+              <w:right w:val="single" w:sz="4" w:space="0" w:color="CBD5E1"/>
+            </w:tcBorders>
+            <w:tcMar>
+              <w:top w:w="80" w:type="dxa"/>
+              <w:bottom w:w="80" w:type="dxa"/>
+              <w:left w:w="100" w:type="dxa"/>
+              <w:right w:w="100" w:type="dxa"/>
+            </w:tcMar>
+          </w:tcPr>
+          <w:p>
+            <w:pPr>
+              <w:spacing w:before="0" w:after="0"/>
+            </w:pPr>
+            <w:r>
+              <w:rPr>
+                <w:rFonts w:ascii="Segoe UI" w:hAnsi="Segoe UI"/>
+                <w:color w:val="334155"/>
+                <w:sz w:val="17"/>
+              </w:rPr>
+              <w:t>7:30 AM</w:t>
+            </w:r>
+          </w:p>
+        </w:tc>
+        <w:tc>
+          <w:tcPr>
+            <w:tcW w:type="dxa" w:w="1605"/>
+            <w:shd w:val="clear" w:color="auto" w:fill="F8FAFC"/>
+            <w:tcBorders>
+              <w:top w:val="single" w:sz="4" w:space="0" w:color="CBD5E1"/>
+              <w:left w:val="single" w:sz="4" w:space="0" w:color="CBD5E1"/>
+              <w:bottom w:val="single" w:sz="4" w:space="0" w:color="CBD5E1"/>
+              <w:right w:val="single" w:sz="4" w:space="0" w:color="CBD5E1"/>
+            </w:tcBorders>
+            <w:tcMar>
+              <w:top w:w="80" w:type="dxa"/>
+              <w:bottom w:w="80" w:type="dxa"/>
+              <w:left w:w="100" w:type="dxa"/>
+              <w:right w:w="100" w:type="dxa"/>
+            </w:tcMar>
+          </w:tcPr>
+          <w:p>
+            <w:pPr>
+              <w:spacing w:before="0" w:after="0"/>
+            </w:pPr>
+            <w:r>
+              <w:rPr>
+                <w:rFonts w:ascii="Segoe UI" w:hAnsi="Segoe UI"/>
+                <w:color w:val="334155"/>
+                <w:sz w:val="17"/>
+              </w:rPr>
+              <w:t>12:00 PM</w:t>
+            </w:r>
+          </w:p>
+        </w:tc>
+        <w:tc>
+          <w:tcPr>
+            <w:tcW w:type="dxa" w:w="1605"/>
+            <w:shd w:val="clear" w:color="auto" w:fill="F8FAFC"/>
+            <w:tcBorders>
+              <w:top w:val="single" w:sz="4" w:space="0" w:color="CBD5E1"/>
+              <w:left w:val="single" w:sz="4" w:space="0" w:color="CBD5E1"/>
+              <w:bottom w:val="single" w:sz="4" w:space="0" w:color="CBD5E1"/>
+              <w:right w:val="single" w:sz="4" w:space="0" w:color="CBD5E1"/>
+            </w:tcBorders>
+            <w:tcMar>
+              <w:top w:w="80" w:type="dxa"/>
+              <w:bottom w:w="80" w:type="dxa"/>
+              <w:left w:w="100" w:type="dxa"/>
+              <w:right w:w="100" w:type="dxa"/>
+            </w:tcMar>
+          </w:tcPr>
+          <w:p>
+            <w:pPr>
+              <w:spacing w:before="0" w:after="0"/>
+            </w:pPr>
+            <w:r>
+              <w:rPr>
+                <w:rFonts w:ascii="Segoe UI" w:hAnsi="Segoe UI"/>
+                <w:color w:val="334155"/>
+                <w:sz w:val="17"/>
+              </w:rPr>
+              <w:t>1:00 PM (1.0 h)</w:t>
+            </w:r>
+          </w:p>
+        </w:tc>
+        <w:tc>
+          <w:tcPr>
+            <w:tcW w:type="dxa" w:w="1605"/>
+            <w:shd w:val="clear" w:color="auto" w:fill="F8FAFC"/>
+            <w:tcBorders>
+              <w:top w:val="single" w:sz="4" w:space="0" w:color="CBD5E1"/>
+              <w:left w:val="single" w:sz="4" w:space="0" w:color="CBD5E1"/>
+              <w:bottom w:val="single" w:sz="4" w:space="0" w:color="CBD5E1"/>
+              <w:right w:val="single" w:sz="4" w:space="0" w:color="CBD5E1"/>
+            </w:tcBorders>
+            <w:tcMar>
+              <w:top w:w="80" w:type="dxa"/>
+              <w:bottom w:w="80" w:type="dxa"/>
+              <w:left w:w="100" w:type="dxa"/>
+              <w:right w:w="100" w:type="dxa"/>
+            </w:tcMar>
+          </w:tcPr>
+          <w:p>
+            <w:pPr>
+              <w:spacing w:before="0" w:after="0"/>
+            </w:pPr>
+            <w:r>
+              <w:rPr>
+                <w:rFonts w:ascii="Segoe UI" w:hAnsi="Segoe UI"/>
+                <w:color w:val="334155"/>
+                <w:sz w:val="17"/>
+              </w:rPr>
+              <w:t>5:00 PM</w:t>
+            </w:r>
+          </w:p>
+        </w:tc>
+        <w:tc>
+          <w:tcPr>
+            <w:tcW w:type="dxa" w:w="1605"/>
+            <w:shd w:val="clear" w:color="auto" w:fill="F8FAFC"/>
+            <w:tcBorders>
+              <w:top w:val="single" w:sz="4" w:space="0" w:color="CBD5E1"/>
+              <w:left w:val="single" w:sz="4" w:space="0" w:color="CBD5E1"/>
+              <w:bottom w:val="single" w:sz="4" w:space="0" w:color="CBD5E1"/>
+              <w:right w:val="single" w:sz="4" w:space="0" w:color="CBD5E1"/>
+            </w:tcBorders>
+            <w:tcMar>
+              <w:top w:w="80" w:type="dxa"/>
+              <w:bottom w:w="80" w:type="dxa"/>
+              <w:left w:w="100" w:type="dxa"/>
+              <w:right w:w="100" w:type="dxa"/>
+            </w:tcMar>
+          </w:tcPr>
+          <w:p>
+            <w:pPr>
+              <w:spacing w:before="0" w:after="0"/>
+            </w:pPr>
+            <w:r>
+              <w:rPr>
+                <w:rFonts w:ascii="Segoe UI" w:hAnsi="Segoe UI"/>
+                <w:color w:val="334155"/>
+                <w:sz w:val="17"/>
+              </w:rPr>
+              <w:t>8.5 Horas</w:t>
+            </w:r>
+          </w:p>
+        </w:tc>
+      </w:tr>
+      <w:tr>
+        <w:tc>
+          <w:tcPr>
+            <w:tcW w:type="dxa" w:w="1605"/>
+            <w:shd w:val="clear" w:color="auto" w:fill="FFFFFF"/>
+            <w:tcBorders>
+              <w:top w:val="single" w:sz="4" w:space="0" w:color="CBD5E1"/>
+              <w:left w:val="single" w:sz="4" w:space="0" w:color="CBD5E1"/>
+              <w:bottom w:val="single" w:sz="4" w:space="0" w:color="CBD5E1"/>
+              <w:right w:val="single" w:sz="4" w:space="0" w:color="CBD5E1"/>
+            </w:tcBorders>
+            <w:tcMar>
+              <w:top w:w="80" w:type="dxa"/>
+              <w:bottom w:w="80" w:type="dxa"/>
+              <w:left w:w="100" w:type="dxa"/>
+              <w:right w:w="100" w:type="dxa"/>
+            </w:tcMar>
+          </w:tcPr>
+          <w:p>
+            <w:pPr>
+              <w:spacing w:before="0" w:after="0"/>
+            </w:pPr>
+            <w:r>
+              <w:rPr>
+                <w:rFonts w:ascii="Segoe UI" w:hAnsi="Segoe UI"/>
+                <w:b/>
+                <w:color w:val="0F172A"/>
+                <w:sz w:val="17"/>
+              </w:rPr>
+              <w:t>Miércoles</w:t>
+            </w:r>
+          </w:p>
+        </w:tc>
+        <w:tc>
+          <w:tcPr>
+            <w:tcW w:type="dxa" w:w="1605"/>
+            <w:shd w:val="clear" w:color="auto" w:fill="FFFFFF"/>
+            <w:tcBorders>
+              <w:top w:val="single" w:sz="4" w:space="0" w:color="CBD5E1"/>
+              <w:left w:val="single" w:sz="4" w:space="0" w:color="CBD5E1"/>
+              <w:bottom w:val="single" w:sz="4" w:space="0" w:color="CBD5E1"/>
+              <w:right w:val="single" w:sz="4" w:space="0" w:color="CBD5E1"/>
+            </w:tcBorders>
+            <w:tcMar>
+              <w:top w:w="80" w:type="dxa"/>
+              <w:bottom w:w="80" w:type="dxa"/>
+              <w:left w:w="100" w:type="dxa"/>
+              <w:right w:w="100" w:type="dxa"/>
+            </w:tcMar>
+          </w:tcPr>
+          <w:p>
+            <w:pPr>
+              <w:spacing w:before="0" w:after="0"/>
+            </w:pPr>
+            <w:r>
+              <w:rPr>
+                <w:rFonts w:ascii="Segoe UI" w:hAnsi="Segoe UI"/>
+                <w:color w:val="334155"/>
+                <w:sz w:val="17"/>
+              </w:rPr>
+              <w:t>7:30 AM</w:t>
+            </w:r>
+          </w:p>
+        </w:tc>
+        <w:tc>
+          <w:tcPr>
+            <w:tcW w:type="dxa" w:w="1605"/>
+            <w:shd w:val="clear" w:color="auto" w:fill="FFFFFF"/>
+            <w:tcBorders>
+              <w:top w:val="single" w:sz="4" w:space="0" w:color="CBD5E1"/>
+              <w:left w:val="single" w:sz="4" w:space="0" w:color="CBD5E1"/>
+              <w:bottom w:val="single" w:sz="4" w:space="0" w:color="CBD5E1"/>
+              <w:right w:val="single" w:sz="4" w:space="0" w:color="CBD5E1"/>
+            </w:tcBorders>
+            <w:tcMar>
+              <w:top w:w="80" w:type="dxa"/>
+              <w:bottom w:w="80" w:type="dxa"/>
+              <w:left w:w="100" w:type="dxa"/>
+              <w:right w:w="100" w:type="dxa"/>
+            </w:tcMar>
+          </w:tcPr>
+          <w:p>
+            <w:pPr>
+              <w:spacing w:before="0" w:after="0"/>
+            </w:pPr>
+            <w:r>
+              <w:rPr>
+                <w:rFonts w:ascii="Segoe UI" w:hAnsi="Segoe UI"/>
+                <w:color w:val="334155"/>
+                <w:sz w:val="17"/>
+              </w:rPr>
+              <w:t>12:00 PM</w:t>
+            </w:r>
+          </w:p>
+        </w:tc>
+        <w:tc>
+          <w:tcPr>
+            <w:tcW w:type="dxa" w:w="1605"/>
+            <w:shd w:val="clear" w:color="auto" w:fill="FFFFFF"/>
+            <w:tcBorders>
+              <w:top w:val="single" w:sz="4" w:space="0" w:color="CBD5E1"/>
+              <w:left w:val="single" w:sz="4" w:space="0" w:color="CBD5E1"/>
+              <w:bottom w:val="single" w:sz="4" w:space="0" w:color="CBD5E1"/>
+              <w:right w:val="single" w:sz="4" w:space="0" w:color="CBD5E1"/>
+            </w:tcBorders>
+            <w:tcMar>
+              <w:top w:w="80" w:type="dxa"/>
+              <w:bottom w:w="80" w:type="dxa"/>
+              <w:left w:w="100" w:type="dxa"/>
+              <w:right w:w="100" w:type="dxa"/>
+            </w:tcMar>
+          </w:tcPr>
+          <w:p>
+            <w:pPr>
+              <w:spacing w:before="0" w:after="0"/>
+            </w:pPr>
+            <w:r>
+              <w:rPr>
+                <w:rFonts w:ascii="Segoe UI" w:hAnsi="Segoe UI"/>
+                <w:color w:val="334155"/>
+                <w:sz w:val="17"/>
+              </w:rPr>
+              <w:t>1:00 PM (1.0 h)</w:t>
+            </w:r>
+          </w:p>
+        </w:tc>
+        <w:tc>
+          <w:tcPr>
+            <w:tcW w:type="dxa" w:w="1605"/>
+            <w:shd w:val="clear" w:color="auto" w:fill="FFFFFF"/>
+            <w:tcBorders>
+              <w:top w:val="single" w:sz="4" w:space="0" w:color="CBD5E1"/>
+              <w:left w:val="single" w:sz="4" w:space="0" w:color="CBD5E1"/>
+              <w:bottom w:val="single" w:sz="4" w:space="0" w:color="CBD5E1"/>
+              <w:right w:val="single" w:sz="4" w:space="0" w:color="CBD5E1"/>
+            </w:tcBorders>
+            <w:tcMar>
+              <w:top w:w="80" w:type="dxa"/>
+              <w:bottom w:w="80" w:type="dxa"/>
+              <w:left w:w="100" w:type="dxa"/>
+              <w:right w:w="100" w:type="dxa"/>
+            </w:tcMar>
+          </w:tcPr>
+          <w:p>
+            <w:pPr>
+              <w:spacing w:before="0" w:after="0"/>
+            </w:pPr>
+            <w:r>
+              <w:rPr>
+                <w:rFonts w:ascii="Segoe UI" w:hAnsi="Segoe UI"/>
+                <w:color w:val="334155"/>
+                <w:sz w:val="17"/>
+              </w:rPr>
+              <w:t>5:30 PM</w:t>
+            </w:r>
+          </w:p>
+        </w:tc>
+        <w:tc>
+          <w:tcPr>
+            <w:tcW w:type="dxa" w:w="1605"/>
+            <w:shd w:val="clear" w:color="auto" w:fill="FFFFFF"/>
+            <w:tcBorders>
+              <w:top w:val="single" w:sz="4" w:space="0" w:color="CBD5E1"/>
+              <w:left w:val="single" w:sz="4" w:space="0" w:color="CBD5E1"/>
+              <w:bottom w:val="single" w:sz="4" w:space="0" w:color="CBD5E1"/>
+              <w:right w:val="single" w:sz="4" w:space="0" w:color="CBD5E1"/>
+            </w:tcBorders>
+            <w:tcMar>
+              <w:top w:w="80" w:type="dxa"/>
+              <w:bottom w:w="80" w:type="dxa"/>
+              <w:left w:w="100" w:type="dxa"/>
+              <w:right w:w="100" w:type="dxa"/>
+            </w:tcMar>
+          </w:tcPr>
+          <w:p>
+            <w:pPr>
+              <w:spacing w:before="0" w:after="0"/>
+            </w:pPr>
+            <w:r>
+              <w:rPr>
+                <w:rFonts w:ascii="Segoe UI" w:hAnsi="Segoe UI"/>
+                <w:color w:val="334155"/>
+                <w:sz w:val="17"/>
+              </w:rPr>
+              <w:t>9.0 Horas</w:t>
+            </w:r>
+          </w:p>
+        </w:tc>
+      </w:tr>
+      <w:tr>
+        <w:tc>
+          <w:tcPr>
+            <w:tcW w:type="dxa" w:w="1605"/>
+            <w:shd w:val="clear" w:color="auto" w:fill="F8FAFC"/>
+            <w:tcBorders>
+              <w:top w:val="single" w:sz="4" w:space="0" w:color="CBD5E1"/>
+              <w:left w:val="single" w:sz="4" w:space="0" w:color="CBD5E1"/>
+              <w:bottom w:val="single" w:sz="4" w:space="0" w:color="CBD5E1"/>
+              <w:right w:val="single" w:sz="4" w:space="0" w:color="CBD5E1"/>
+            </w:tcBorders>
+            <w:tcMar>
+              <w:top w:w="80" w:type="dxa"/>
+              <w:bottom w:w="80" w:type="dxa"/>
+              <w:left w:w="100" w:type="dxa"/>
+              <w:right w:w="100" w:type="dxa"/>
+            </w:tcMar>
+          </w:tcPr>
+          <w:p>
+            <w:pPr>
+              <w:spacing w:before="0" w:after="0"/>
+            </w:pPr>
+            <w:r>
+              <w:rPr>
+                <w:rFonts w:ascii="Segoe UI" w:hAnsi="Segoe UI"/>
+                <w:b/>
+                <w:color w:val="0F172A"/>
+                <w:sz w:val="17"/>
+              </w:rPr>
+              <w:t>Jueves</w:t>
+            </w:r>
+          </w:p>
+        </w:tc>
+        <w:tc>
+          <w:tcPr>
+            <w:tcW w:type="dxa" w:w="1605"/>
+            <w:shd w:val="clear" w:color="auto" w:fill="F8FAFC"/>
+            <w:tcBorders>
+              <w:top w:val="single" w:sz="4" w:space="0" w:color="CBD5E1"/>
+              <w:left w:val="single" w:sz="4" w:space="0" w:color="CBD5E1"/>
+              <w:bottom w:val="single" w:sz="4" w:space="0" w:color="CBD5E1"/>
+              <w:right w:val="single" w:sz="4" w:space="0" w:color="CBD5E1"/>
+            </w:tcBorders>
+            <w:tcMar>
+              <w:top w:w="80" w:type="dxa"/>
+              <w:bottom w:w="80" w:type="dxa"/>
+              <w:left w:w="100" w:type="dxa"/>
+              <w:right w:w="100" w:type="dxa"/>
+            </w:tcMar>
+          </w:tcPr>
+          <w:p>
+            <w:pPr>
+              <w:spacing w:before="0" w:after="0"/>
+            </w:pPr>
+            <w:r>
+              <w:rPr>
+                <w:rFonts w:ascii="Segoe UI" w:hAnsi="Segoe UI"/>
+                <w:color w:val="334155"/>
+                <w:sz w:val="17"/>
+              </w:rPr>
+              <w:t>7:30 AM</w:t>
+            </w:r>
+          </w:p>
+        </w:tc>
+        <w:tc>
+          <w:tcPr>
+            <w:tcW w:type="dxa" w:w="1605"/>
+            <w:shd w:val="clear" w:color="auto" w:fill="F8FAFC"/>
+            <w:tcBorders>
+              <w:top w:val="single" w:sz="4" w:space="0" w:color="CBD5E1"/>
+              <w:left w:val="single" w:sz="4" w:space="0" w:color="CBD5E1"/>
+              <w:bottom w:val="single" w:sz="4" w:space="0" w:color="CBD5E1"/>
+              <w:right w:val="single" w:sz="4" w:space="0" w:color="CBD5E1"/>
+            </w:tcBorders>
+            <w:tcMar>
+              <w:top w:w="80" w:type="dxa"/>
+              <w:bottom w:w="80" w:type="dxa"/>
+              <w:left w:w="100" w:type="dxa"/>
+              <w:right w:w="100" w:type="dxa"/>
+            </w:tcMar>
+          </w:tcPr>
+          <w:p>
+            <w:pPr>
+              <w:spacing w:before="0" w:after="0"/>
+            </w:pPr>
+            <w:r>
+              <w:rPr>
+                <w:rFonts w:ascii="Segoe UI" w:hAnsi="Segoe UI"/>
+                <w:color w:val="334155"/>
+                <w:sz w:val="17"/>
+              </w:rPr>
+              <w:t>12:00 PM</w:t>
+            </w:r>
+          </w:p>
+        </w:tc>
+        <w:tc>
+          <w:tcPr>
+            <w:tcW w:type="dxa" w:w="1605"/>
+            <w:shd w:val="clear" w:color="auto" w:fill="F8FAFC"/>
+            <w:tcBorders>
+              <w:top w:val="single" w:sz="4" w:space="0" w:color="CBD5E1"/>
+              <w:left w:val="single" w:sz="4" w:space="0" w:color="CBD5E1"/>
+              <w:bottom w:val="single" w:sz="4" w:space="0" w:color="CBD5E1"/>
+              <w:right w:val="single" w:sz="4" w:space="0" w:color="CBD5E1"/>
+            </w:tcBorders>
+            <w:tcMar>
+              <w:top w:w="80" w:type="dxa"/>
+              <w:bottom w:w="80" w:type="dxa"/>
+              <w:left w:w="100" w:type="dxa"/>
+              <w:right w:w="100" w:type="dxa"/>
+            </w:tcMar>
+          </w:tcPr>
+          <w:p>
+            <w:pPr>
+              <w:spacing w:before="0" w:after="0"/>
+            </w:pPr>
+            <w:r>
+              <w:rPr>
+                <w:rFonts w:ascii="Segoe UI" w:hAnsi="Segoe UI"/>
+                <w:color w:val="334155"/>
+                <w:sz w:val="17"/>
+              </w:rPr>
+              <w:t>1:00 PM (1.0 h)</w:t>
+            </w:r>
+          </w:p>
+        </w:tc>
+        <w:tc>
+          <w:tcPr>
+            <w:tcW w:type="dxa" w:w="1605"/>
+            <w:shd w:val="clear" w:color="auto" w:fill="F8FAFC"/>
+            <w:tcBorders>
+              <w:top w:val="single" w:sz="4" w:space="0" w:color="CBD5E1"/>
+              <w:left w:val="single" w:sz="4" w:space="0" w:color="CBD5E1"/>
+              <w:bottom w:val="single" w:sz="4" w:space="0" w:color="CBD5E1"/>
+              <w:right w:val="single" w:sz="4" w:space="0" w:color="CBD5E1"/>
+            </w:tcBorders>
+            <w:tcMar>
+              <w:top w:w="80" w:type="dxa"/>
+              <w:bottom w:w="80" w:type="dxa"/>
+              <w:left w:w="100" w:type="dxa"/>
+              <w:right w:w="100" w:type="dxa"/>
+            </w:tcMar>
+          </w:tcPr>
+          <w:p>
+            <w:pPr>
+              <w:spacing w:before="0" w:after="0"/>
+            </w:pPr>
+            <w:r>
+              <w:rPr>
+                <w:rFonts w:ascii="Segoe UI" w:hAnsi="Segoe UI"/>
+                <w:color w:val="334155"/>
+                <w:sz w:val="17"/>
+              </w:rPr>
+              <w:t>5:30 PM</w:t>
+            </w:r>
+          </w:p>
+        </w:tc>
+        <w:tc>
+          <w:tcPr>
+            <w:tcW w:type="dxa" w:w="1605"/>
+            <w:shd w:val="clear" w:color="auto" w:fill="F8FAFC"/>
+            <w:tcBorders>
+              <w:top w:val="single" w:sz="4" w:space="0" w:color="CBD5E1"/>
+              <w:left w:val="single" w:sz="4" w:space="0" w:color="CBD5E1"/>
+              <w:bottom w:val="single" w:sz="4" w:space="0" w:color="CBD5E1"/>
+              <w:right w:val="single" w:sz="4" w:space="0" w:color="CBD5E1"/>
+            </w:tcBorders>
+            <w:tcMar>
+              <w:top w:w="80" w:type="dxa"/>
+              <w:bottom w:w="80" w:type="dxa"/>
+              <w:left w:w="100" w:type="dxa"/>
+              <w:right w:w="100" w:type="dxa"/>
+            </w:tcMar>
+          </w:tcPr>
+          <w:p>
+            <w:pPr>
+              <w:spacing w:before="0" w:after="0"/>
+            </w:pPr>
+            <w:r>
+              <w:rPr>
+                <w:rFonts w:ascii="Segoe UI" w:hAnsi="Segoe UI"/>
+                <w:color w:val="334155"/>
+                <w:sz w:val="17"/>
+              </w:rPr>
+              <w:t>9.0 Horas</w:t>
+            </w:r>
+          </w:p>
+        </w:tc>
+      </w:tr>
+      <w:tr>
+        <w:tc>
+          <w:tcPr>
+            <w:tcW w:type="dxa" w:w="1605"/>
+            <w:shd w:val="clear" w:color="auto" w:fill="FFFFFF"/>
+            <w:tcBorders>
+              <w:top w:val="single" w:sz="4" w:space="0" w:color="CBD5E1"/>
+              <w:left w:val="single" w:sz="4" w:space="0" w:color="CBD5E1"/>
+              <w:bottom w:val="single" w:sz="4" w:space="0" w:color="CBD5E1"/>
+              <w:right w:val="single" w:sz="4" w:space="0" w:color="CBD5E1"/>
+            </w:tcBorders>
+            <w:tcMar>
+              <w:top w:w="80" w:type="dxa"/>
+              <w:bottom w:w="80" w:type="dxa"/>
+              <w:left w:w="100" w:type="dxa"/>
+              <w:right w:w="100" w:type="dxa"/>
+            </w:tcMar>
+          </w:tcPr>
+          <w:p>
+            <w:pPr>
+              <w:spacing w:before="0" w:after="0"/>
+            </w:pPr>
+            <w:r>
+              <w:rPr>
+                <w:rFonts w:ascii="Segoe UI" w:hAnsi="Segoe UI"/>
+                <w:b/>
+                <w:color w:val="0F172A"/>
+                <w:sz w:val="17"/>
+              </w:rPr>
+              <w:t>Viernes</w:t>
+            </w:r>
+          </w:p>
+        </w:tc>
+        <w:tc>
+          <w:tcPr>
+            <w:tcW w:type="dxa" w:w="1605"/>
+            <w:shd w:val="clear" w:color="auto" w:fill="FFFFFF"/>
+            <w:tcBorders>
+              <w:top w:val="single" w:sz="4" w:space="0" w:color="CBD5E1"/>
+              <w:left w:val="single" w:sz="4" w:space="0" w:color="CBD5E1"/>
+              <w:bottom w:val="single" w:sz="4" w:space="0" w:color="CBD5E1"/>
+              <w:right w:val="single" w:sz="4" w:space="0" w:color="CBD5E1"/>
+            </w:tcBorders>
+            <w:tcMar>
+              <w:top w:w="80" w:type="dxa"/>
+              <w:bottom w:w="80" w:type="dxa"/>
+              <w:left w:w="100" w:type="dxa"/>
+              <w:right w:w="100" w:type="dxa"/>
+            </w:tcMar>
+          </w:tcPr>
+          <w:p>
+            <w:pPr>
+              <w:spacing w:before="0" w:after="0"/>
+            </w:pPr>
+            <w:r>
+              <w:rPr>
+                <w:rFonts w:ascii="Segoe UI" w:hAnsi="Segoe UI"/>
+                <w:color w:val="334155"/>
+                <w:sz w:val="17"/>
+              </w:rPr>
+              <w:t>7:30 AM</w:t>
+            </w:r>
+          </w:p>
+        </w:tc>
+        <w:tc>
+          <w:tcPr>
+            <w:tcW w:type="dxa" w:w="1605"/>
+            <w:shd w:val="clear" w:color="auto" w:fill="FFFFFF"/>
+            <w:tcBorders>
+              <w:top w:val="single" w:sz="4" w:space="0" w:color="CBD5E1"/>
+              <w:left w:val="single" w:sz="4" w:space="0" w:color="CBD5E1"/>
+              <w:bottom w:val="single" w:sz="4" w:space="0" w:color="CBD5E1"/>
+              <w:right w:val="single" w:sz="4" w:space="0" w:color="CBD5E1"/>
+            </w:tcBorders>
+            <w:tcMar>
+              <w:top w:w="80" w:type="dxa"/>
+              <w:bottom w:w="80" w:type="dxa"/>
+              <w:left w:w="100" w:type="dxa"/>
+              <w:right w:w="100" w:type="dxa"/>
+            </w:tcMar>
+          </w:tcPr>
+          <w:p>
+            <w:pPr>
+              <w:spacing w:before="0" w:after="0"/>
+            </w:pPr>
+            <w:r>
+              <w:rPr>
+                <w:rFonts w:ascii="Segoe UI" w:hAnsi="Segoe UI"/>
+                <w:color w:val="334155"/>
+                <w:sz w:val="17"/>
+              </w:rPr>
+              <w:t>12:00 PM</w:t>
+            </w:r>
+          </w:p>
+        </w:tc>
+        <w:tc>
+          <w:tcPr>
+            <w:tcW w:type="dxa" w:w="1605"/>
+            <w:shd w:val="clear" w:color="auto" w:fill="FFFFFF"/>
+            <w:tcBorders>
+              <w:top w:val="single" w:sz="4" w:space="0" w:color="CBD5E1"/>
+              <w:left w:val="single" w:sz="4" w:space="0" w:color="CBD5E1"/>
+              <w:bottom w:val="single" w:sz="4" w:space="0" w:color="CBD5E1"/>
+              <w:right w:val="single" w:sz="4" w:space="0" w:color="CBD5E1"/>
+            </w:tcBorders>
+            <w:tcMar>
+              <w:top w:w="80" w:type="dxa"/>
+              <w:bottom w:w="80" w:type="dxa"/>
+              <w:left w:w="100" w:type="dxa"/>
+              <w:right w:w="100" w:type="dxa"/>
+            </w:tcMar>
+          </w:tcPr>
+          <w:p>
+            <w:pPr>
+              <w:spacing w:before="0" w:after="0"/>
+            </w:pPr>
+            <w:r>
+              <w:rPr>
+                <w:rFonts w:ascii="Segoe UI" w:hAnsi="Segoe UI"/>
+                <w:color w:val="334155"/>
+                <w:sz w:val="17"/>
+              </w:rPr>
+              <w:t>1:00 PM (1.0 h)</w:t>
+            </w:r>
+          </w:p>
+        </w:tc>
+        <w:tc>
+          <w:tcPr>
+            <w:tcW w:type="dxa" w:w="1605"/>
+            <w:shd w:val="clear" w:color="auto" w:fill="FFFFFF"/>
+            <w:tcBorders>
+              <w:top w:val="single" w:sz="4" w:space="0" w:color="CBD5E1"/>
+              <w:left w:val="single" w:sz="4" w:space="0" w:color="CBD5E1"/>
+              <w:bottom w:val="single" w:sz="4" w:space="0" w:color="CBD5E1"/>
+              <w:right w:val="single" w:sz="4" w:space="0" w:color="CBD5E1"/>
+            </w:tcBorders>
+            <w:tcMar>
+              <w:top w:w="80" w:type="dxa"/>
+              <w:bottom w:w="80" w:type="dxa"/>
+              <w:left w:w="100" w:type="dxa"/>
+              <w:right w:w="100" w:type="dxa"/>
+            </w:tcMar>
+          </w:tcPr>
+          <w:p>
+            <w:pPr>
+              <w:spacing w:before="0" w:after="0"/>
+            </w:pPr>
+            <w:r>
+              <w:rPr>
+                <w:rFonts w:ascii="Segoe UI" w:hAnsi="Segoe UI"/>
+                <w:color w:val="334155"/>
+                <w:sz w:val="17"/>
+              </w:rPr>
+              <w:t>5:00 PM</w:t>
+            </w:r>
+          </w:p>
+        </w:tc>
+        <w:tc>
+          <w:tcPr>
+            <w:tcW w:type="dxa" w:w="1605"/>
+            <w:shd w:val="clear" w:color="auto" w:fill="FFFFFF"/>
+            <w:tcBorders>
+              <w:top w:val="single" w:sz="4" w:space="0" w:color="CBD5E1"/>
+              <w:left w:val="single" w:sz="4" w:space="0" w:color="CBD5E1"/>
+              <w:bottom w:val="single" w:sz="4" w:space="0" w:color="CBD5E1"/>
+              <w:right w:val="single" w:sz="4" w:space="0" w:color="CBD5E1"/>
+            </w:tcBorders>
+            <w:tcMar>
+              <w:top w:w="80" w:type="dxa"/>
+              <w:bottom w:w="80" w:type="dxa"/>
+              <w:left w:w="100" w:type="dxa"/>
+              <w:right w:w="100" w:type="dxa"/>
+            </w:tcMar>
+          </w:tcPr>
+          <w:p>
+            <w:pPr>
+              <w:spacing w:before="0" w:after="0"/>
+            </w:pPr>
+            <w:r>
+              <w:rPr>
+                <w:rFonts w:ascii="Segoe UI" w:hAnsi="Segoe UI"/>
+                <w:color w:val="334155"/>
+                <w:sz w:val="17"/>
+              </w:rPr>
+              <w:t>8.5 Horas</w:t>
+            </w:r>
+          </w:p>
+        </w:tc>
+      </w:tr>
+      <w:tr>
+        <w:tc>
+          <w:tcPr>
+            <w:tcW w:type="dxa" w:w="1605"/>
+            <w:shd w:val="clear" w:color="auto" w:fill="F8FAFC"/>
+            <w:tcBorders>
+              <w:top w:val="single" w:sz="4" w:space="0" w:color="CBD5E1"/>
+              <w:left w:val="single" w:sz="4" w:space="0" w:color="CBD5E1"/>
+              <w:bottom w:val="single" w:sz="4" w:space="0" w:color="CBD5E1"/>
+              <w:right w:val="single" w:sz="4" w:space="0" w:color="CBD5E1"/>
+            </w:tcBorders>
+            <w:tcMar>
+              <w:top w:w="80" w:type="dxa"/>
+              <w:bottom w:w="80" w:type="dxa"/>
+              <w:left w:w="100" w:type="dxa"/>
+              <w:right w:w="100" w:type="dxa"/>
+            </w:tcMar>
+          </w:tcPr>
+          <w:p>
+            <w:pPr>
+              <w:spacing w:before="0" w:after="0"/>
+            </w:pPr>
+            <w:r>
+              <w:rPr>
+                <w:rFonts w:ascii="Segoe UI" w:hAnsi="Segoe UI"/>
+                <w:b/>
+                <w:color w:val="0F172A"/>
+                <w:sz w:val="17"/>
+              </w:rPr>
+              <w:t>Sábado</w:t>
+            </w:r>
+          </w:p>
+        </w:tc>
+        <w:tc>
+          <w:tcPr>
+            <w:tcW w:type="dxa" w:w="1605"/>
+            <w:shd w:val="clear" w:color="auto" w:fill="F8FAFC"/>
+            <w:tcBorders>
+              <w:top w:val="single" w:sz="4" w:space="0" w:color="CBD5E1"/>
+              <w:left w:val="single" w:sz="4" w:space="0" w:color="CBD5E1"/>
+              <w:bottom w:val="single" w:sz="4" w:space="0" w:color="CBD5E1"/>
+              <w:right w:val="single" w:sz="4" w:space="0" w:color="CBD5E1"/>
+            </w:tcBorders>
+            <w:tcMar>
+              <w:top w:w="80" w:type="dxa"/>
+              <w:bottom w:w="80" w:type="dxa"/>
+              <w:left w:w="100" w:type="dxa"/>
+              <w:right w:w="100" w:type="dxa"/>
+            </w:tcMar>
+          </w:tcPr>
+          <w:p>
+            <w:pPr>
+              <w:spacing w:before="0" w:after="0"/>
+            </w:pPr>
+            <w:r>
+              <w:rPr>
+                <w:rFonts w:ascii="Segoe UI" w:hAnsi="Segoe UI"/>
+                <w:color w:val="334155"/>
+                <w:sz w:val="17"/>
+              </w:rPr>
+              <w:t>NO LABORAL (Admin)</w:t>
+            </w:r>
+          </w:p>
+        </w:tc>
+        <w:tc>
+          <w:tcPr>
+            <w:tcW w:type="dxa" w:w="1605"/>
+            <w:shd w:val="clear" w:color="auto" w:fill="F8FAFC"/>
+            <w:tcBorders>
+              <w:top w:val="single" w:sz="4" w:space="0" w:color="CBD5E1"/>
+              <w:left w:val="single" w:sz="4" w:space="0" w:color="CBD5E1"/>
+              <w:bottom w:val="single" w:sz="4" w:space="0" w:color="CBD5E1"/>
+              <w:right w:val="single" w:sz="4" w:space="0" w:color="CBD5E1"/>
+            </w:tcBorders>
+            <w:tcMar>
+              <w:top w:w="80" w:type="dxa"/>
+              <w:bottom w:w="80" w:type="dxa"/>
+              <w:left w:w="100" w:type="dxa"/>
+              <w:right w:w="100" w:type="dxa"/>
+            </w:tcMar>
+          </w:tcPr>
+          <w:p>
+            <w:pPr>
+              <w:spacing w:before="0" w:after="0"/>
+            </w:pPr>
+            <w:r>
+              <w:rPr>
+                <w:rFonts w:ascii="Segoe UI" w:hAnsi="Segoe UI"/>
+                <w:color w:val="334155"/>
+                <w:sz w:val="17"/>
+              </w:rPr>
+              <w:t>—</w:t>
+            </w:r>
+          </w:p>
+        </w:tc>
+        <w:tc>
+          <w:tcPr>
+            <w:tcW w:type="dxa" w:w="1605"/>
+            <w:shd w:val="clear" w:color="auto" w:fill="F8FAFC"/>
+            <w:tcBorders>
+              <w:top w:val="single" w:sz="4" w:space="0" w:color="CBD5E1"/>
+              <w:left w:val="single" w:sz="4" w:space="0" w:color="CBD5E1"/>
+              <w:bottom w:val="single" w:sz="4" w:space="0" w:color="CBD5E1"/>
+              <w:right w:val="single" w:sz="4" w:space="0" w:color="CBD5E1"/>
+            </w:tcBorders>
+            <w:tcMar>
+              <w:top w:w="80" w:type="dxa"/>
+              <w:bottom w:w="80" w:type="dxa"/>
+              <w:left w:w="100" w:type="dxa"/>
+              <w:right w:w="100" w:type="dxa"/>
+            </w:tcMar>
+          </w:tcPr>
+          <w:p>
+            <w:pPr>
+              <w:spacing w:before="0" w:after="0"/>
+            </w:pPr>
+            <w:r>
+              <w:rPr>
+                <w:rFonts w:ascii="Segoe UI" w:hAnsi="Segoe UI"/>
+                <w:color w:val="334155"/>
+                <w:sz w:val="17"/>
+              </w:rPr>
+              <w:t>—</w:t>
+            </w:r>
+          </w:p>
+        </w:tc>
+        <w:tc>
+          <w:tcPr>
+            <w:tcW w:type="dxa" w:w="1605"/>
+            <w:shd w:val="clear" w:color="auto" w:fill="F8FAFC"/>
+            <w:tcBorders>
+              <w:top w:val="single" w:sz="4" w:space="0" w:color="CBD5E1"/>
+              <w:left w:val="single" w:sz="4" w:space="0" w:color="CBD5E1"/>
+              <w:bottom w:val="single" w:sz="4" w:space="0" w:color="CBD5E1"/>
+              <w:right w:val="single" w:sz="4" w:space="0" w:color="CBD5E1"/>
+            </w:tcBorders>
+            <w:tcMar>
+              <w:top w:w="80" w:type="dxa"/>
+              <w:bottom w:w="80" w:type="dxa"/>
+              <w:left w:w="100" w:type="dxa"/>
+              <w:right w:w="100" w:type="dxa"/>
+            </w:tcMar>
+          </w:tcPr>
+          <w:p>
+            <w:pPr>
+              <w:spacing w:before="0" w:after="0"/>
+            </w:pPr>
+            <w:r>
+              <w:rPr>
+                <w:rFonts w:ascii="Segoe UI" w:hAnsi="Segoe UI"/>
+                <w:color w:val="334155"/>
+                <w:sz w:val="17"/>
+              </w:rPr>
+              <w:t>—</w:t>
+            </w:r>
+          </w:p>
+        </w:tc>
+        <w:tc>
+          <w:tcPr>
+            <w:tcW w:type="dxa" w:w="1605"/>
+            <w:shd w:val="clear" w:color="auto" w:fill="F8FAFC"/>
+            <w:tcBorders>
+              <w:top w:val="single" w:sz="4" w:space="0" w:color="CBD5E1"/>
+              <w:left w:val="single" w:sz="4" w:space="0" w:color="CBD5E1"/>
+              <w:bottom w:val="single" w:sz="4" w:space="0" w:color="CBD5E1"/>
+              <w:right w:val="single" w:sz="4" w:space="0" w:color="CBD5E1"/>
+            </w:tcBorders>
+            <w:tcMar>
+              <w:top w:w="80" w:type="dxa"/>
+              <w:bottom w:w="80" w:type="dxa"/>
+              <w:left w:w="100" w:type="dxa"/>
+              <w:right w:w="100" w:type="dxa"/>
+            </w:tcMar>
+          </w:tcPr>
+          <w:p>
+            <w:pPr>
+              <w:spacing w:before="0" w:after="0"/>
+            </w:pPr>
+            <w:r>
+              <w:rPr>
+                <w:rFonts w:ascii="Segoe UI" w:hAnsi="Segoe UI"/>
+                <w:color w:val="334155"/>
+                <w:sz w:val="17"/>
+              </w:rPr>
+              <w:t>Jornada Extra Patio (HED +25%)</w:t>
+            </w:r>
+          </w:p>
+        </w:tc>
+      </w:tr>
+      <w:tr>
+        <w:tc>
+          <w:tcPr>
+            <w:tcW w:type="dxa" w:w="1605"/>
+            <w:shd w:val="clear" w:color="auto" w:fill="FFFFFF"/>
+            <w:tcBorders>
+              <w:top w:val="single" w:sz="4" w:space="0" w:color="CBD5E1"/>
+              <w:left w:val="single" w:sz="4" w:space="0" w:color="CBD5E1"/>
+              <w:bottom w:val="single" w:sz="4" w:space="0" w:color="CBD5E1"/>
+              <w:right w:val="single" w:sz="4" w:space="0" w:color="CBD5E1"/>
+            </w:tcBorders>
+            <w:tcMar>
+              <w:top w:w="80" w:type="dxa"/>
+              <w:bottom w:w="80" w:type="dxa"/>
+              <w:left w:w="100" w:type="dxa"/>
+              <w:right w:w="100" w:type="dxa"/>
+            </w:tcMar>
+          </w:tcPr>
+          <w:p>
+            <w:pPr>
+              <w:spacing w:before="0" w:after="0"/>
+            </w:pPr>
+            <w:r>
+              <w:rPr>
+                <w:rFonts w:ascii="Segoe UI" w:hAnsi="Segoe UI"/>
+                <w:b/>
+                <w:color w:val="0F172A"/>
+                <w:sz w:val="17"/>
+              </w:rPr>
+              <w:t>Domingo / Festivo</w:t>
+            </w:r>
+          </w:p>
+        </w:tc>
+        <w:tc>
+          <w:tcPr>
+            <w:tcW w:type="dxa" w:w="1605"/>
+            <w:shd w:val="clear" w:color="auto" w:fill="FFFFFF"/>
+            <w:tcBorders>
+              <w:top w:val="single" w:sz="4" w:space="0" w:color="CBD5E1"/>
+              <w:left w:val="single" w:sz="4" w:space="0" w:color="CBD5E1"/>
+              <w:bottom w:val="single" w:sz="4" w:space="0" w:color="CBD5E1"/>
+              <w:right w:val="single" w:sz="4" w:space="0" w:color="CBD5E1"/>
+            </w:tcBorders>
+            <w:tcMar>
+              <w:top w:w="80" w:type="dxa"/>
+              <w:bottom w:w="80" w:type="dxa"/>
+              <w:left w:w="100" w:type="dxa"/>
+              <w:right w:w="100" w:type="dxa"/>
+            </w:tcMar>
+          </w:tcPr>
+          <w:p>
+            <w:pPr>
+              <w:spacing w:before="0" w:after="0"/>
+            </w:pPr>
+            <w:r>
+              <w:rPr>
+                <w:rFonts w:ascii="Segoe UI" w:hAnsi="Segoe UI"/>
+                <w:color w:val="334155"/>
+                <w:sz w:val="17"/>
+              </w:rPr>
+              <w:t>NO LABORAL (Admin)</w:t>
+            </w:r>
+          </w:p>
+        </w:tc>
+        <w:tc>
+          <w:tcPr>
+            <w:tcW w:type="dxa" w:w="1605"/>
+            <w:shd w:val="clear" w:color="auto" w:fill="FFFFFF"/>
+            <w:tcBorders>
+              <w:top w:val="single" w:sz="4" w:space="0" w:color="CBD5E1"/>
+              <w:left w:val="single" w:sz="4" w:space="0" w:color="CBD5E1"/>
+              <w:bottom w:val="single" w:sz="4" w:space="0" w:color="CBD5E1"/>
+              <w:right w:val="single" w:sz="4" w:space="0" w:color="CBD5E1"/>
+            </w:tcBorders>
+            <w:tcMar>
+              <w:top w:w="80" w:type="dxa"/>
+              <w:bottom w:w="80" w:type="dxa"/>
+              <w:left w:w="100" w:type="dxa"/>
+              <w:right w:w="100" w:type="dxa"/>
+            </w:tcMar>
+          </w:tcPr>
+          <w:p>
+            <w:pPr>
+              <w:spacing w:before="0" w:after="0"/>
+            </w:pPr>
+            <w:r>
+              <w:rPr>
+                <w:rFonts w:ascii="Segoe UI" w:hAnsi="Segoe UI"/>
+                <w:color w:val="334155"/>
+                <w:sz w:val="17"/>
+              </w:rPr>
+              <w:t>—</w:t>
+            </w:r>
+          </w:p>
+        </w:tc>
+        <w:tc>
+          <w:tcPr>
+            <w:tcW w:type="dxa" w:w="1605"/>
+            <w:shd w:val="clear" w:color="auto" w:fill="FFFFFF"/>
+            <w:tcBorders>
+              <w:top w:val="single" w:sz="4" w:space="0" w:color="CBD5E1"/>
+              <w:left w:val="single" w:sz="4" w:space="0" w:color="CBD5E1"/>
+              <w:bottom w:val="single" w:sz="4" w:space="0" w:color="CBD5E1"/>
+              <w:right w:val="single" w:sz="4" w:space="0" w:color="CBD5E1"/>
+            </w:tcBorders>
+            <w:tcMar>
+              <w:top w:w="80" w:type="dxa"/>
+              <w:bottom w:w="80" w:type="dxa"/>
+              <w:left w:w="100" w:type="dxa"/>
+              <w:right w:w="100" w:type="dxa"/>
+            </w:tcMar>
+          </w:tcPr>
+          <w:p>
+            <w:pPr>
+              <w:spacing w:before="0" w:after="0"/>
+            </w:pPr>
+            <w:r>
+              <w:rPr>
+                <w:rFonts w:ascii="Segoe UI" w:hAnsi="Segoe UI"/>
+                <w:color w:val="334155"/>
+                <w:sz w:val="17"/>
+              </w:rPr>
+              <w:t>—</w:t>
+            </w:r>
+          </w:p>
+        </w:tc>
+        <w:tc>
+          <w:tcPr>
+            <w:tcW w:type="dxa" w:w="1605"/>
+            <w:shd w:val="clear" w:color="auto" w:fill="FFFFFF"/>
+            <w:tcBorders>
+              <w:top w:val="single" w:sz="4" w:space="0" w:color="CBD5E1"/>
+              <w:left w:val="single" w:sz="4" w:space="0" w:color="CBD5E1"/>
+              <w:bottom w:val="single" w:sz="4" w:space="0" w:color="CBD5E1"/>
+              <w:right w:val="single" w:sz="4" w:space="0" w:color="CBD5E1"/>
+            </w:tcBorders>
+            <w:tcMar>
+              <w:top w:w="80" w:type="dxa"/>
+              <w:bottom w:w="80" w:type="dxa"/>
+              <w:left w:w="100" w:type="dxa"/>
+              <w:right w:w="100" w:type="dxa"/>
+            </w:tcMar>
+          </w:tcPr>
+          <w:p>
+            <w:pPr>
+              <w:spacing w:before="0" w:after="0"/>
+            </w:pPr>
+            <w:r>
+              <w:rPr>
+                <w:rFonts w:ascii="Segoe UI" w:hAnsi="Segoe UI"/>
+                <w:color w:val="334155"/>
+                <w:sz w:val="17"/>
+              </w:rPr>
+              <w:t>—</w:t>
+            </w:r>
+          </w:p>
+        </w:tc>
+        <w:tc>
+          <w:tcPr>
+            <w:tcW w:type="dxa" w:w="1605"/>
+            <w:shd w:val="clear" w:color="auto" w:fill="FFFFFF"/>
+            <w:tcBorders>
+              <w:top w:val="single" w:sz="4" w:space="0" w:color="CBD5E1"/>
+              <w:left w:val="single" w:sz="4" w:space="0" w:color="CBD5E1"/>
+              <w:bottom w:val="single" w:sz="4" w:space="0" w:color="CBD5E1"/>
+              <w:right w:val="single" w:sz="4" w:space="0" w:color="CBD5E1"/>
+            </w:tcBorders>
+            <w:tcMar>
+              <w:top w:w="80" w:type="dxa"/>
+              <w:bottom w:w="80" w:type="dxa"/>
+              <w:left w:w="100" w:type="dxa"/>
+              <w:right w:w="100" w:type="dxa"/>
+            </w:tcMar>
+          </w:tcPr>
+          <w:p>
+            <w:pPr>
+              <w:spacing w:before="0" w:after="0"/>
+            </w:pPr>
+            <w:r>
+              <w:rPr>
+                <w:rFonts w:ascii="Segoe UI" w:hAnsi="Segoe UI"/>
+                <w:color w:val="334155"/>
+                <w:sz w:val="17"/>
+              </w:rPr>
+              <w:t>Jornada Extra Patio (Recargo +75%/100%)</w:t>
+            </w:r>
+          </w:p>
+        </w:tc>
+      </w:tr>
+      <w:tr>
+        <w:tc>
+          <w:tcPr>
+            <w:tcW w:type="dxa" w:w="1605"/>
+            <w:shd w:val="clear" w:color="auto" w:fill="F8FAFC"/>
+            <w:tcBorders>
+              <w:top w:val="single" w:sz="4" w:space="0" w:color="CBD5E1"/>
+              <w:left w:val="single" w:sz="4" w:space="0" w:color="CBD5E1"/>
+              <w:bottom w:val="single" w:sz="4" w:space="0" w:color="CBD5E1"/>
+              <w:right w:val="single" w:sz="4" w:space="0" w:color="CBD5E1"/>
+            </w:tcBorders>
+            <w:tcMar>
+              <w:top w:w="80" w:type="dxa"/>
+              <w:bottom w:w="80" w:type="dxa"/>
+              <w:left w:w="100" w:type="dxa"/>
+              <w:right w:w="100" w:type="dxa"/>
+            </w:tcMar>
+          </w:tcPr>
+          <w:p>
+            <w:pPr>
+              <w:spacing w:before="0" w:after="0"/>
+            </w:pPr>
+            <w:r>
+              <w:rPr>
+                <w:rFonts w:ascii="Segoe UI" w:hAnsi="Segoe UI"/>
+                <w:b/>
+                <w:color w:val="0F172A"/>
+                <w:sz w:val="17"/>
+              </w:rPr>
+              <w:t>TOTAL SEMANAL</w:t>
+            </w:r>
+          </w:p>
+        </w:tc>
+        <w:tc>
+          <w:tcPr>
+            <w:tcW w:type="dxa" w:w="1605"/>
+            <w:shd w:val="clear" w:color="auto" w:fill="F8FAFC"/>
+            <w:tcBorders>
+              <w:top w:val="single" w:sz="4" w:space="0" w:color="CBD5E1"/>
+              <w:left w:val="single" w:sz="4" w:space="0" w:color="CBD5E1"/>
+              <w:bottom w:val="single" w:sz="4" w:space="0" w:color="CBD5E1"/>
+              <w:right w:val="single" w:sz="4" w:space="0" w:color="CBD5E1"/>
+            </w:tcBorders>
+            <w:tcMar>
+              <w:top w:w="80" w:type="dxa"/>
+              <w:bottom w:w="80" w:type="dxa"/>
+              <w:left w:w="100" w:type="dxa"/>
+              <w:right w:w="100" w:type="dxa"/>
+            </w:tcMar>
+          </w:tcPr>
+          <w:p>
+            <w:pPr>
+              <w:spacing w:before="0" w:after="0"/>
+            </w:pPr>
+            <w:r>
+              <w:rPr>
+                <w:rFonts w:ascii="Segoe UI" w:hAnsi="Segoe UI"/>
+                <w:color w:val="334155"/>
+                <w:sz w:val="17"/>
+              </w:rPr>
+              <w:t>—</w:t>
+            </w:r>
+          </w:p>
+        </w:tc>
+        <w:tc>
+          <w:tcPr>
+            <w:tcW w:type="dxa" w:w="1605"/>
+            <w:shd w:val="clear" w:color="auto" w:fill="F8FAFC"/>
+            <w:tcBorders>
+              <w:top w:val="single" w:sz="4" w:space="0" w:color="CBD5E1"/>
+              <w:left w:val="single" w:sz="4" w:space="0" w:color="CBD5E1"/>
+              <w:bottom w:val="single" w:sz="4" w:space="0" w:color="CBD5E1"/>
+              <w:right w:val="single" w:sz="4" w:space="0" w:color="CBD5E1"/>
+            </w:tcBorders>
+            <w:tcMar>
+              <w:top w:w="80" w:type="dxa"/>
+              <w:bottom w:w="80" w:type="dxa"/>
+              <w:left w:w="100" w:type="dxa"/>
+              <w:right w:w="100" w:type="dxa"/>
+            </w:tcMar>
+          </w:tcPr>
+          <w:p>
+            <w:pPr>
+              <w:spacing w:before="0" w:after="0"/>
+            </w:pPr>
+            <w:r>
+              <w:rPr>
+                <w:rFonts w:ascii="Segoe UI" w:hAnsi="Segoe UI"/>
+                <w:color w:val="334155"/>
+                <w:sz w:val="17"/>
+              </w:rPr>
+              <w:t>—</w:t>
+            </w:r>
+          </w:p>
+        </w:tc>
+        <w:tc>
+          <w:tcPr>
+            <w:tcW w:type="dxa" w:w="1605"/>
+            <w:shd w:val="clear" w:color="auto" w:fill="F8FAFC"/>
+            <w:tcBorders>
+              <w:top w:val="single" w:sz="4" w:space="0" w:color="CBD5E1"/>
+              <w:left w:val="single" w:sz="4" w:space="0" w:color="CBD5E1"/>
+              <w:bottom w:val="single" w:sz="4" w:space="0" w:color="CBD5E1"/>
+              <w:right w:val="single" w:sz="4" w:space="0" w:color="CBD5E1"/>
+            </w:tcBorders>
+            <w:tcMar>
+              <w:top w:w="80" w:type="dxa"/>
+              <w:bottom w:w="80" w:type="dxa"/>
+              <w:left w:w="100" w:type="dxa"/>
+              <w:right w:w="100" w:type="dxa"/>
+            </w:tcMar>
+          </w:tcPr>
+          <w:p>
+            <w:pPr>
+              <w:spacing w:before="0" w:after="0"/>
+            </w:pPr>
+            <w:r>
+              <w:rPr>
+                <w:rFonts w:ascii="Segoe UI" w:hAnsi="Segoe UI"/>
+                <w:color w:val="334155"/>
+                <w:sz w:val="17"/>
+              </w:rPr>
+              <w:t>—</w:t>
+            </w:r>
+          </w:p>
+        </w:tc>
+        <w:tc>
+          <w:tcPr>
+            <w:tcW w:type="dxa" w:w="1605"/>
+            <w:shd w:val="clear" w:color="auto" w:fill="F8FAFC"/>
+            <w:tcBorders>
+              <w:top w:val="single" w:sz="4" w:space="0" w:color="CBD5E1"/>
+              <w:left w:val="single" w:sz="4" w:space="0" w:color="CBD5E1"/>
+              <w:bottom w:val="single" w:sz="4" w:space="0" w:color="CBD5E1"/>
+              <w:right w:val="single" w:sz="4" w:space="0" w:color="CBD5E1"/>
+            </w:tcBorders>
+            <w:tcMar>
+              <w:top w:w="80" w:type="dxa"/>
+              <w:bottom w:w="80" w:type="dxa"/>
+              <w:left w:w="100" w:type="dxa"/>
+              <w:right w:w="100" w:type="dxa"/>
+            </w:tcMar>
+          </w:tcPr>
+          <w:p>
+            <w:pPr>
+              <w:spacing w:before="0" w:after="0"/>
+            </w:pPr>
+            <w:r>
+              <w:rPr>
+                <w:rFonts w:ascii="Segoe UI" w:hAnsi="Segoe UI"/>
+                <w:color w:val="334155"/>
+                <w:sz w:val="17"/>
+              </w:rPr>
+              <w:t>—</w:t>
+            </w:r>
+          </w:p>
+        </w:tc>
+        <w:tc>
+          <w:tcPr>
+            <w:tcW w:type="dxa" w:w="1605"/>
+            <w:shd w:val="clear" w:color="auto" w:fill="F8FAFC"/>
+            <w:tcBorders>
+              <w:top w:val="single" w:sz="4" w:space="0" w:color="CBD5E1"/>
+              <w:left w:val="single" w:sz="4" w:space="0" w:color="CBD5E1"/>
+              <w:bottom w:val="single" w:sz="4" w:space="0" w:color="CBD5E1"/>
+              <w:right w:val="single" w:sz="4" w:space="0" w:color="CBD5E1"/>
+            </w:tcBorders>
+            <w:tcMar>
+              <w:top w:w="80" w:type="dxa"/>
+              <w:bottom w:w="80" w:type="dxa"/>
+              <w:left w:w="100" w:type="dxa"/>
+              <w:right w:w="100" w:type="dxa"/>
+            </w:tcMar>
+          </w:tcPr>
+          <w:p>
+            <w:pPr>
+              <w:spacing w:before="0" w:after="0"/>
+            </w:pPr>
+            <w:r>
+              <w:rPr>
+                <w:rFonts w:ascii="Segoe UI" w:hAnsi="Segoe UI"/>
+                <w:color w:val="334155"/>
+                <w:sz w:val="17"/>
+              </w:rPr>
+              <w:t>42.0 Horas Ordinarias</w:t>
+            </w:r>
+          </w:p>
+        </w:tc>
+      </w:tr>
+    </w:tbl>
+    <w:p>
+      <w:pPr>
+        <w:spacing w:after="80"/>
+      </w:pPr>
     </w:p>
     <w:p>
       <w:pPr>
@@ -870,7 +2716,7 @@
           <w:color w:val="EA580C"/>
           <w:sz w:val="24"/>
         </w:rPr>
-        <w:t>Flujo Paso a Paso de Marcación en Kiosco</w:t>
+        <w:t>Particularidad del Personal de Patio (Fines de Semana)</w:t>
       </w:r>
     </w:p>
     <w:p>
@@ -885,7 +2731,7 @@
           <w:color w:val="0F172A"/>
           <w:sz w:val="18"/>
         </w:rPr>
-        <w:t xml:space="preserve">1. Pantalla de Bienvenida con Teclado Numérico Gigante: </w:t>
+        <w:t xml:space="preserve">• Régimen del Personal Administrativo: </w:t>
       </w:r>
       <w:r>
         <w:rPr>
@@ -893,7 +2739,7 @@
           <w:color w:val="334155"/>
           <w:sz w:val="18"/>
         </w:rPr>
-        <w:t>Botones táctiles grandes (80x80 px) que permiten al operario marcar cómodamente su número de Cédula de Ciudadanía, incluso portando guantes de protección.</w:t>
+        <w:t>Labora estrictamente de Lunes a Viernes (42 horas semanales). Sábados, domingos y festivos son días de descanso obligatorio.</w:t>
       </w:r>
     </w:p>
     <w:p>
@@ -908,7 +2754,7 @@
           <w:color w:val="0F172A"/>
           <w:sz w:val="18"/>
         </w:rPr>
-        <w:t xml:space="preserve">2. Opción de Lectura Automática (Escáner Código de Barras): </w:t>
+        <w:t xml:space="preserve">• Régimen del Personal Operativo de Patio: </w:t>
       </w:r>
       <w:r>
         <w:rPr>
@@ -916,7 +2762,7 @@
           <w:color w:val="334155"/>
           <w:sz w:val="18"/>
         </w:rPr>
-        <w:t>El trabajador puede simplemente acercar la parte posterior de su cédula colombiana física (código de barras bidimensional PDF417) o el carnet corporativo al lector láser para un fichaje instantáneo en 300 ms sin necesidad de digitar.</w:t>
+        <w:t>Cuando las necesidades operativas de la planta lo requieren (llegada de buques chatarra, camiones pesados o cargues urgentes), el personal de patio trabaja los sábados, domingos e incluso días festivos.</w:t>
       </w:r>
     </w:p>
     <w:p>
@@ -931,7 +2777,7 @@
           <w:color w:val="0F172A"/>
           <w:sz w:val="18"/>
         </w:rPr>
-        <w:t xml:space="preserve">3. Verificación Instantánea en el Backend: </w:t>
+        <w:t xml:space="preserve">• Tratamiento de Horas en Sábado: </w:t>
       </w:r>
       <w:r>
         <w:rPr>
@@ -939,7 +2785,7 @@
           <w:color w:val="334155"/>
           <w:sz w:val="18"/>
         </w:rPr>
-        <w:t>El sistema valida en microsegundos: a) Estado de la credencial (ACTIVA / SUSPENDIDA), b) Vigencia de ARL y examen médico periódico, c) Turno asignado y horario de inicio.</w:t>
+        <w:t>Al haberse cumplido las 42 horas ordinarias entre lunes y viernes, todo tiempo laborado en sábado por el personal de patio se liquida automáticamente como Horas Extras Diurnas (HED +25%) o Nocturnas (HEN +75%).</w:t>
       </w:r>
     </w:p>
     <w:p>
@@ -954,7 +2800,7 @@
           <w:color w:val="0F172A"/>
           <w:sz w:val="18"/>
         </w:rPr>
-        <w:t xml:space="preserve">4. Pantalla de Confirmación con Foto y Datos: </w:t>
+        <w:t xml:space="preserve">• Tratamiento de Horas en Domingo y Festivo: </w:t>
       </w:r>
       <w:r>
         <w:rPr>
@@ -962,53 +2808,62 @@
           <w:color w:val="334155"/>
           <w:sz w:val="18"/>
         </w:rPr>
-        <w:t>Muestra en pantalla la fotografía del colaborador, nombre completo, cargo (ej. 'Operario de Desintegración Vehicular'), área ('Patio de Chatarra'), hora exacta y estatus de puntualidad ('ENTRADA REGISTRADA — A TIEMPO' o 'TARDANZA DE 14 MINUTOS').</w:t>
+        <w:t>Se liquida con el Recargo Dominical/Festivo de Ley (75% a 100%) más horas extras dominicales (HEDDF +100% / HENDF +150%), previa autorización formal del Jefe de Patio.</w:t>
       </w:r>
     </w:p>
     <w:p>
       <w:pPr>
-        <w:pStyle w:val="ListBullet"/>
-        <w:spacing w:before="20" w:after="60"/>
+        <w:spacing w:before="120" w:after="40"/>
+        <w:jc w:val="center"/>
+      </w:pPr>
+      <w:r>
+        <w:drawing>
+          <wp:inline xmlns:a="http://schemas.openxmlformats.org/drawingml/2006/main" xmlns:pic="http://schemas.openxmlformats.org/drawingml/2006/picture">
+            <wp:extent cx="5852160" cy="3657600"/>
+            <wp:docPr id="2" name="Picture 2"/>
+            <wp:cNvGraphicFramePr>
+              <a:graphicFrameLocks noChangeAspect="1"/>
+            </wp:cNvGraphicFramePr>
+            <a:graphic>
+              <a:graphicData uri="http://schemas.openxmlformats.org/drawingml/2006/picture">
+                <pic:pic>
+                  <pic:nvPicPr>
+                    <pic:cNvPr id="0" name="02_Arquitectura_Capas_Y_Motor_42Horas.png"/>
+                    <pic:cNvPicPr/>
+                  </pic:nvPicPr>
+                  <pic:blipFill>
+                    <a:blip r:embed="rId12"/>
+                    <a:stretch>
+                      <a:fillRect/>
+                    </a:stretch>
+                  </pic:blipFill>
+                  <pic:spPr>
+                    <a:xfrm>
+                      <a:off x="0" y="0"/>
+                      <a:ext cx="5852160" cy="3657600"/>
+                    </a:xfrm>
+                    <a:prstGeom prst="rect"/>
+                  </pic:spPr>
+                </pic:pic>
+              </a:graphicData>
+            </a:graphic>
+          </wp:inline>
+        </w:drawing>
+      </w:r>
+    </w:p>
+    <w:p>
+      <w:pPr>
+        <w:spacing w:after="200"/>
+        <w:jc w:val="center"/>
       </w:pPr>
       <w:r>
         <w:rPr>
           <w:rFonts w:ascii="Segoe UI" w:hAnsi="Segoe UI"/>
-          <w:b/>
-          <w:color w:val="0F172A"/>
-          <w:sz w:val="18"/>
+          <w:i/>
+          <w:color w:val="EA580C"/>
+          <w:sz w:val="17"/>
         </w:rPr>
-        <w:t xml:space="preserve">5. Retroalimentación Acústica de Alta Claridad: </w:t>
-      </w:r>
-      <w:r>
-        <w:rPr>
-          <w:rFonts w:ascii="Segoe UI" w:hAnsi="Segoe UI"/>
-          <w:color w:val="334155"/>
-          <w:sz w:val="18"/>
-        </w:rPr>
-        <w:t>Un sonido agudo y claro confirma el acceso exitoso; un doble tono grave advierte si la persona tiene el ingreso suspendido o si intenta una marcación errónea.</w:t>
-      </w:r>
-    </w:p>
-    <w:p>
-      <w:pPr>
-        <w:pStyle w:val="ListBullet"/>
-        <w:spacing w:before="20" w:after="60"/>
-      </w:pPr>
-      <w:r>
-        <w:rPr>
-          <w:rFonts w:ascii="Segoe UI" w:hAnsi="Segoe UI"/>
-          <w:b/>
-          <w:color w:val="0F172A"/>
-          <w:sz w:val="18"/>
-        </w:rPr>
-        <w:t xml:space="preserve">6. Registro de Salida y Jornada Cumplida: </w:t>
-      </w:r>
-      <w:r>
-        <w:rPr>
-          <w:rFonts w:ascii="Segoe UI" w:hAnsi="Segoe UI"/>
-          <w:color w:val="334155"/>
-          <w:sz w:val="18"/>
-        </w:rPr>
-        <w:t>Al finalizar el turno, el trabajador vuelve a digitar su cédula; el sistema detecta que se encuentra dentro de planta, registra la SALIDA y le muestra un resumen cordial: '¡Buen descanso, Roberto! Jornada cumplida: 8 horas 22 minutos'.</w:t>
+        <w:t>Figura Oficial: Diagrama 02: Arquitectura en Capas y Motor de Liquidación Horaria (42h L-V) (docs/diagramas_naranjo_png/02_Arquitectura_Capas_Y_Motor_42Horas.png)</w:t>
       </w:r>
     </w:p>
     <w:p>
@@ -1023,7 +2878,7 @@
           <w:color w:val="0F172A"/>
           <w:sz w:val="31"/>
         </w:rPr>
-        <w:t>3. Portal del Jefe de Área / Supervisor de Patio en Tiempo Real</w:t>
+        <w:t>3. El Kiosco de Garita: Experiencia del Trabajador con Cédula</w:t>
       </w:r>
     </w:p>
     <w:p>
@@ -1044,7 +2899,236 @@
           <w:color w:val="334155"/>
           <w:sz w:val="19"/>
         </w:rPr>
-        <w:t>Uno de los mayores dolores de cabeza en operaciones de patio es saber si la cuadrilla completa está disponible antes de iniciar labores críticas como el oxicorte, la operación de grúas o el despiece vehicular. El Jefe de Área contará con una vista exclusiva, accesible desde su teléfono celular, tablet o computador de oficina:</w:t>
+        <w:t>En la portería peatonal se ubicará una pantalla táctil industrial (All-in-One de 15 a 21 pulgadas) empotrada a la pared o en tótem metálico. La interfaz está diseñada para operarios con guantes o equipo de protección personal (EPP):</w:t>
+      </w:r>
+    </w:p>
+    <w:p>
+      <w:pPr>
+        <w:pStyle w:val="ListBullet"/>
+        <w:spacing w:before="20" w:after="60"/>
+      </w:pPr>
+      <w:r>
+        <w:rPr>
+          <w:rFonts w:ascii="Segoe UI" w:hAnsi="Segoe UI"/>
+          <w:b/>
+          <w:color w:val="0F172A"/>
+          <w:sz w:val="18"/>
+        </w:rPr>
+        <w:t xml:space="preserve">1. Pantalla Numérica Gigante: </w:t>
+      </w:r>
+      <w:r>
+        <w:rPr>
+          <w:rFonts w:ascii="Segoe UI" w:hAnsi="Segoe UI"/>
+          <w:color w:val="334155"/>
+          <w:sz w:val="18"/>
+        </w:rPr>
+        <w:t>Teclado táctil en pantalla con teclas de 80x80 px para digitar cómodamente la Cédula de Ciudadanía.</w:t>
+      </w:r>
+    </w:p>
+    <w:p>
+      <w:pPr>
+        <w:pStyle w:val="ListBullet"/>
+        <w:spacing w:before="20" w:after="60"/>
+      </w:pPr>
+      <w:r>
+        <w:rPr>
+          <w:rFonts w:ascii="Segoe UI" w:hAnsi="Segoe UI"/>
+          <w:b/>
+          <w:color w:val="0F172A"/>
+          <w:sz w:val="18"/>
+        </w:rPr>
+        <w:t xml:space="preserve">2. Escaneo Opcional con Código de Barras: </w:t>
+      </w:r>
+      <w:r>
+        <w:rPr>
+          <w:rFonts w:ascii="Segoe UI" w:hAnsi="Segoe UI"/>
+          <w:color w:val="334155"/>
+          <w:sz w:val="18"/>
+        </w:rPr>
+        <w:t>Lector láser integrado que permite escanear el código PDF417 al reverso de la cédula colombiana física o carnet corporativo en 300 ms sin necesidad de digitar.</w:t>
+      </w:r>
+    </w:p>
+    <w:p>
+      <w:pPr>
+        <w:pStyle w:val="ListBullet"/>
+        <w:spacing w:before="20" w:after="60"/>
+      </w:pPr>
+      <w:r>
+        <w:rPr>
+          <w:rFonts w:ascii="Segoe UI" w:hAnsi="Segoe UI"/>
+          <w:b/>
+          <w:color w:val="0F172A"/>
+          <w:sz w:val="18"/>
+        </w:rPr>
+        <w:t xml:space="preserve">3. Verificación Instantánea de Tolerancia: </w:t>
+      </w:r>
+      <w:r>
+        <w:rPr>
+          <w:rFonts w:ascii="Segoe UI" w:hAnsi="Segoe UI"/>
+          <w:color w:val="334155"/>
+          <w:sz w:val="18"/>
+        </w:rPr>
+        <w:t>El backend compara la hora de marcación contra el horario del día (Lunes 8:00 AM, Martes-Viernes 7:30 AM). Si llega dentro de los 10 minutos de gracia, registra 'PUNTUAL'; si supera los 10 minutos, calcula la tardanza exacta.</w:t>
+      </w:r>
+    </w:p>
+    <w:p>
+      <w:pPr>
+        <w:pStyle w:val="ListBullet"/>
+        <w:spacing w:before="20" w:after="60"/>
+      </w:pPr>
+      <w:r>
+        <w:rPr>
+          <w:rFonts w:ascii="Segoe UI" w:hAnsi="Segoe UI"/>
+          <w:b/>
+          <w:color w:val="0F172A"/>
+          <w:sz w:val="18"/>
+        </w:rPr>
+        <w:t xml:space="preserve">4. Control Anti-Passback Estricto: </w:t>
+      </w:r>
+      <w:r>
+        <w:rPr>
+          <w:rFonts w:ascii="Segoe UI" w:hAnsi="Segoe UI"/>
+          <w:color w:val="334155"/>
+          <w:sz w:val="18"/>
+        </w:rPr>
+        <w:t>Si el operario ya ingresó a la planta y no ha registrado salida, el sistema bloquea una segunda entrada fraudulenta y le solicita marcar Salida.</w:t>
+      </w:r>
+    </w:p>
+    <w:p>
+      <w:pPr>
+        <w:pStyle w:val="ListBullet"/>
+        <w:spacing w:before="20" w:after="60"/>
+      </w:pPr>
+      <w:r>
+        <w:rPr>
+          <w:rFonts w:ascii="Segoe UI" w:hAnsi="Segoe UI"/>
+          <w:b/>
+          <w:color w:val="0F172A"/>
+          <w:sz w:val="18"/>
+        </w:rPr>
+        <w:t xml:space="preserve">5. Retroalimentación Visual y Sonora: </w:t>
+      </w:r>
+      <w:r>
+        <w:rPr>
+          <w:rFonts w:ascii="Segoe UI" w:hAnsi="Segoe UI"/>
+          <w:color w:val="334155"/>
+          <w:sz w:val="18"/>
+        </w:rPr>
+        <w:t>Pantalla verde con foto oficial y tono de aprobación para ingreso exitoso; pantalla roja con tono grave si tiene la credencial suspendida o si intenta una marcación inválida.</w:t>
+      </w:r>
+    </w:p>
+    <w:p>
+      <w:pPr>
+        <w:pStyle w:val="ListBullet"/>
+        <w:spacing w:before="20" w:after="60"/>
+      </w:pPr>
+      <w:r>
+        <w:rPr>
+          <w:rFonts w:ascii="Segoe UI" w:hAnsi="Segoe UI"/>
+          <w:b/>
+          <w:color w:val="0F172A"/>
+          <w:sz w:val="18"/>
+        </w:rPr>
+        <w:t xml:space="preserve">6. Registro de Salida y Jornada Diaria: </w:t>
+      </w:r>
+      <w:r>
+        <w:rPr>
+          <w:rFonts w:ascii="Segoe UI" w:hAnsi="Segoe UI"/>
+          <w:color w:val="334155"/>
+          <w:sz w:val="18"/>
+        </w:rPr>
+        <w:t>Al terminar el turno, el trabajador vuelve a digitar su cédula; el sistema registra la SALIDA y le muestra en pantalla: '¡Buen descanso, Carlos! Salida registrada (05:04 PM) — Jornada: 8h 34min'.</w:t>
+      </w:r>
+    </w:p>
+    <w:p>
+      <w:pPr>
+        <w:spacing w:before="120" w:after="40"/>
+        <w:jc w:val="center"/>
+      </w:pPr>
+      <w:r>
+        <w:drawing>
+          <wp:inline xmlns:a="http://schemas.openxmlformats.org/drawingml/2006/main" xmlns:pic="http://schemas.openxmlformats.org/drawingml/2006/picture">
+            <wp:extent cx="5852160" cy="3657600"/>
+            <wp:docPr id="3" name="Picture 3"/>
+            <wp:cNvGraphicFramePr>
+              <a:graphicFrameLocks noChangeAspect="1"/>
+            </wp:cNvGraphicFramePr>
+            <a:graphic>
+              <a:graphicData uri="http://schemas.openxmlformats.org/drawingml/2006/picture">
+                <pic:pic>
+                  <pic:nvPicPr>
+                    <pic:cNvPr id="0" name="03_Secuencia_Fichaje_Kiosco_Cedula.png"/>
+                    <pic:cNvPicPr/>
+                  </pic:nvPicPr>
+                  <pic:blipFill>
+                    <a:blip r:embed="rId13"/>
+                    <a:stretch>
+                      <a:fillRect/>
+                    </a:stretch>
+                  </pic:blipFill>
+                  <pic:spPr>
+                    <a:xfrm>
+                      <a:off x="0" y="0"/>
+                      <a:ext cx="5852160" cy="3657600"/>
+                    </a:xfrm>
+                    <a:prstGeom prst="rect"/>
+                  </pic:spPr>
+                </pic:pic>
+              </a:graphicData>
+            </a:graphic>
+          </wp:inline>
+        </w:drawing>
+      </w:r>
+    </w:p>
+    <w:p>
+      <w:pPr>
+        <w:spacing w:after="200"/>
+        <w:jc w:val="center"/>
+      </w:pPr>
+      <w:r>
+        <w:rPr>
+          <w:rFonts w:ascii="Segoe UI" w:hAnsi="Segoe UI"/>
+          <w:i/>
+          <w:color w:val="EA580C"/>
+          <w:sz w:val="17"/>
+        </w:rPr>
+        <w:t>Figura Oficial: Diagrama 03: Secuencia — Fichaje en Kiosco Táctil con Cédula de Ciudadanía (docs/diagramas_naranjo_png/03_Secuencia_Fichaje_Kiosco_Cedula.png)</w:t>
+      </w:r>
+    </w:p>
+    <w:p>
+      <w:pPr>
+        <w:pStyle w:val="Heading1"/>
+        <w:spacing w:before="320" w:after="80"/>
+      </w:pPr>
+      <w:r>
+        <w:rPr>
+          <w:rFonts w:ascii="Segoe UI" w:hAnsi="Segoe UI"/>
+          <w:b/>
+          <w:color w:val="0F172A"/>
+          <w:sz w:val="31"/>
+        </w:rPr>
+        <w:t>4. Portal del Jefe de Área / Supervisor de Patio en Tiempo Real</w:t>
+      </w:r>
+    </w:p>
+    <w:p>
+      <w:pPr>
+        <w:pBdr>
+          <w:bottom w:val="single" w:sz="14" w:space="1" w:color="EA580C"/>
+        </w:pBdr>
+        <w:spacing w:before="40" w:after="160"/>
+      </w:pPr>
+    </w:p>
+    <w:p>
+      <w:pPr>
+        <w:spacing w:before="40" w:after="120" w:line="276" w:lineRule="auto"/>
+      </w:pPr>
+      <w:r>
+        <w:rPr>
+          <w:rFonts w:ascii="Segoe UI" w:hAnsi="Segoe UI"/>
+          <w:color w:val="334155"/>
+          <w:sz w:val="19"/>
+        </w:rPr>
+        <w:t>Los jefes de cuadrilla y supervisores de patio necesitan saber con certeza qué trabajadores están disponibles antes de arrancar equipos pesados (grúas, prensas, equipos de oxicorte). El Jefe de Patio dispondrá de una web app móvil accesible desde su celular o tablet:</w:t>
       </w:r>
     </w:p>
     <w:tbl>
@@ -1087,7 +3171,7 @@
                 <w:color w:val="FFFFFF"/>
                 <w:sz w:val="18"/>
               </w:rPr>
-              <w:t>Funcionalidad del Jefe</w:t>
+              <w:t>Módulo del Jefe de Patio</w:t>
             </w:r>
           </w:p>
         </w:tc>
@@ -1119,7 +3203,7 @@
                 <w:color w:val="FFFFFF"/>
                 <w:sz w:val="18"/>
               </w:rPr>
-              <w:t>Detalle Técnico y Operativo</w:t>
+              <w:t>Detalle Técnico y Funcional</w:t>
             </w:r>
           </w:p>
         </w:tc>
@@ -1312,7 +3396,7 @@
                 <w:color w:val="334155"/>
                 <w:sz w:val="17"/>
               </w:rPr>
-              <w:t>Verde: Presente y a tiempo. Amarillo: Llegó con tardanza (indica minutos). Rojo: Ausente sin justificar.</w:t>
+              <w:t>Verde: Presente y puntual. Amarillo: Llegó con tardanza (indica minutos). Rojo: Ausente sin justificar.</w:t>
             </w:r>
           </w:p>
         </w:tc>
@@ -1343,7 +3427,7 @@
                 <w:color w:val="334155"/>
                 <w:sz w:val="17"/>
               </w:rPr>
-              <w:t>Visibilidad visual instantánea del compromiso laboral del equipo de trabajo.</w:t>
+              <w:t>Diagnóstico visual en 5 segundos sin tener que pasar lista con papel y lápiz.</w:t>
             </w:r>
           </w:p>
         </w:tc>
@@ -1377,7 +3461,7 @@
                 <w:color w:val="0F172A"/>
                 <w:sz w:val="17"/>
               </w:rPr>
-              <w:t>Alertas Tempranas en Celular</w:t>
+              <w:t>Alerta Automática a los 15 Minutos</w:t>
             </w:r>
           </w:p>
         </w:tc>
@@ -1408,7 +3492,7 @@
                 <w:color w:val="334155"/>
                 <w:sz w:val="17"/>
               </w:rPr>
-              <w:t>Notificación push o WhatsApp si faltan cargos críticos (ej. Operador de Báscula o Chofer de Retroexcavadora) tras 15 min de iniciado el turno.</w:t>
+              <w:t>A las 7:45 AM (Mar-Vie) u 8:15 AM (Lunes), el sistema alerta al celular si falta un puesto crítico (Oxigenista, Chofer de Grúa, Báscula).</w:t>
             </w:r>
           </w:p>
         </w:tc>
@@ -1473,7 +3557,7 @@
                 <w:color w:val="0F172A"/>
                 <w:sz w:val="17"/>
               </w:rPr>
-              <w:t>Aprobación de Horas Extras en Campo</w:t>
+              <w:t>Autorización de Extras de Fin de Semana</w:t>
             </w:r>
           </w:p>
         </w:tc>
@@ -1504,7 +3588,7 @@
                 <w:color w:val="334155"/>
                 <w:sz w:val="17"/>
               </w:rPr>
-              <w:t>El jefe puede autorizar desde su móvil la extensión de jornada de un operario cuando se requiere terminar una carga o corte urgente.</w:t>
+              <w:t>El jefe puede autorizar desde su celular la jornada de sábado, domingo o festivo de los operarios que se requieren en patio.</w:t>
             </w:r>
           </w:p>
         </w:tc>
@@ -1600,7 +3684,7 @@
                 <w:color w:val="334155"/>
                 <w:sz w:val="17"/>
               </w:rPr>
-              <w:t>Consulta por trabajador de los últimos 30 días con gráficos de puntualidad, días laborados y tiempos promedio de estancia.</w:t>
+              <w:t>Consulta por trabajador de los últimos 30 días con gráficos de puntualidad, días laborados y horas acumuladas.</w:t>
             </w:r>
           </w:p>
         </w:tc>
@@ -1644,6 +3728,61 @@
     </w:p>
     <w:p>
       <w:pPr>
+        <w:spacing w:before="120" w:after="40"/>
+        <w:jc w:val="center"/>
+      </w:pPr>
+      <w:r>
+        <w:drawing>
+          <wp:inline xmlns:a="http://schemas.openxmlformats.org/drawingml/2006/main" xmlns:pic="http://schemas.openxmlformats.org/drawingml/2006/picture">
+            <wp:extent cx="5852160" cy="3657600"/>
+            <wp:docPr id="4" name="Picture 4"/>
+            <wp:cNvGraphicFramePr>
+              <a:graphicFrameLocks noChangeAspect="1"/>
+            </wp:cNvGraphicFramePr>
+            <a:graphic>
+              <a:graphicData uri="http://schemas.openxmlformats.org/drawingml/2006/picture">
+                <pic:pic>
+                  <pic:nvPicPr>
+                    <pic:cNvPr id="0" name="04_Secuencia_Monitoreo_Cuadrilla_Jefe_Patio.png"/>
+                    <pic:cNvPicPr/>
+                  </pic:nvPicPr>
+                  <pic:blipFill>
+                    <a:blip r:embed="rId14"/>
+                    <a:stretch>
+                      <a:fillRect/>
+                    </a:stretch>
+                  </pic:blipFill>
+                  <pic:spPr>
+                    <a:xfrm>
+                      <a:off x="0" y="0"/>
+                      <a:ext cx="5852160" cy="3657600"/>
+                    </a:xfrm>
+                    <a:prstGeom prst="rect"/>
+                  </pic:spPr>
+                </pic:pic>
+              </a:graphicData>
+            </a:graphic>
+          </wp:inline>
+        </w:drawing>
+      </w:r>
+    </w:p>
+    <w:p>
+      <w:pPr>
+        <w:spacing w:after="200"/>
+        <w:jc w:val="center"/>
+      </w:pPr>
+      <w:r>
+        <w:rPr>
+          <w:rFonts w:ascii="Segoe UI" w:hAnsi="Segoe UI"/>
+          <w:i/>
+          <w:color w:val="EA580C"/>
+          <w:sz w:val="17"/>
+        </w:rPr>
+        <w:t>Figura Oficial: Diagrama 04: Secuencia — Monitoreo de Cuadrilla y Alertas de Puestos Críticos (docs/diagramas_naranjo_png/04_Secuencia_Monitoreo_Cuadrilla_Jefe_Patio.png)</w:t>
+      </w:r>
+    </w:p>
+    <w:p>
+      <w:pPr>
         <w:pStyle w:val="Heading1"/>
         <w:spacing w:before="320" w:after="80"/>
       </w:pPr>
@@ -1654,7 +3793,7 @@
           <w:color w:val="0F172A"/>
           <w:sz w:val="31"/>
         </w:rPr>
-        <w:t>4. Panel del Administrador General y Gestión Humana (Nómina)</w:t>
+        <w:t>5. Motor de Liquidación de Jornadas y Horas Extras (CST Colombia)</w:t>
       </w:r>
     </w:p>
     <w:p>
@@ -1675,22 +3814,7 @@
           <w:color w:val="334155"/>
           <w:sz w:val="19"/>
         </w:rPr>
-        <w:t>El Administrador General y el equipo de Gestión Humana poseen el control estratégico de la plataforma, con herramientas diseñadas para simplificar la gestión laboral y nómina bajo las leyes de Colombia:</w:t>
-      </w:r>
-    </w:p>
-    <w:p>
-      <w:pPr>
-        <w:pStyle w:val="Heading2"/>
-        <w:spacing w:before="240" w:after="80"/>
-      </w:pPr>
-      <w:r>
-        <w:rPr>
-          <w:rFonts w:ascii="Segoe UI" w:hAnsi="Segoe UI"/>
-          <w:b/>
-          <w:color w:val="EA580C"/>
-          <w:sz w:val="24"/>
-        </w:rPr>
-        <w:t>Capacidades de Gestión y Nómina</w:t>
+        <w:t>El motor de cálculo clasifica automáticamente cada marcación según la legislación laboral colombiana y el memorando de la empresa:</w:t>
       </w:r>
     </w:p>
     <w:p>
@@ -1705,7 +3829,7 @@
           <w:color w:val="0F172A"/>
           <w:sz w:val="18"/>
         </w:rPr>
-        <w:t xml:space="preserve">1. Padrón Centralizado de Colaboradores: </w:t>
+        <w:t xml:space="preserve">• Horas Ordinarias (HOD): </w:t>
       </w:r>
       <w:r>
         <w:rPr>
@@ -1713,7 +3837,7 @@
           <w:color w:val="334155"/>
           <w:sz w:val="18"/>
         </w:rPr>
-        <w:t>Ficha integral de cada trabajador con Cédula, Nombres, Cargo, Departamento (Patio de Chatarra, Desintegración, Mantenimiento, Báscula, Administración), EPS, ARL, Turno asignado y Foto.</w:t>
+        <w:t>Acumulación de hasta 42 horas semanales distribuidas de lunes a viernes según la tabla oficial.</w:t>
       </w:r>
     </w:p>
     <w:p>
@@ -1728,7 +3852,7 @@
           <w:color w:val="0F172A"/>
           <w:sz w:val="18"/>
         </w:rPr>
-        <w:t xml:space="preserve">2. Configuración Flexible de Turnos Industriales: </w:t>
+        <w:t xml:space="preserve">• Horas Extras Diurnas (HED +25%): </w:t>
       </w:r>
       <w:r>
         <w:rPr>
@@ -1736,7 +3860,7 @@
           <w:color w:val="334155"/>
           <w:sz w:val="18"/>
         </w:rPr>
-        <w:t>Definición de turnos rotativos (Mañana 06:00-14:00, Tarde 14:00-22:00, Noche 22:00-06:00 o Administrativo 07:00-17:00 con 1 hora de almuerzo) y margen de tolerancia (ej. 10 minutos).</w:t>
+        <w:t>Horas laboradas que superen la jornada diaria oficial de lunes a viernes, o todo el tiempo laborado el sábado por personal de patio.</w:t>
       </w:r>
     </w:p>
     <w:p>
@@ -1751,7 +3875,7 @@
           <w:color w:val="0F172A"/>
           <w:sz w:val="18"/>
         </w:rPr>
-        <w:t xml:space="preserve">3. Motor de Pre-Liquidación según el Código Sustantivo del Trabajo (Colombia): </w:t>
+        <w:t xml:space="preserve">• Horas Extras Nocturnas (HEN +75%): </w:t>
       </w:r>
       <w:r>
         <w:rPr>
@@ -1759,7 +3883,7 @@
           <w:color w:val="334155"/>
           <w:sz w:val="18"/>
         </w:rPr>
-        <w:t>Cálculo automático y desglosado para cada corte de nómina (quincenal o mensual): Horas Ordinarias, Horas Extras Diurnas (HED +25%), Horas Extras Nocturnas (HEN +75%), Recargo Nocturno (RN +35% de 21:00 a 06:00), y Horas Dominicales/Festivas ordinarias y con recargo.</w:t>
+        <w:t>Horas extras laboradas entre las 21:00 y las 06:00.</w:t>
       </w:r>
     </w:p>
     <w:p>
@@ -1774,7 +3898,7 @@
           <w:color w:val="0F172A"/>
           <w:sz w:val="18"/>
         </w:rPr>
-        <w:t xml:space="preserve">4. Exportación Compatible con Softwares de Nómina en Colombia: </w:t>
+        <w:t xml:space="preserve">• Recargo Nocturno (RN +35%): </w:t>
       </w:r>
       <w:r>
         <w:rPr>
@@ -1782,7 +3906,7 @@
           <w:color w:val="334155"/>
           <w:sz w:val="18"/>
         </w:rPr>
-        <w:t>Descarga en un clic de archivos Excel (.xlsx) y CSV formateados para importar en Siigo, World Office, Novasoft, Helisa o SAP.</w:t>
+        <w:t>Horas ordinarias laboradas dentro de la franja nocturna (21:00 a 06:00).</w:t>
       </w:r>
     </w:p>
     <w:p>
@@ -1797,7 +3921,7 @@
           <w:color w:val="0F172A"/>
           <w:sz w:val="18"/>
         </w:rPr>
-        <w:t xml:space="preserve">5. Módulo de Novedades y Justificaciones: </w:t>
+        <w:t xml:space="preserve">• Horas Dominicales y Festivas (RDF +75%/100%): </w:t>
       </w:r>
       <w:r>
         <w:rPr>
@@ -1805,7 +3929,7 @@
           <w:color w:val="334155"/>
           <w:sz w:val="18"/>
         </w:rPr>
-        <w:t>Registro y archivo de incapacidades médicas expedidas por la EPS, permisos remunerados/no remunerados, vacaciones y sanciones disciplinarias.</w:t>
+        <w:t>Horas laboradas en domingos o días feriados por el personal operativo de patio, con opción de descanso compensatorio o pago.</w:t>
       </w:r>
     </w:p>
     <w:p>
@@ -1820,7 +3944,7 @@
           <w:color w:val="0F172A"/>
           <w:sz w:val="18"/>
         </w:rPr>
-        <w:t xml:space="preserve">6. Bitácora de Auditoría Inmutable: </w:t>
+        <w:t xml:space="preserve">• Exportación a Software Contable: </w:t>
       </w:r>
       <w:r>
         <w:rPr>
@@ -1828,7 +3952,117 @@
           <w:color w:val="334155"/>
           <w:sz w:val="18"/>
         </w:rPr>
-        <w:t>Registro de cada acción administrativa (quién autorizó una excepción, quién modificó un turno o quién desbloqueó un acceso) con fecha, hora e IP.</w:t>
+        <w:t>Generación de archivo Excel (.xlsx) y CSV compatible con Siigo, World Office, Novasoft, Helisa o SAP.</w:t>
+      </w:r>
+    </w:p>
+    <w:p>
+      <w:pPr>
+        <w:spacing w:before="120" w:after="40"/>
+        <w:jc w:val="center"/>
+      </w:pPr>
+      <w:r>
+        <w:drawing>
+          <wp:inline xmlns:a="http://schemas.openxmlformats.org/drawingml/2006/main" xmlns:pic="http://schemas.openxmlformats.org/drawingml/2006/picture">
+            <wp:extent cx="5852160" cy="3657600"/>
+            <wp:docPr id="5" name="Picture 5"/>
+            <wp:cNvGraphicFramePr>
+              <a:graphicFrameLocks noChangeAspect="1"/>
+            </wp:cNvGraphicFramePr>
+            <a:graphic>
+              <a:graphicData uri="http://schemas.openxmlformats.org/drawingml/2006/picture">
+                <pic:pic>
+                  <pic:nvPicPr>
+                    <pic:cNvPr id="0" name="05_Flujo_Liquidacion_Jornadas_Y_Horas_Extras.png"/>
+                    <pic:cNvPicPr/>
+                  </pic:nvPicPr>
+                  <pic:blipFill>
+                    <a:blip r:embed="rId15"/>
+                    <a:stretch>
+                      <a:fillRect/>
+                    </a:stretch>
+                  </pic:blipFill>
+                  <pic:spPr>
+                    <a:xfrm>
+                      <a:off x="0" y="0"/>
+                      <a:ext cx="5852160" cy="3657600"/>
+                    </a:xfrm>
+                    <a:prstGeom prst="rect"/>
+                  </pic:spPr>
+                </pic:pic>
+              </a:graphicData>
+            </a:graphic>
+          </wp:inline>
+        </w:drawing>
+      </w:r>
+    </w:p>
+    <w:p>
+      <w:pPr>
+        <w:spacing w:after="200"/>
+        <w:jc w:val="center"/>
+      </w:pPr>
+      <w:r>
+        <w:rPr>
+          <w:rFonts w:ascii="Segoe UI" w:hAnsi="Segoe UI"/>
+          <w:i/>
+          <w:color w:val="EA580C"/>
+          <w:sz w:val="17"/>
+        </w:rPr>
+        <w:t>Figura Oficial: Diagrama 05: Flujo de Actividades — Liquidación de Jornadas 42h y Recargos de Patio (docs/diagramas_naranjo_png/05_Flujo_Liquidacion_Jornadas_Y_Horas_Extras.png)</w:t>
+      </w:r>
+    </w:p>
+    <w:p>
+      <w:pPr>
+        <w:spacing w:before="120" w:after="40"/>
+        <w:jc w:val="center"/>
+      </w:pPr>
+      <w:r>
+        <w:drawing>
+          <wp:inline xmlns:a="http://schemas.openxmlformats.org/drawingml/2006/main" xmlns:pic="http://schemas.openxmlformats.org/drawingml/2006/picture">
+            <wp:extent cx="5852160" cy="3657600"/>
+            <wp:docPr id="6" name="Picture 6"/>
+            <wp:cNvGraphicFramePr>
+              <a:graphicFrameLocks noChangeAspect="1"/>
+            </wp:cNvGraphicFramePr>
+            <a:graphic>
+              <a:graphicData uri="http://schemas.openxmlformats.org/drawingml/2006/picture">
+                <pic:pic>
+                  <pic:nvPicPr>
+                    <pic:cNvPr id="0" name="06_Estados_Trabajador_Y_Ciclo_Turno.png"/>
+                    <pic:cNvPicPr/>
+                  </pic:nvPicPr>
+                  <pic:blipFill>
+                    <a:blip r:embed="rId16"/>
+                    <a:stretch>
+                      <a:fillRect/>
+                    </a:stretch>
+                  </pic:blipFill>
+                  <pic:spPr>
+                    <a:xfrm>
+                      <a:off x="0" y="0"/>
+                      <a:ext cx="5852160" cy="3657600"/>
+                    </a:xfrm>
+                    <a:prstGeom prst="rect"/>
+                  </pic:spPr>
+                </pic:pic>
+              </a:graphicData>
+            </a:graphic>
+          </wp:inline>
+        </w:drawing>
+      </w:r>
+    </w:p>
+    <w:p>
+      <w:pPr>
+        <w:spacing w:after="200"/>
+        <w:jc w:val="center"/>
+      </w:pPr>
+      <w:r>
+        <w:rPr>
+          <w:rFonts w:ascii="Segoe UI" w:hAnsi="Segoe UI"/>
+          <w:i/>
+          <w:color w:val="EA580C"/>
+          <w:sz w:val="17"/>
+        </w:rPr>
+        <w:t>Figura Oficial: Diagrama 06: Máquina de Estados — Ciclo de Turno del Colaborador en Planta (docs/diagramas_naranjo_png/06_Estados_Trabajador_Y_Ciclo_Turno.png)</w:t>
       </w:r>
     </w:p>
     <w:p>
@@ -1843,7 +4077,7 @@
           <w:color w:val="0F172A"/>
           <w:sz w:val="31"/>
         </w:rPr>
-        <w:t>5. Consola del Vigilante de Garita y Control de Visitantes</w:t>
+        <w:t>6. Modelo de Datos Relacional y Despliegue en Planta</w:t>
       </w:r>
     </w:p>
     <w:p>
@@ -1864,530 +4098,78 @@
           <w:color w:val="334155"/>
           <w:sz w:val="19"/>
         </w:rPr>
-        <w:t>El vigilante de turno en la portería de Recuperaciones Naranjo cuenta con una pantalla de monitoreo auxiliar para apoyar la seguridad física:</w:t>
+        <w:t>La base de datos relacional soporta el padrón de cédulas, la configuración de horarios de 42 horas, las marcaciones de kiosco, las aprobaciones de horas extras en patio y la bitácora inmutable de auditoría:</w:t>
       </w:r>
-    </w:p>
-    <w:tbl>
-      <w:tblPr>
-        <w:tblW w:type="auto" w:w="0"/>
-        <w:jc w:val="center"/>
-        <w:tblLook w:firstColumn="1" w:firstRow="1" w:lastColumn="0" w:lastRow="0" w:noHBand="0" w:noVBand="1" w:val="04A0"/>
-      </w:tblPr>
-      <w:tblGrid>
-        <w:gridCol w:w="3211"/>
-        <w:gridCol w:w="3211"/>
-        <w:gridCol w:w="3211"/>
-      </w:tblGrid>
-      <w:tr>
-        <w:tc>
-          <w:tcPr>
-            <w:tcW w:type="dxa" w:w="3211"/>
-            <w:shd w:val="clear" w:color="auto" w:fill="1E293B"/>
-            <w:tcBorders>
-              <w:top w:val="single" w:sz="6" w:space="0" w:color="334155"/>
-              <w:left w:val="single" w:sz="6" w:space="0" w:color="334155"/>
-              <w:bottom w:val="single" w:sz="6" w:space="0" w:color="334155"/>
-              <w:right w:val="single" w:sz="6" w:space="0" w:color="334155"/>
-            </w:tcBorders>
-            <w:tcMar>
-              <w:top w:w="90" w:type="dxa"/>
-              <w:bottom w:w="90" w:type="dxa"/>
-              <w:left w:w="110" w:type="dxa"/>
-              <w:right w:w="110" w:type="dxa"/>
-            </w:tcMar>
-          </w:tcPr>
-          <w:p>
-            <w:pPr>
-              <w:spacing w:before="0" w:after="0"/>
-            </w:pPr>
-            <w:r>
-              <w:rPr>
-                <w:rFonts w:ascii="Segoe UI" w:hAnsi="Segoe UI"/>
-                <w:b/>
-                <w:color w:val="FFFFFF"/>
-                <w:sz w:val="18"/>
-              </w:rPr>
-              <w:t>Módulo de Garita</w:t>
-            </w:r>
-          </w:p>
-        </w:tc>
-        <w:tc>
-          <w:tcPr>
-            <w:tcW w:type="dxa" w:w="3211"/>
-            <w:shd w:val="clear" w:color="auto" w:fill="1E293B"/>
-            <w:tcBorders>
-              <w:top w:val="single" w:sz="6" w:space="0" w:color="334155"/>
-              <w:left w:val="single" w:sz="6" w:space="0" w:color="334155"/>
-              <w:bottom w:val="single" w:sz="6" w:space="0" w:color="334155"/>
-              <w:right w:val="single" w:sz="6" w:space="0" w:color="334155"/>
-            </w:tcBorders>
-            <w:tcMar>
-              <w:top w:w="90" w:type="dxa"/>
-              <w:bottom w:w="90" w:type="dxa"/>
-              <w:left w:w="110" w:type="dxa"/>
-              <w:right w:w="110" w:type="dxa"/>
-            </w:tcMar>
-          </w:tcPr>
-          <w:p>
-            <w:pPr>
-              <w:spacing w:before="0" w:after="0"/>
-            </w:pPr>
-            <w:r>
-              <w:rPr>
-                <w:rFonts w:ascii="Segoe UI" w:hAnsi="Segoe UI"/>
-                <w:b/>
-                <w:color w:val="FFFFFF"/>
-                <w:sz w:val="18"/>
-              </w:rPr>
-              <w:t>Acción del Vigilante</w:t>
-            </w:r>
-          </w:p>
-        </w:tc>
-        <w:tc>
-          <w:tcPr>
-            <w:tcW w:type="dxa" w:w="3211"/>
-            <w:shd w:val="clear" w:color="auto" w:fill="1E293B"/>
-            <w:tcBorders>
-              <w:top w:val="single" w:sz="6" w:space="0" w:color="334155"/>
-              <w:left w:val="single" w:sz="6" w:space="0" w:color="334155"/>
-              <w:bottom w:val="single" w:sz="6" w:space="0" w:color="334155"/>
-              <w:right w:val="single" w:sz="6" w:space="0" w:color="334155"/>
-            </w:tcBorders>
-            <w:tcMar>
-              <w:top w:w="90" w:type="dxa"/>
-              <w:bottom w:w="90" w:type="dxa"/>
-              <w:left w:w="110" w:type="dxa"/>
-              <w:right w:w="110" w:type="dxa"/>
-            </w:tcMar>
-          </w:tcPr>
-          <w:p>
-            <w:pPr>
-              <w:spacing w:before="0" w:after="0"/>
-            </w:pPr>
-            <w:r>
-              <w:rPr>
-                <w:rFonts w:ascii="Segoe UI" w:hAnsi="Segoe UI"/>
-                <w:b/>
-                <w:color w:val="FFFFFF"/>
-                <w:sz w:val="18"/>
-              </w:rPr>
-              <w:t>Impacto en Seguridad de Planta</w:t>
-            </w:r>
-          </w:p>
-        </w:tc>
-      </w:tr>
-      <w:tr>
-        <w:tc>
-          <w:tcPr>
-            <w:tcW w:type="dxa" w:w="3211"/>
-            <w:shd w:val="clear" w:color="auto" w:fill="FFFFFF"/>
-            <w:tcBorders>
-              <w:top w:val="single" w:sz="4" w:space="0" w:color="CBD5E1"/>
-              <w:left w:val="single" w:sz="4" w:space="0" w:color="CBD5E1"/>
-              <w:bottom w:val="single" w:sz="4" w:space="0" w:color="CBD5E1"/>
-              <w:right w:val="single" w:sz="4" w:space="0" w:color="CBD5E1"/>
-            </w:tcBorders>
-            <w:tcMar>
-              <w:top w:w="80" w:type="dxa"/>
-              <w:bottom w:w="80" w:type="dxa"/>
-              <w:left w:w="100" w:type="dxa"/>
-              <w:right w:w="100" w:type="dxa"/>
-            </w:tcMar>
-          </w:tcPr>
-          <w:p>
-            <w:pPr>
-              <w:spacing w:before="0" w:after="0"/>
-            </w:pPr>
-            <w:r>
-              <w:rPr>
-                <w:rFonts w:ascii="Segoe UI" w:hAnsi="Segoe UI"/>
-                <w:b/>
-                <w:color w:val="0F172A"/>
-                <w:sz w:val="17"/>
-              </w:rPr>
-              <w:t>Monitor Espejo de Marcaciones</w:t>
-            </w:r>
-          </w:p>
-        </w:tc>
-        <w:tc>
-          <w:tcPr>
-            <w:tcW w:type="dxa" w:w="3211"/>
-            <w:shd w:val="clear" w:color="auto" w:fill="FFFFFF"/>
-            <w:tcBorders>
-              <w:top w:val="single" w:sz="4" w:space="0" w:color="CBD5E1"/>
-              <w:left w:val="single" w:sz="4" w:space="0" w:color="CBD5E1"/>
-              <w:bottom w:val="single" w:sz="4" w:space="0" w:color="CBD5E1"/>
-              <w:right w:val="single" w:sz="4" w:space="0" w:color="CBD5E1"/>
-            </w:tcBorders>
-            <w:tcMar>
-              <w:top w:w="80" w:type="dxa"/>
-              <w:bottom w:w="80" w:type="dxa"/>
-              <w:left w:w="100" w:type="dxa"/>
-              <w:right w:w="100" w:type="dxa"/>
-            </w:tcMar>
-          </w:tcPr>
-          <w:p>
-            <w:pPr>
-              <w:spacing w:before="0" w:after="0"/>
-            </w:pPr>
-            <w:r>
-              <w:rPr>
-                <w:rFonts w:ascii="Segoe UI" w:hAnsi="Segoe UI"/>
-                <w:color w:val="334155"/>
-                <w:sz w:val="17"/>
-              </w:rPr>
-              <w:t>Al marcar un operario en el Kiosco, el monitor del vigilante muestra la foto oficial en grande para cotejo visual.</w:t>
-            </w:r>
-          </w:p>
-        </w:tc>
-        <w:tc>
-          <w:tcPr>
-            <w:tcW w:type="dxa" w:w="3211"/>
-            <w:shd w:val="clear" w:color="auto" w:fill="FFFFFF"/>
-            <w:tcBorders>
-              <w:top w:val="single" w:sz="4" w:space="0" w:color="CBD5E1"/>
-              <w:left w:val="single" w:sz="4" w:space="0" w:color="CBD5E1"/>
-              <w:bottom w:val="single" w:sz="4" w:space="0" w:color="CBD5E1"/>
-              <w:right w:val="single" w:sz="4" w:space="0" w:color="CBD5E1"/>
-            </w:tcBorders>
-            <w:tcMar>
-              <w:top w:w="80" w:type="dxa"/>
-              <w:bottom w:w="80" w:type="dxa"/>
-              <w:left w:w="100" w:type="dxa"/>
-              <w:right w:w="100" w:type="dxa"/>
-            </w:tcMar>
-          </w:tcPr>
-          <w:p>
-            <w:pPr>
-              <w:spacing w:before="0" w:after="0"/>
-            </w:pPr>
-            <w:r>
-              <w:rPr>
-                <w:rFonts w:ascii="Segoe UI" w:hAnsi="Segoe UI"/>
-                <w:color w:val="334155"/>
-                <w:sz w:val="17"/>
-              </w:rPr>
-              <w:t>Evita que un trabajador digite la cédula de otro compañero ausente.</w:t>
-            </w:r>
-          </w:p>
-        </w:tc>
-      </w:tr>
-      <w:tr>
-        <w:tc>
-          <w:tcPr>
-            <w:tcW w:type="dxa" w:w="3211"/>
-            <w:shd w:val="clear" w:color="auto" w:fill="F8FAFC"/>
-            <w:tcBorders>
-              <w:top w:val="single" w:sz="4" w:space="0" w:color="CBD5E1"/>
-              <w:left w:val="single" w:sz="4" w:space="0" w:color="CBD5E1"/>
-              <w:bottom w:val="single" w:sz="4" w:space="0" w:color="CBD5E1"/>
-              <w:right w:val="single" w:sz="4" w:space="0" w:color="CBD5E1"/>
-            </w:tcBorders>
-            <w:tcMar>
-              <w:top w:w="80" w:type="dxa"/>
-              <w:bottom w:w="80" w:type="dxa"/>
-              <w:left w:w="100" w:type="dxa"/>
-              <w:right w:w="100" w:type="dxa"/>
-            </w:tcMar>
-          </w:tcPr>
-          <w:p>
-            <w:pPr>
-              <w:spacing w:before="0" w:after="0"/>
-            </w:pPr>
-            <w:r>
-              <w:rPr>
-                <w:rFonts w:ascii="Segoe UI" w:hAnsi="Segoe UI"/>
-                <w:b/>
-                <w:color w:val="0F172A"/>
-                <w:sz w:val="17"/>
-              </w:rPr>
-              <w:t>Control de Visitantes y Proveedores</w:t>
-            </w:r>
-          </w:p>
-        </w:tc>
-        <w:tc>
-          <w:tcPr>
-            <w:tcW w:type="dxa" w:w="3211"/>
-            <w:shd w:val="clear" w:color="auto" w:fill="F8FAFC"/>
-            <w:tcBorders>
-              <w:top w:val="single" w:sz="4" w:space="0" w:color="CBD5E1"/>
-              <w:left w:val="single" w:sz="4" w:space="0" w:color="CBD5E1"/>
-              <w:bottom w:val="single" w:sz="4" w:space="0" w:color="CBD5E1"/>
-              <w:right w:val="single" w:sz="4" w:space="0" w:color="CBD5E1"/>
-            </w:tcBorders>
-            <w:tcMar>
-              <w:top w:w="80" w:type="dxa"/>
-              <w:bottom w:w="80" w:type="dxa"/>
-              <w:left w:w="100" w:type="dxa"/>
-              <w:right w:w="100" w:type="dxa"/>
-            </w:tcMar>
-          </w:tcPr>
-          <w:p>
-            <w:pPr>
-              <w:spacing w:before="0" w:after="0"/>
-            </w:pPr>
-            <w:r>
-              <w:rPr>
-                <w:rFonts w:ascii="Segoe UI" w:hAnsi="Segoe UI"/>
-                <w:color w:val="334155"/>
-                <w:sz w:val="17"/>
-              </w:rPr>
-              <w:t>Registro de transportistas de chatarra, clientes mayoristas, talleres o inspectores de tránsito con cédula y empresa de origen.</w:t>
-            </w:r>
-          </w:p>
-        </w:tc>
-        <w:tc>
-          <w:tcPr>
-            <w:tcW w:type="dxa" w:w="3211"/>
-            <w:shd w:val="clear" w:color="auto" w:fill="F8FAFC"/>
-            <w:tcBorders>
-              <w:top w:val="single" w:sz="4" w:space="0" w:color="CBD5E1"/>
-              <w:left w:val="single" w:sz="4" w:space="0" w:color="CBD5E1"/>
-              <w:bottom w:val="single" w:sz="4" w:space="0" w:color="CBD5E1"/>
-              <w:right w:val="single" w:sz="4" w:space="0" w:color="CBD5E1"/>
-            </w:tcBorders>
-            <w:tcMar>
-              <w:top w:w="80" w:type="dxa"/>
-              <w:bottom w:w="80" w:type="dxa"/>
-              <w:left w:w="100" w:type="dxa"/>
-              <w:right w:w="100" w:type="dxa"/>
-            </w:tcMar>
-          </w:tcPr>
-          <w:p>
-            <w:pPr>
-              <w:spacing w:before="0" w:after="0"/>
-            </w:pPr>
-            <w:r>
-              <w:rPr>
-                <w:rFonts w:ascii="Segoe UI" w:hAnsi="Segoe UI"/>
-                <w:color w:val="334155"/>
-                <w:sz w:val="17"/>
-              </w:rPr>
-              <w:t>Control de gafete temporal y asignación del anfitrión responsable dentro de planta.</w:t>
-            </w:r>
-          </w:p>
-        </w:tc>
-      </w:tr>
-      <w:tr>
-        <w:tc>
-          <w:tcPr>
-            <w:tcW w:type="dxa" w:w="3211"/>
-            <w:shd w:val="clear" w:color="auto" w:fill="FFFFFF"/>
-            <w:tcBorders>
-              <w:top w:val="single" w:sz="4" w:space="0" w:color="CBD5E1"/>
-              <w:left w:val="single" w:sz="4" w:space="0" w:color="CBD5E1"/>
-              <w:bottom w:val="single" w:sz="4" w:space="0" w:color="CBD5E1"/>
-              <w:right w:val="single" w:sz="4" w:space="0" w:color="CBD5E1"/>
-            </w:tcBorders>
-            <w:tcMar>
-              <w:top w:w="80" w:type="dxa"/>
-              <w:bottom w:w="80" w:type="dxa"/>
-              <w:left w:w="100" w:type="dxa"/>
-              <w:right w:w="100" w:type="dxa"/>
-            </w:tcMar>
-          </w:tcPr>
-          <w:p>
-            <w:pPr>
-              <w:spacing w:before="0" w:after="0"/>
-            </w:pPr>
-            <w:r>
-              <w:rPr>
-                <w:rFonts w:ascii="Segoe UI" w:hAnsi="Segoe UI"/>
-                <w:b/>
-                <w:color w:val="0F172A"/>
-                <w:sz w:val="17"/>
-              </w:rPr>
-              <w:t>Salida y Recuperación de Gafetes</w:t>
-            </w:r>
-          </w:p>
-        </w:tc>
-        <w:tc>
-          <w:tcPr>
-            <w:tcW w:type="dxa" w:w="3211"/>
-            <w:shd w:val="clear" w:color="auto" w:fill="FFFFFF"/>
-            <w:tcBorders>
-              <w:top w:val="single" w:sz="4" w:space="0" w:color="CBD5E1"/>
-              <w:left w:val="single" w:sz="4" w:space="0" w:color="CBD5E1"/>
-              <w:bottom w:val="single" w:sz="4" w:space="0" w:color="CBD5E1"/>
-              <w:right w:val="single" w:sz="4" w:space="0" w:color="CBD5E1"/>
-            </w:tcBorders>
-            <w:tcMar>
-              <w:top w:w="80" w:type="dxa"/>
-              <w:bottom w:w="80" w:type="dxa"/>
-              <w:left w:w="100" w:type="dxa"/>
-              <w:right w:w="100" w:type="dxa"/>
-            </w:tcMar>
-          </w:tcPr>
-          <w:p>
-            <w:pPr>
-              <w:spacing w:before="0" w:after="0"/>
-            </w:pPr>
-            <w:r>
-              <w:rPr>
-                <w:rFonts w:ascii="Segoe UI" w:hAnsi="Segoe UI"/>
-                <w:color w:val="334155"/>
-                <w:sz w:val="17"/>
-              </w:rPr>
-              <w:t>Fichaje obligatorio de la salida del visitante y liberación del gafete físico.</w:t>
-            </w:r>
-          </w:p>
-        </w:tc>
-        <w:tc>
-          <w:tcPr>
-            <w:tcW w:type="dxa" w:w="3211"/>
-            <w:shd w:val="clear" w:color="auto" w:fill="FFFFFF"/>
-            <w:tcBorders>
-              <w:top w:val="single" w:sz="4" w:space="0" w:color="CBD5E1"/>
-              <w:left w:val="single" w:sz="4" w:space="0" w:color="CBD5E1"/>
-              <w:bottom w:val="single" w:sz="4" w:space="0" w:color="CBD5E1"/>
-              <w:right w:val="single" w:sz="4" w:space="0" w:color="CBD5E1"/>
-            </w:tcBorders>
-            <w:tcMar>
-              <w:top w:w="80" w:type="dxa"/>
-              <w:bottom w:w="80" w:type="dxa"/>
-              <w:left w:w="100" w:type="dxa"/>
-              <w:right w:w="100" w:type="dxa"/>
-            </w:tcMar>
-          </w:tcPr>
-          <w:p>
-            <w:pPr>
-              <w:spacing w:before="0" w:after="0"/>
-            </w:pPr>
-            <w:r>
-              <w:rPr>
-                <w:rFonts w:ascii="Segoe UI" w:hAnsi="Segoe UI"/>
-                <w:color w:val="334155"/>
-                <w:sz w:val="17"/>
-              </w:rPr>
-              <w:t>Cero visitantes perdidos dentro de las instalaciones industriales.</w:t>
-            </w:r>
-          </w:p>
-        </w:tc>
-      </w:tr>
-      <w:tr>
-        <w:tc>
-          <w:tcPr>
-            <w:tcW w:type="dxa" w:w="3211"/>
-            <w:shd w:val="clear" w:color="auto" w:fill="F8FAFC"/>
-            <w:tcBorders>
-              <w:top w:val="single" w:sz="4" w:space="0" w:color="CBD5E1"/>
-              <w:left w:val="single" w:sz="4" w:space="0" w:color="CBD5E1"/>
-              <w:bottom w:val="single" w:sz="4" w:space="0" w:color="CBD5E1"/>
-              <w:right w:val="single" w:sz="4" w:space="0" w:color="CBD5E1"/>
-            </w:tcBorders>
-            <w:tcMar>
-              <w:top w:w="80" w:type="dxa"/>
-              <w:bottom w:w="80" w:type="dxa"/>
-              <w:left w:w="100" w:type="dxa"/>
-              <w:right w:w="100" w:type="dxa"/>
-            </w:tcMar>
-          </w:tcPr>
-          <w:p>
-            <w:pPr>
-              <w:spacing w:before="0" w:after="0"/>
-            </w:pPr>
-            <w:r>
-              <w:rPr>
-                <w:rFonts w:ascii="Segoe UI" w:hAnsi="Segoe UI"/>
-                <w:b/>
-                <w:color w:val="0F172A"/>
-                <w:sz w:val="17"/>
-              </w:rPr>
-              <w:t>Contador de Aforo en Vivo de Planta</w:t>
-            </w:r>
-          </w:p>
-        </w:tc>
-        <w:tc>
-          <w:tcPr>
-            <w:tcW w:type="dxa" w:w="3211"/>
-            <w:shd w:val="clear" w:color="auto" w:fill="F8FAFC"/>
-            <w:tcBorders>
-              <w:top w:val="single" w:sz="4" w:space="0" w:color="CBD5E1"/>
-              <w:left w:val="single" w:sz="4" w:space="0" w:color="CBD5E1"/>
-              <w:bottom w:val="single" w:sz="4" w:space="0" w:color="CBD5E1"/>
-              <w:right w:val="single" w:sz="4" w:space="0" w:color="CBD5E1"/>
-            </w:tcBorders>
-            <w:tcMar>
-              <w:top w:w="80" w:type="dxa"/>
-              <w:bottom w:w="80" w:type="dxa"/>
-              <w:left w:w="100" w:type="dxa"/>
-              <w:right w:w="100" w:type="dxa"/>
-            </w:tcMar>
-          </w:tcPr>
-          <w:p>
-            <w:pPr>
-              <w:spacing w:before="0" w:after="0"/>
-            </w:pPr>
-            <w:r>
-              <w:rPr>
-                <w:rFonts w:ascii="Segoe UI" w:hAnsi="Segoe UI"/>
-                <w:color w:val="334155"/>
-                <w:sz w:val="17"/>
-              </w:rPr>
-              <w:t>Muestra en tiempo real cuántas personas (operarios + administrativos + visitantes) se encuentran adentro.</w:t>
-            </w:r>
-          </w:p>
-        </w:tc>
-        <w:tc>
-          <w:tcPr>
-            <w:tcW w:type="dxa" w:w="3211"/>
-            <w:shd w:val="clear" w:color="auto" w:fill="F8FAFC"/>
-            <w:tcBorders>
-              <w:top w:val="single" w:sz="4" w:space="0" w:color="CBD5E1"/>
-              <w:left w:val="single" w:sz="4" w:space="0" w:color="CBD5E1"/>
-              <w:bottom w:val="single" w:sz="4" w:space="0" w:color="CBD5E1"/>
-              <w:right w:val="single" w:sz="4" w:space="0" w:color="CBD5E1"/>
-            </w:tcBorders>
-            <w:tcMar>
-              <w:top w:w="80" w:type="dxa"/>
-              <w:bottom w:w="80" w:type="dxa"/>
-              <w:left w:w="100" w:type="dxa"/>
-              <w:right w:w="100" w:type="dxa"/>
-            </w:tcMar>
-          </w:tcPr>
-          <w:p>
-            <w:pPr>
-              <w:spacing w:before="0" w:after="0"/>
-            </w:pPr>
-            <w:r>
-              <w:rPr>
-                <w:rFonts w:ascii="Segoe UI" w:hAnsi="Segoe UI"/>
-                <w:color w:val="334155"/>
-                <w:sz w:val="17"/>
-              </w:rPr>
-              <w:t>Vital para planes de evacuación de emergencia y visitas de Bomberos/Cardique.</w:t>
-            </w:r>
-          </w:p>
-        </w:tc>
-      </w:tr>
-    </w:tbl>
-    <w:p>
-      <w:pPr>
-        <w:spacing w:after="80"/>
-      </w:pPr>
     </w:p>
     <w:p>
       <w:pPr>
-        <w:pStyle w:val="Heading1"/>
-        <w:spacing w:before="320" w:after="80"/>
+        <w:spacing w:before="120" w:after="40"/>
+        <w:jc w:val="center"/>
+      </w:pPr>
+      <w:r>
+        <w:drawing>
+          <wp:inline xmlns:a="http://schemas.openxmlformats.org/drawingml/2006/main" xmlns:pic="http://schemas.openxmlformats.org/drawingml/2006/picture">
+            <wp:extent cx="5852160" cy="3657600"/>
+            <wp:docPr id="7" name="Picture 7"/>
+            <wp:cNvGraphicFramePr>
+              <a:graphicFrameLocks noChangeAspect="1"/>
+            </wp:cNvGraphicFramePr>
+            <a:graphic>
+              <a:graphicData uri="http://schemas.openxmlformats.org/drawingml/2006/picture">
+                <pic:pic>
+                  <pic:nvPicPr>
+                    <pic:cNvPr id="0" name="07_Modelo_Entidad_Relacion_ERD_Naranjo.png"/>
+                    <pic:cNvPicPr/>
+                  </pic:nvPicPr>
+                  <pic:blipFill>
+                    <a:blip r:embed="rId17"/>
+                    <a:stretch>
+                      <a:fillRect/>
+                    </a:stretch>
+                  </pic:blipFill>
+                  <pic:spPr>
+                    <a:xfrm>
+                      <a:off x="0" y="0"/>
+                      <a:ext cx="5852160" cy="3657600"/>
+                    </a:xfrm>
+                    <a:prstGeom prst="rect"/>
+                  </pic:spPr>
+                </pic:pic>
+              </a:graphicData>
+            </a:graphic>
+          </wp:inline>
+        </w:drawing>
+      </w:r>
+    </w:p>
+    <w:p>
+      <w:pPr>
+        <w:spacing w:after="200"/>
+        <w:jc w:val="center"/>
+      </w:pPr>
+      <w:r>
+        <w:rPr>
+          <w:rFonts w:ascii="Segoe UI" w:hAnsi="Segoe UI"/>
+          <w:i/>
+          <w:color w:val="EA580C"/>
+          <w:sz w:val="17"/>
+        </w:rPr>
+        <w:t>Figura Oficial: Diagrama 07: Modelo Entidad-Relación (ERD) — Base de Datos Recuperaciones Naranjo (docs/diagramas_naranjo_png/07_Modelo_Entidad_Relacion_ERD_Naranjo.png)</w:t>
+      </w:r>
+    </w:p>
+    <w:p>
+      <w:pPr>
+        <w:pStyle w:val="Heading2"/>
+        <w:spacing w:before="240" w:after="80"/>
       </w:pPr>
       <w:r>
         <w:rPr>
           <w:rFonts w:ascii="Segoe UI" w:hAnsi="Segoe UI"/>
           <w:b/>
-          <w:color w:val="0F172A"/>
-          <w:sz w:val="31"/>
+          <w:color w:val="EA580C"/>
+          <w:sz w:val="24"/>
         </w:rPr>
-        <w:t>6. Resiliencia Operativa: Garita Offline-First ante Cortes de Red</w:t>
+        <w:t>Despliegue Físico de Hardware en Planta Cartagena</w:t>
       </w:r>
-    </w:p>
-    <w:p>
-      <w:pPr>
-        <w:pBdr>
-          <w:bottom w:val="single" w:sz="14" w:space="1" w:color="EA580C"/>
-        </w:pBdr>
-        <w:spacing w:before="40" w:after="160"/>
-      </w:pPr>
     </w:p>
     <w:p>
       <w:pPr>
@@ -2399,7 +4181,7 @@
           <w:color w:val="334155"/>
           <w:sz w:val="19"/>
         </w:rPr>
-        <w:t>En la zona industrial de Cartagena pueden presentarse fluctuaciones eléctricas o caídas temporales del enlace de fibra óptica. El sistema estará blindado bajo una arquitectura Offline-First:</w:t>
+        <w:t>La planta contará con infraestructura protegida contra el clima de Cartagena (alta humedad y calor industrial) y respaldo de energía UPS:</w:t>
       </w:r>
     </w:p>
     <w:p>
@@ -2414,7 +4196,7 @@
           <w:color w:val="0F172A"/>
           <w:sz w:val="18"/>
         </w:rPr>
-        <w:t xml:space="preserve">• Base de Datos Local en el Kiosco (SQLite): </w:t>
+        <w:t xml:space="preserve">• Garita Peatonal: </w:t>
       </w:r>
       <w:r>
         <w:rPr>
@@ -2422,7 +4204,7 @@
           <w:color w:val="334155"/>
           <w:sz w:val="18"/>
         </w:rPr>
-        <w:t>El terminal de garita almacena localmente una réplica cifrada de las cédulas autorizadas y turnos.</w:t>
+        <w:t>Tótem Kiosco Táctil industrial All-in-One de 19", teclado táctil gigante, escáner láser de código de barras y luz estroboscópica verde/roja.</w:t>
       </w:r>
     </w:p>
     <w:p>
@@ -2437,7 +4219,7 @@
           <w:color w:val="0F172A"/>
           <w:sz w:val="18"/>
         </w:rPr>
-        <w:t xml:space="preserve">• Marcación sin Interrupciones en Modo Offline: </w:t>
+        <w:t xml:space="preserve">• Garita Vehicular / Báscula: </w:t>
       </w:r>
       <w:r>
         <w:rPr>
@@ -2445,7 +4227,7 @@
           <w:color w:val="334155"/>
           <w:sz w:val="18"/>
         </w:rPr>
-        <w:t>Si se interrumpe la conexión con el servidor central, el Kiosco pasa automáticamente a 'Modo Local'. Los operarios siguen marcando cédula y el acceso se concede con normalidad.</w:t>
+        <w:t>PC de vigilante con monitor espejo, visualizador de aforo, interfaz de báscula de chatarra y cámaras LPR de placas.</w:t>
       </w:r>
     </w:p>
     <w:p>
@@ -2460,7 +4242,7 @@
           <w:color w:val="0F172A"/>
           <w:sz w:val="18"/>
         </w:rPr>
-        <w:t xml:space="preserve">• Sincronización Automática al Restaurarse la Red: </w:t>
+        <w:t xml:space="preserve">• Garita Offline-First: </w:t>
       </w:r>
       <w:r>
         <w:rPr>
@@ -2468,7 +4250,7 @@
           <w:color w:val="334155"/>
           <w:sz w:val="18"/>
         </w:rPr>
-        <w:t>Cuando se reanuda el enlace, los registros encolados con su hora exacta se sincronizan hacia la base central sin intervención humana.</w:t>
+        <w:t>Base de datos local SQLite que permite seguir marcando normalmente ante cortes de fibra óptica o internet, sincronizando en ráfaga al reanudarse la red.</w:t>
       </w:r>
     </w:p>
     <w:p>
@@ -2491,7 +4273,62 @@
           <w:color w:val="334155"/>
           <w:sz w:val="18"/>
         </w:rPr>
-        <w:t>El Kiosco y la red de garita estarán respaldados por un sistema de alimentación ininterrumpida (UPS) de al menos 4 horas de autonomía.</w:t>
+        <w:t>Autonomía de 4 horas de energía para garita ante apagones o fluctuaciones eléctricas.</w:t>
+      </w:r>
+    </w:p>
+    <w:p>
+      <w:pPr>
+        <w:spacing w:before="120" w:after="40"/>
+        <w:jc w:val="center"/>
+      </w:pPr>
+      <w:r>
+        <w:drawing>
+          <wp:inline xmlns:a="http://schemas.openxmlformats.org/drawingml/2006/main" xmlns:pic="http://schemas.openxmlformats.org/drawingml/2006/picture">
+            <wp:extent cx="5852160" cy="3657600"/>
+            <wp:docPr id="8" name="Picture 8"/>
+            <wp:cNvGraphicFramePr>
+              <a:graphicFrameLocks noChangeAspect="1"/>
+            </wp:cNvGraphicFramePr>
+            <a:graphic>
+              <a:graphicData uri="http://schemas.openxmlformats.org/drawingml/2006/picture">
+                <pic:pic>
+                  <pic:nvPicPr>
+                    <pic:cNvPr id="0" name="08_Despliegue_Hardware_Red_Planta_Cartagena.png"/>
+                    <pic:cNvPicPr/>
+                  </pic:nvPicPr>
+                  <pic:blipFill>
+                    <a:blip r:embed="rId18"/>
+                    <a:stretch>
+                      <a:fillRect/>
+                    </a:stretch>
+                  </pic:blipFill>
+                  <pic:spPr>
+                    <a:xfrm>
+                      <a:off x="0" y="0"/>
+                      <a:ext cx="5852160" cy="3657600"/>
+                    </a:xfrm>
+                    <a:prstGeom prst="rect"/>
+                  </pic:spPr>
+                </pic:pic>
+              </a:graphicData>
+            </a:graphic>
+          </wp:inline>
+        </w:drawing>
+      </w:r>
+    </w:p>
+    <w:p>
+      <w:pPr>
+        <w:spacing w:after="200"/>
+        <w:jc w:val="center"/>
+      </w:pPr>
+      <w:r>
+        <w:rPr>
+          <w:rFonts w:ascii="Segoe UI" w:hAnsi="Segoe UI"/>
+          <w:i/>
+          <w:color w:val="EA580C"/>
+          <w:sz w:val="17"/>
+        </w:rPr>
+        <w:t>Figura Oficial: Diagrama 08: Despliegue Físico de Hardware y Red — Planta Recuperaciones Naranjo (docs/diagramas_naranjo_png/08_Despliegue_Hardware_Red_Planta_Cartagena.png)</w:t>
       </w:r>
     </w:p>
     <w:p>
@@ -2655,7 +4492,7 @@
                 <w:color w:val="0F172A"/>
                 <w:sz w:val="17"/>
               </w:rPr>
-              <w:t>Semana 1: Identidad y Padrón Naranjo</w:t>
+              <w:t>Semana 1: Configuración Horario 42h y Padrón</w:t>
             </w:r>
           </w:p>
         </w:tc>
@@ -2686,11 +4523,11 @@
                 <w:color w:val="334155"/>
                 <w:sz w:val="17"/>
               </w:rPr>
-              <w:t>• Personalización de marca (logos, colores naranja/acero, textos Recuperaciones Naranjo Cartagena).</w:t>
+              <w:t>• Parametrización del horario oficial Lunes a Viernes (L 8:00–16:30, M/V 7:30–17:00, M/J 7:30–17:30).</w:t>
               <w:br/>
-              <w:t>• Carga del padrón inicial de trabajadores con cédulas colombianas.</w:t>
+              <w:t>• Carga del padrón de colaboradores con Cédulas de Ciudadanía.</w:t>
               <w:br/>
-              <w:t>• Configuración de turnos de planta.</w:t>
+              <w:t>• Definición de cargos de Patio y Administración.</w:t>
             </w:r>
           </w:p>
         </w:tc>
@@ -2721,7 +4558,7 @@
                 <w:color w:val="334155"/>
                 <w:sz w:val="17"/>
               </w:rPr>
-              <w:t>Sistema parametrizado con los datos reales de Recuperaciones Naranjo.</w:t>
+              <w:t>Base de datos inicial parametrizada con los horarios y empleados reales de Naranjo.</w:t>
             </w:r>
           </w:p>
         </w:tc>
@@ -2788,9 +4625,9 @@
               </w:rPr>
               <w:t>• Desarrollo de la interfaz táctil con teclado numérico gigante.</w:t>
               <w:br/>
-              <w:t>• Integración de sonidos de aprobación y alerta.</w:t>
+              <w:t>• Integración de escáner de código de barras (PDF417).</w:t>
               <w:br/>
-              <w:t>• Algoritmo de cálculo de puntualidad y anti-passback en tiempo real.</w:t>
+              <w:t>• Algoritmo de cálculo de puntualidad (10 min tolerancia) y Anti-Passback.</w:t>
             </w:r>
           </w:p>
         </w:tc>
@@ -2821,7 +4658,7 @@
                 <w:color w:val="334155"/>
                 <w:sz w:val="17"/>
               </w:rPr>
-              <w:t>Kiosco táctil operativo para pruebas en portería.</w:t>
+              <w:t>Kiosco táctil operativo en garita para pruebas de marcación de operarios.</w:t>
             </w:r>
           </w:p>
         </w:tc>
@@ -2855,7 +4692,7 @@
                 <w:color w:val="0F172A"/>
                 <w:sz w:val="17"/>
               </w:rPr>
-              <w:t>Semana 3: Portal del Jefe y Nómina Colombia</w:t>
+              <w:t>Semana 3: Portal del Jefe de Patio y Nómina</w:t>
             </w:r>
           </w:p>
         </w:tc>
@@ -2886,11 +4723,11 @@
                 <w:color w:val="334155"/>
                 <w:sz w:val="17"/>
               </w:rPr>
-              <w:t>• Construcción del portal 'Mi Cuadrilla en Vivo' para supervisores de patio.</w:t>
+              <w:t>• Construcción del portal móvil 'Mi Cuadrilla en Vivo' para supervisores de patio.</w:t>
               <w:br/>
-              <w:t>• Motor de cálculo de horas extras diurnas, nocturnas y festivos colombianos.</w:t>
+              <w:t>• Alertas de puestos críticos a 15 min.</w:t>
               <w:br/>
-              <w:t>• Exportador a Excel para el departamento contable.</w:t>
+              <w:t>• Módulo de autorización de horas extras de sábado/domingo y exportador a Excel.</w:t>
             </w:r>
           </w:p>
         </w:tc>
@@ -2921,7 +4758,7 @@
                 <w:color w:val="334155"/>
                 <w:sz w:val="17"/>
               </w:rPr>
-              <w:t>Dashboard de supervisores y reportes de nómina activos.</w:t>
+              <w:t>Dashboard de supervisores activo y reportes de horas ordinarias/extras listos.</w:t>
             </w:r>
           </w:p>
         </w:tc>
@@ -2955,7 +4792,7 @@
                 <w:color w:val="0F172A"/>
                 <w:sz w:val="17"/>
               </w:rPr>
-              <w:t>Semana 4: Pruebas Piloto y Despliegue en Planta</w:t>
+              <w:t>Semana 4: Pruebas Piloto y Salida a Producción</w:t>
             </w:r>
           </w:p>
         </w:tc>
@@ -2986,9 +4823,9 @@
                 <w:color w:val="334155"/>
                 <w:sz w:val="17"/>
               </w:rPr>
-              <w:t>• Instalación del Kiosco en la garita de Cartagena.</w:t>
+              <w:t>• Instalación del hardware en la garita peatonal de Cartagena.</w:t>
               <w:br/>
-              <w:t>• Capacitación de 1 hora al personal de vigilancia.</w:t>
+              <w:t>• Capacitación de 1 hora al personal de vigilancia y supervisores.</w:t>
               <w:br/>
               <w:t>• Marcha blanca y salida a producción oficial.</w:t>
             </w:r>
@@ -3021,7 +4858,7 @@
                 <w:color w:val="334155"/>
                 <w:sz w:val="17"/>
               </w:rPr>
-              <w:t>Planta de Cartagena operando con control de acceso sistematizado.</w:t>
+              <w:t>Planta de Cartagena operando al 100% con control de acceso digitalizado.</w:t>
             </w:r>
           </w:p>
         </w:tc>
@@ -3031,42 +4868,6 @@
       <w:pPr>
         <w:spacing w:after="80"/>
       </w:pPr>
-    </w:p>
-    <w:p>
-      <w:pPr>
-        <w:pStyle w:val="Heading1"/>
-        <w:spacing w:before="320" w:after="80"/>
-      </w:pPr>
-      <w:r>
-        <w:rPr>
-          <w:rFonts w:ascii="Segoe UI" w:hAnsi="Segoe UI"/>
-          <w:b/>
-          <w:color w:val="0F172A"/>
-          <w:sz w:val="31"/>
-        </w:rPr>
-        <w:t>8. Conclusiones y Próximos Pasos</w:t>
-      </w:r>
-    </w:p>
-    <w:p>
-      <w:pPr>
-        <w:pBdr>
-          <w:bottom w:val="single" w:sz="14" w:space="1" w:color="EA580C"/>
-        </w:pBdr>
-        <w:spacing w:before="40" w:after="160"/>
-      </w:pPr>
-    </w:p>
-    <w:p>
-      <w:pPr>
-        <w:spacing w:before="40" w:after="120" w:line="276" w:lineRule="auto"/>
-      </w:pPr>
-      <w:r>
-        <w:rPr>
-          <w:rFonts w:ascii="Segoe UI" w:hAnsi="Segoe UI"/>
-          <w:color w:val="334155"/>
-          <w:sz w:val="19"/>
-        </w:rPr>
-        <w:t>La adaptación de SentinelPro IAM a la realidad operativa de Recuperaciones Naranjo S.A.S. en Cartagena de Indias transformará la gestión del talento humano y la seguridad de la planta. Se eliminarán los registros manuales en papel, se obtendrá precisión al minuto en el pago de jornadas y horas extras, y los directores de patio dispondrán de una herramienta tecnológica de primer nivel para dirigir sus cuadrillas. El sistema es escalable, modular y 100% propietario.</w:t>
-      </w:r>
     </w:p>
     <w:sectPr>
       <w:headerReference w:type="default" r:id="rId9"/>
@@ -3092,7 +4893,7 @@
         <w:color w:val="64748B"/>
         <w:sz w:val="17"/>
       </w:rPr>
-      <w:t xml:space="preserve">Recuperaciones Naranjo S.A.S.  |  Ingeniería de Software &amp; Planta Industrial  |  Página </w:t>
+      <w:t xml:space="preserve">Recuperaciones Naranjo S.A.S.  |  Control de Acceso, Horario 42h y Patio  |  Página </w:t>
     </w:r>
     <w:r>
       <w:rPr>
@@ -3137,7 +4938,7 @@
         <w:color w:val="64748B"/>
         <w:sz w:val="16"/>
       </w:rPr>
-      <w:t>Recuperaciones Naranjo S.A.S. — Sistema de Control de Acceso, Asistencia y Portería (Cartagena)</w:t>
+      <w:t>Recuperaciones Naranjo Recycling S.A.S. — Sistema de Control de Acceso y Asistencia 42h (Cartagena)</w:t>
     </w:r>
   </w:p>
 </w:hdr>

</xml_diff>

<commit_message>
feat(naranjo): incorporar cargos de maquinaria pesada (pulpos, montacargas), mecanico, ayudantes de patio, contabilidad y SENA
</commit_message>
<xml_diff>
--- a/Plan_Sistema_Acceso_Recuperaciones_Naranjo_Cartagena.docx
+++ b/Plan_Sistema_Acceso_Recuperaciones_Naranjo_Cartagena.docx
@@ -53,7 +53,7 @@
           <w:color w:val="334155"/>
           <w:sz w:val="19"/>
         </w:rPr>
-        <w:t>Sede Industrial Cartagena de Indias (Bolívar, Colombia) — Solución especializada para el registro ágil de ingreso y salida de operarios mediante Cédula de Ciudadanía en Pantalla Kiosco Táctil, Horario Oficial Lunes a Viernes de 42 Horas Semanales (según Memorando Corporativo y Ley 2101 / CST), Gestión de Jornadas Extraordinarias de Patio en Sábados, Domingos y Festivos, Monitoreo de Cuadrilla en Vivo para Jefes de Patio, Pre-Liquidación de Nómina para Gestión Humana y Modo Garita Offline-First.</w:t>
+        <w:t>Sede Industrial Cartagena de Indias (Bolívar, Colombia) — Solución especializada para el registro de entrada y salida de operarios mediante Cédula de Ciudadanía en Pantalla Kiosco Táctil, Horario Oficial Lunes a Viernes de 42 Horas Semanales (según Memorando Corporativo y Ley 2101 / CST), Gestión de Cargos de Patio (Jefe de Patio, 2 Grúas Pulpo, 1 Montacargas, Mecánico de Planta, Ayudantes de Patio y Oxigenistas), Administración (Contadores, Auxiliar Contable, Auxiliares Administrativos y Aprendices SENA), Monitoreo de Cuadrilla en Vivo, Pre-Liquidación de Nómina y Modo Garita Offline-First.</w:t>
       </w:r>
     </w:p>
     <w:tbl>
@@ -421,6 +421,136 @@
                 <w:color w:val="0F172A"/>
                 <w:sz w:val="17"/>
               </w:rPr>
+              <w:t>Cargos Operativos de Patio</w:t>
+            </w:r>
+          </w:p>
+        </w:tc>
+        <w:tc>
+          <w:tcPr>
+            <w:tcW w:type="dxa" w:w="4816"/>
+            <w:shd w:val="clear" w:color="auto" w:fill="FFFFFF"/>
+            <w:tcBorders>
+              <w:top w:val="single" w:sz="4" w:space="0" w:color="CBD5E1"/>
+              <w:left w:val="single" w:sz="4" w:space="0" w:color="CBD5E1"/>
+              <w:bottom w:val="single" w:sz="4" w:space="0" w:color="CBD5E1"/>
+              <w:right w:val="single" w:sz="4" w:space="0" w:color="CBD5E1"/>
+            </w:tcBorders>
+            <w:tcMar>
+              <w:top w:w="80" w:type="dxa"/>
+              <w:bottom w:w="80" w:type="dxa"/>
+              <w:left w:w="100" w:type="dxa"/>
+              <w:right w:w="100" w:type="dxa"/>
+            </w:tcMar>
+          </w:tcPr>
+          <w:p>
+            <w:pPr>
+              <w:spacing w:before="0" w:after="0"/>
+            </w:pPr>
+            <w:r>
+              <w:rPr>
+                <w:rFonts w:ascii="Segoe UI" w:hAnsi="Segoe UI"/>
+                <w:color w:val="334155"/>
+                <w:sz w:val="17"/>
+              </w:rPr>
+              <w:t>Jefe de Patio, Operador Grúa Pulpo #1, Operador Grúa Pulpo #2, Operador Montacargas, Mecánico de Planta, Ayudantes de Patio, Oxigenistas</w:t>
+            </w:r>
+          </w:p>
+        </w:tc>
+      </w:tr>
+      <w:tr>
+        <w:tc>
+          <w:tcPr>
+            <w:tcW w:type="dxa" w:w="4816"/>
+            <w:shd w:val="clear" w:color="auto" w:fill="F8FAFC"/>
+            <w:tcBorders>
+              <w:top w:val="single" w:sz="4" w:space="0" w:color="CBD5E1"/>
+              <w:left w:val="single" w:sz="4" w:space="0" w:color="CBD5E1"/>
+              <w:bottom w:val="single" w:sz="4" w:space="0" w:color="CBD5E1"/>
+              <w:right w:val="single" w:sz="4" w:space="0" w:color="CBD5E1"/>
+            </w:tcBorders>
+            <w:tcMar>
+              <w:top w:w="80" w:type="dxa"/>
+              <w:bottom w:w="80" w:type="dxa"/>
+              <w:left w:w="100" w:type="dxa"/>
+              <w:right w:w="100" w:type="dxa"/>
+            </w:tcMar>
+          </w:tcPr>
+          <w:p>
+            <w:pPr>
+              <w:spacing w:before="0" w:after="0"/>
+            </w:pPr>
+            <w:r>
+              <w:rPr>
+                <w:rFonts w:ascii="Segoe UI" w:hAnsi="Segoe UI"/>
+                <w:b/>
+                <w:color w:val="0F172A"/>
+                <w:sz w:val="17"/>
+              </w:rPr>
+              <w:t>Cargos Administrativos</w:t>
+            </w:r>
+          </w:p>
+        </w:tc>
+        <w:tc>
+          <w:tcPr>
+            <w:tcW w:type="dxa" w:w="4816"/>
+            <w:shd w:val="clear" w:color="auto" w:fill="F8FAFC"/>
+            <w:tcBorders>
+              <w:top w:val="single" w:sz="4" w:space="0" w:color="CBD5E1"/>
+              <w:left w:val="single" w:sz="4" w:space="0" w:color="CBD5E1"/>
+              <w:bottom w:val="single" w:sz="4" w:space="0" w:color="CBD5E1"/>
+              <w:right w:val="single" w:sz="4" w:space="0" w:color="CBD5E1"/>
+            </w:tcBorders>
+            <w:tcMar>
+              <w:top w:w="80" w:type="dxa"/>
+              <w:bottom w:w="80" w:type="dxa"/>
+              <w:left w:w="100" w:type="dxa"/>
+              <w:right w:w="100" w:type="dxa"/>
+            </w:tcMar>
+          </w:tcPr>
+          <w:p>
+            <w:pPr>
+              <w:spacing w:before="0" w:after="0"/>
+            </w:pPr>
+            <w:r>
+              <w:rPr>
+                <w:rFonts w:ascii="Segoe UI" w:hAnsi="Segoe UI"/>
+                <w:color w:val="334155"/>
+                <w:sz w:val="17"/>
+              </w:rPr>
+              <w:t>Contadores, Auxiliar Contable, Auxiliares Administrativos, Auxiliares SENA (Aprendices en etapa lectiva/productiva)</w:t>
+            </w:r>
+          </w:p>
+        </w:tc>
+      </w:tr>
+      <w:tr>
+        <w:tc>
+          <w:tcPr>
+            <w:tcW w:type="dxa" w:w="4816"/>
+            <w:shd w:val="clear" w:color="auto" w:fill="FFFFFF"/>
+            <w:tcBorders>
+              <w:top w:val="single" w:sz="4" w:space="0" w:color="CBD5E1"/>
+              <w:left w:val="single" w:sz="4" w:space="0" w:color="CBD5E1"/>
+              <w:bottom w:val="single" w:sz="4" w:space="0" w:color="CBD5E1"/>
+              <w:right w:val="single" w:sz="4" w:space="0" w:color="CBD5E1"/>
+            </w:tcBorders>
+            <w:tcMar>
+              <w:top w:w="80" w:type="dxa"/>
+              <w:bottom w:w="80" w:type="dxa"/>
+              <w:left w:w="100" w:type="dxa"/>
+              <w:right w:w="100" w:type="dxa"/>
+            </w:tcMar>
+          </w:tcPr>
+          <w:p>
+            <w:pPr>
+              <w:spacing w:before="0" w:after="0"/>
+            </w:pPr>
+            <w:r>
+              <w:rPr>
+                <w:rFonts w:ascii="Segoe UI" w:hAnsi="Segoe UI"/>
+                <w:b/>
+                <w:color w:val="0F172A"/>
+                <w:sz w:val="17"/>
+              </w:rPr>
               <w:t>Régimen Fin de Semana (Patio)</w:t>
             </w:r>
           </w:p>
@@ -582,7 +712,7 @@
                 <w:color w:val="334155"/>
                 <w:sz w:val="17"/>
               </w:rPr>
-              <w:t>Tablero Móvil y Web 'Mi Cuadrilla en Vivo' (Presentes, Tardanzas, Ausentes y Alertas a 15 min)</w:t>
+              <w:t>Tablero Móvil 'Mi Cuadrilla en Vivo' con semáforo y alertas de puestos críticos de maquinaria a los 15 min</w:t>
             </w:r>
           </w:p>
         </w:tc>
@@ -616,7 +746,7 @@
                 <w:color w:val="0F172A"/>
                 <w:sz w:val="17"/>
               </w:rPr>
-              <w:t>Consola de Vigilante y Aforo</w:t>
+              <w:t>Continuidad de Servicio</w:t>
             </w:r>
           </w:p>
         </w:tc>
@@ -647,7 +777,7 @@
                 <w:color w:val="334155"/>
                 <w:sz w:val="17"/>
               </w:rPr>
-              <w:t>Monitor espejo con foto del colaborador, registro de camiones de chatarra/báscula y aforo en vivo</w:t>
+              <w:t>Arquitectura Garita Offline-First con base de datos local SQLite y respaldo de energía UPS</w:t>
             </w:r>
           </w:p>
         </w:tc>
@@ -681,7 +811,7 @@
                 <w:color w:val="0F172A"/>
                 <w:sz w:val="17"/>
               </w:rPr>
-              <w:t>Continuidad de Servicio</w:t>
+              <w:t>Fecha de Formulación</w:t>
             </w:r>
           </w:p>
         </w:tc>
@@ -689,71 +819,6 @@
           <w:tcPr>
             <w:tcW w:type="dxa" w:w="4816"/>
             <w:shd w:val="clear" w:color="auto" w:fill="FFFFFF"/>
-            <w:tcBorders>
-              <w:top w:val="single" w:sz="4" w:space="0" w:color="CBD5E1"/>
-              <w:left w:val="single" w:sz="4" w:space="0" w:color="CBD5E1"/>
-              <w:bottom w:val="single" w:sz="4" w:space="0" w:color="CBD5E1"/>
-              <w:right w:val="single" w:sz="4" w:space="0" w:color="CBD5E1"/>
-            </w:tcBorders>
-            <w:tcMar>
-              <w:top w:w="80" w:type="dxa"/>
-              <w:bottom w:w="80" w:type="dxa"/>
-              <w:left w:w="100" w:type="dxa"/>
-              <w:right w:w="100" w:type="dxa"/>
-            </w:tcMar>
-          </w:tcPr>
-          <w:p>
-            <w:pPr>
-              <w:spacing w:before="0" w:after="0"/>
-            </w:pPr>
-            <w:r>
-              <w:rPr>
-                <w:rFonts w:ascii="Segoe UI" w:hAnsi="Segoe UI"/>
-                <w:color w:val="334155"/>
-                <w:sz w:val="17"/>
-              </w:rPr>
-              <w:t>Arquitectura Garita Offline-First con base de datos local SQLite y respaldo de energía UPS</w:t>
-            </w:r>
-          </w:p>
-        </w:tc>
-      </w:tr>
-      <w:tr>
-        <w:tc>
-          <w:tcPr>
-            <w:tcW w:type="dxa" w:w="4816"/>
-            <w:shd w:val="clear" w:color="auto" w:fill="F8FAFC"/>
-            <w:tcBorders>
-              <w:top w:val="single" w:sz="4" w:space="0" w:color="CBD5E1"/>
-              <w:left w:val="single" w:sz="4" w:space="0" w:color="CBD5E1"/>
-              <w:bottom w:val="single" w:sz="4" w:space="0" w:color="CBD5E1"/>
-              <w:right w:val="single" w:sz="4" w:space="0" w:color="CBD5E1"/>
-            </w:tcBorders>
-            <w:tcMar>
-              <w:top w:w="80" w:type="dxa"/>
-              <w:bottom w:w="80" w:type="dxa"/>
-              <w:left w:w="100" w:type="dxa"/>
-              <w:right w:w="100" w:type="dxa"/>
-            </w:tcMar>
-          </w:tcPr>
-          <w:p>
-            <w:pPr>
-              <w:spacing w:before="0" w:after="0"/>
-            </w:pPr>
-            <w:r>
-              <w:rPr>
-                <w:rFonts w:ascii="Segoe UI" w:hAnsi="Segoe UI"/>
-                <w:b/>
-                <w:color w:val="0F172A"/>
-                <w:sz w:val="17"/>
-              </w:rPr>
-              <w:t>Fecha de Formulación</w:t>
-            </w:r>
-          </w:p>
-        </w:tc>
-        <w:tc>
-          <w:tcPr>
-            <w:tcW w:type="dxa" w:w="4816"/>
-            <w:shd w:val="clear" w:color="auto" w:fill="F8FAFC"/>
             <w:tcBorders>
               <w:top w:val="single" w:sz="4" w:space="0" w:color="CBD5E1"/>
               <w:left w:val="single" w:sz="4" w:space="0" w:color="CBD5E1"/>
@@ -826,7 +891,7 @@
           <w:color w:val="334155"/>
           <w:sz w:val="19"/>
         </w:rPr>
-        <w:t>Recuperaciones Naranjo Recycling S.A.S. es una empresa líder en la recuperación ambiental de metales ferrosos y no ferrosos, chatarrización pesada y desintegración vehicular en Cartagena de Indias. Las instalaciones de la planta combinan el ingreso continuo de vehículos de carga pesada (tractomulas, camiones recolectores) con el flujo de personal operativo de patio (clasificadores, oxigenistas, choferes de grúa/retroexcavadora) y personal administrativo. La automatización del control de acceso garantiza exactitud en el pago de nómina, control de aforo para SST/ARL y supervisión en tiempo real de cuadrillas.</w:t>
+        <w:t>Recuperaciones Naranjo Recycling S.A.S. es una empresa líder en la recuperación ambiental de metales ferrosos y no ferrosos, chatarrización pesada y desintegración vehicular en Cartagena de Indias. Las instalaciones de la planta combinan el ingreso continuo de vehículos de carga pesada (tractomulas, camiones recolectores) con el flujo de personal operativo de patio (operadores de grúas pulpo, montacargas, mecánicos de mantenimiento, oxigenistas y ayudantes de clasificación) y el equipo administrativo (contadores, auxiliares contables, administrativos y aprendices SENA). La automatización del control de acceso garantiza exactitud en el pago de nómina, control de aforo para SST/ARL y supervisión en tiempo real de cuadrillas.</w:t>
       </w:r>
     </w:p>
     <w:tbl>
@@ -876,7 +941,7 @@
                 <w:color w:val="334155"/>
                 <w:sz w:val="18"/>
               </w:rPr>
-              <w:t>Permitir que todo operario y colaborador que ingrese a las instalaciones de Recuperaciones Naranjo en Cartagena registre su entrada y salida en menos de 1 segundo mediante su Cédula de Ciudadanía en una pantalla táctil industrial, controlando la puntualidad frente al horario oficial de 42 horas semanales, informando en tiempo real al jefe de patio sobre la disponibilidad de su equipo y suministrando a Gestión Humana la pre-liquidación exacta de horas extras y recargos.</w:t>
+              <w:t>Permitir que todo operario y colaborador que ingrese a las instalaciones de Recuperaciones Naranjo en Cartagena registre su entrada y salida en menos de 1 segundo mediante su Cédula de Ciudadanía en una pantalla táctil industrial, controlando la puntualidad frente al horario oficial de 42 horas semanales, informando en tiempo real al jefe de patio sobre la disponibilidad de sus operadores de maquinaria y suministrando a Gestión Humana la pre-liquidación exacta de horas extras y recargos.</w:t>
             </w:r>
           </w:p>
         </w:tc>
@@ -954,7 +1019,2655 @@
           <w:color w:val="0F172A"/>
           <w:sz w:val="31"/>
         </w:rPr>
-        <w:t>2. Horario Laboral Oficial de la Empresa (Memorando Septiembre 2026)</w:t>
+        <w:t>2. Estructura Organizacional, Cargos y Perfiles Operativos</w:t>
+      </w:r>
+    </w:p>
+    <w:p>
+      <w:pPr>
+        <w:pBdr>
+          <w:bottom w:val="single" w:sz="14" w:space="1" w:color="EA580C"/>
+        </w:pBdr>
+        <w:spacing w:before="40" w:after="160"/>
+      </w:pPr>
+    </w:p>
+    <w:p>
+      <w:pPr>
+        <w:spacing w:before="40" w:after="120" w:line="276" w:lineRule="auto"/>
+      </w:pPr>
+      <w:r>
+        <w:rPr>
+          <w:rFonts w:ascii="Segoe UI" w:hAnsi="Segoe UI"/>
+          <w:color w:val="334155"/>
+          <w:sz w:val="19"/>
+        </w:rPr>
+        <w:t>El sistema parametriza de forma diferenciada las dos grandes áreas de la empresa, reconociendo las responsabilidades, niveles de criticidad y dinámicas horarias de cada cargo:</w:t>
+      </w:r>
+    </w:p>
+    <w:tbl>
+      <w:tblPr>
+        <w:tblW w:type="auto" w:w="0"/>
+        <w:jc w:val="center"/>
+        <w:tblLook w:firstColumn="1" w:firstRow="1" w:lastColumn="0" w:lastRow="0" w:noHBand="0" w:noVBand="1" w:val="04A0"/>
+      </w:tblPr>
+      <w:tblGrid>
+        <w:gridCol w:w="1605"/>
+        <w:gridCol w:w="1605"/>
+        <w:gridCol w:w="1605"/>
+        <w:gridCol w:w="1605"/>
+        <w:gridCol w:w="1605"/>
+        <w:gridCol w:w="1605"/>
+      </w:tblGrid>
+      <w:tr>
+        <w:tc>
+          <w:tcPr>
+            <w:tcW w:type="dxa" w:w="1605"/>
+            <w:shd w:val="clear" w:color="auto" w:fill="1E293B"/>
+            <w:tcBorders>
+              <w:top w:val="single" w:sz="6" w:space="0" w:color="334155"/>
+              <w:left w:val="single" w:sz="6" w:space="0" w:color="334155"/>
+              <w:bottom w:val="single" w:sz="6" w:space="0" w:color="334155"/>
+              <w:right w:val="single" w:sz="6" w:space="0" w:color="334155"/>
+            </w:tcBorders>
+            <w:tcMar>
+              <w:top w:w="90" w:type="dxa"/>
+              <w:bottom w:w="90" w:type="dxa"/>
+              <w:left w:w="110" w:type="dxa"/>
+              <w:right w:w="110" w:type="dxa"/>
+            </w:tcMar>
+          </w:tcPr>
+          <w:p>
+            <w:pPr>
+              <w:spacing w:before="0" w:after="0"/>
+            </w:pPr>
+            <w:r>
+              <w:rPr>
+                <w:rFonts w:ascii="Segoe UI" w:hAnsi="Segoe UI"/>
+                <w:b/>
+                <w:color w:val="FFFFFF"/>
+                <w:sz w:val="18"/>
+              </w:rPr>
+              <w:t>Área / Departamento</w:t>
+            </w:r>
+          </w:p>
+        </w:tc>
+        <w:tc>
+          <w:tcPr>
+            <w:tcW w:type="dxa" w:w="1605"/>
+            <w:shd w:val="clear" w:color="auto" w:fill="1E293B"/>
+            <w:tcBorders>
+              <w:top w:val="single" w:sz="6" w:space="0" w:color="334155"/>
+              <w:left w:val="single" w:sz="6" w:space="0" w:color="334155"/>
+              <w:bottom w:val="single" w:sz="6" w:space="0" w:color="334155"/>
+              <w:right w:val="single" w:sz="6" w:space="0" w:color="334155"/>
+            </w:tcBorders>
+            <w:tcMar>
+              <w:top w:w="90" w:type="dxa"/>
+              <w:bottom w:w="90" w:type="dxa"/>
+              <w:left w:w="110" w:type="dxa"/>
+              <w:right w:w="110" w:type="dxa"/>
+            </w:tcMar>
+          </w:tcPr>
+          <w:p>
+            <w:pPr>
+              <w:spacing w:before="0" w:after="0"/>
+            </w:pPr>
+            <w:r>
+              <w:rPr>
+                <w:rFonts w:ascii="Segoe UI" w:hAnsi="Segoe UI"/>
+                <w:b/>
+                <w:color w:val="FFFFFF"/>
+                <w:sz w:val="18"/>
+              </w:rPr>
+              <w:t>Cargo Oficial</w:t>
+            </w:r>
+          </w:p>
+        </w:tc>
+        <w:tc>
+          <w:tcPr>
+            <w:tcW w:type="dxa" w:w="1605"/>
+            <w:shd w:val="clear" w:color="auto" w:fill="1E293B"/>
+            <w:tcBorders>
+              <w:top w:val="single" w:sz="6" w:space="0" w:color="334155"/>
+              <w:left w:val="single" w:sz="6" w:space="0" w:color="334155"/>
+              <w:bottom w:val="single" w:sz="6" w:space="0" w:color="334155"/>
+              <w:right w:val="single" w:sz="6" w:space="0" w:color="334155"/>
+            </w:tcBorders>
+            <w:tcMar>
+              <w:top w:w="90" w:type="dxa"/>
+              <w:bottom w:w="90" w:type="dxa"/>
+              <w:left w:w="110" w:type="dxa"/>
+              <w:right w:w="110" w:type="dxa"/>
+            </w:tcMar>
+          </w:tcPr>
+          <w:p>
+            <w:pPr>
+              <w:spacing w:before="0" w:after="0"/>
+            </w:pPr>
+            <w:r>
+              <w:rPr>
+                <w:rFonts w:ascii="Segoe UI" w:hAnsi="Segoe UI"/>
+                <w:b/>
+                <w:color w:val="FFFFFF"/>
+                <w:sz w:val="18"/>
+              </w:rPr>
+              <w:t>Tipo de Personal</w:t>
+            </w:r>
+          </w:p>
+        </w:tc>
+        <w:tc>
+          <w:tcPr>
+            <w:tcW w:type="dxa" w:w="1605"/>
+            <w:shd w:val="clear" w:color="auto" w:fill="1E293B"/>
+            <w:tcBorders>
+              <w:top w:val="single" w:sz="6" w:space="0" w:color="334155"/>
+              <w:left w:val="single" w:sz="6" w:space="0" w:color="334155"/>
+              <w:bottom w:val="single" w:sz="6" w:space="0" w:color="334155"/>
+              <w:right w:val="single" w:sz="6" w:space="0" w:color="334155"/>
+            </w:tcBorders>
+            <w:tcMar>
+              <w:top w:w="90" w:type="dxa"/>
+              <w:bottom w:w="90" w:type="dxa"/>
+              <w:left w:w="110" w:type="dxa"/>
+              <w:right w:w="110" w:type="dxa"/>
+            </w:tcMar>
+          </w:tcPr>
+          <w:p>
+            <w:pPr>
+              <w:spacing w:before="0" w:after="0"/>
+            </w:pPr>
+            <w:r>
+              <w:rPr>
+                <w:rFonts w:ascii="Segoe UI" w:hAnsi="Segoe UI"/>
+                <w:b/>
+                <w:color w:val="FFFFFF"/>
+                <w:sz w:val="18"/>
+              </w:rPr>
+              <w:t>Puesto Crítico</w:t>
+            </w:r>
+          </w:p>
+        </w:tc>
+        <w:tc>
+          <w:tcPr>
+            <w:tcW w:type="dxa" w:w="1605"/>
+            <w:shd w:val="clear" w:color="auto" w:fill="1E293B"/>
+            <w:tcBorders>
+              <w:top w:val="single" w:sz="6" w:space="0" w:color="334155"/>
+              <w:left w:val="single" w:sz="6" w:space="0" w:color="334155"/>
+              <w:bottom w:val="single" w:sz="6" w:space="0" w:color="334155"/>
+              <w:right w:val="single" w:sz="6" w:space="0" w:color="334155"/>
+            </w:tcBorders>
+            <w:tcMar>
+              <w:top w:w="90" w:type="dxa"/>
+              <w:bottom w:w="90" w:type="dxa"/>
+              <w:left w:w="110" w:type="dxa"/>
+              <w:right w:w="110" w:type="dxa"/>
+            </w:tcMar>
+          </w:tcPr>
+          <w:p>
+            <w:pPr>
+              <w:spacing w:before="0" w:after="0"/>
+            </w:pPr>
+            <w:r>
+              <w:rPr>
+                <w:rFonts w:ascii="Segoe UI" w:hAnsi="Segoe UI"/>
+                <w:b/>
+                <w:color w:val="FFFFFF"/>
+                <w:sz w:val="18"/>
+              </w:rPr>
+              <w:t>Jornada y Horario Base</w:t>
+            </w:r>
+          </w:p>
+        </w:tc>
+        <w:tc>
+          <w:tcPr>
+            <w:tcW w:type="dxa" w:w="1605"/>
+            <w:shd w:val="clear" w:color="auto" w:fill="1E293B"/>
+            <w:tcBorders>
+              <w:top w:val="single" w:sz="6" w:space="0" w:color="334155"/>
+              <w:left w:val="single" w:sz="6" w:space="0" w:color="334155"/>
+              <w:bottom w:val="single" w:sz="6" w:space="0" w:color="334155"/>
+              <w:right w:val="single" w:sz="6" w:space="0" w:color="334155"/>
+            </w:tcBorders>
+            <w:tcMar>
+              <w:top w:w="90" w:type="dxa"/>
+              <w:bottom w:w="90" w:type="dxa"/>
+              <w:left w:w="110" w:type="dxa"/>
+              <w:right w:w="110" w:type="dxa"/>
+            </w:tcMar>
+          </w:tcPr>
+          <w:p>
+            <w:pPr>
+              <w:spacing w:before="0" w:after="0"/>
+            </w:pPr>
+            <w:r>
+              <w:rPr>
+                <w:rFonts w:ascii="Segoe UI" w:hAnsi="Segoe UI"/>
+                <w:b/>
+                <w:color w:val="FFFFFF"/>
+                <w:sz w:val="18"/>
+              </w:rPr>
+              <w:t>Régimen Fin de Semana</w:t>
+            </w:r>
+          </w:p>
+        </w:tc>
+      </w:tr>
+      <w:tr>
+        <w:tc>
+          <w:tcPr>
+            <w:tcW w:type="dxa" w:w="1605"/>
+            <w:shd w:val="clear" w:color="auto" w:fill="FFFFFF"/>
+            <w:tcBorders>
+              <w:top w:val="single" w:sz="4" w:space="0" w:color="CBD5E1"/>
+              <w:left w:val="single" w:sz="4" w:space="0" w:color="CBD5E1"/>
+              <w:bottom w:val="single" w:sz="4" w:space="0" w:color="CBD5E1"/>
+              <w:right w:val="single" w:sz="4" w:space="0" w:color="CBD5E1"/>
+            </w:tcBorders>
+            <w:tcMar>
+              <w:top w:w="80" w:type="dxa"/>
+              <w:bottom w:w="80" w:type="dxa"/>
+              <w:left w:w="100" w:type="dxa"/>
+              <w:right w:w="100" w:type="dxa"/>
+            </w:tcMar>
+          </w:tcPr>
+          <w:p>
+            <w:pPr>
+              <w:spacing w:before="0" w:after="0"/>
+            </w:pPr>
+            <w:r>
+              <w:rPr>
+                <w:rFonts w:ascii="Segoe UI" w:hAnsi="Segoe UI"/>
+                <w:b/>
+                <w:color w:val="0F172A"/>
+                <w:sz w:val="17"/>
+              </w:rPr>
+              <w:t>Patio / Supervisión</w:t>
+            </w:r>
+          </w:p>
+        </w:tc>
+        <w:tc>
+          <w:tcPr>
+            <w:tcW w:type="dxa" w:w="1605"/>
+            <w:shd w:val="clear" w:color="auto" w:fill="FFFFFF"/>
+            <w:tcBorders>
+              <w:top w:val="single" w:sz="4" w:space="0" w:color="CBD5E1"/>
+              <w:left w:val="single" w:sz="4" w:space="0" w:color="CBD5E1"/>
+              <w:bottom w:val="single" w:sz="4" w:space="0" w:color="CBD5E1"/>
+              <w:right w:val="single" w:sz="4" w:space="0" w:color="CBD5E1"/>
+            </w:tcBorders>
+            <w:tcMar>
+              <w:top w:w="80" w:type="dxa"/>
+              <w:bottom w:w="80" w:type="dxa"/>
+              <w:left w:w="100" w:type="dxa"/>
+              <w:right w:w="100" w:type="dxa"/>
+            </w:tcMar>
+          </w:tcPr>
+          <w:p>
+            <w:pPr>
+              <w:spacing w:before="0" w:after="0"/>
+            </w:pPr>
+            <w:r>
+              <w:rPr>
+                <w:rFonts w:ascii="Segoe UI" w:hAnsi="Segoe UI"/>
+                <w:color w:val="334155"/>
+                <w:sz w:val="17"/>
+              </w:rPr>
+              <w:t>Jefe de Patio</w:t>
+            </w:r>
+          </w:p>
+        </w:tc>
+        <w:tc>
+          <w:tcPr>
+            <w:tcW w:type="dxa" w:w="1605"/>
+            <w:shd w:val="clear" w:color="auto" w:fill="FFFFFF"/>
+            <w:tcBorders>
+              <w:top w:val="single" w:sz="4" w:space="0" w:color="CBD5E1"/>
+              <w:left w:val="single" w:sz="4" w:space="0" w:color="CBD5E1"/>
+              <w:bottom w:val="single" w:sz="4" w:space="0" w:color="CBD5E1"/>
+              <w:right w:val="single" w:sz="4" w:space="0" w:color="CBD5E1"/>
+            </w:tcBorders>
+            <w:tcMar>
+              <w:top w:w="80" w:type="dxa"/>
+              <w:bottom w:w="80" w:type="dxa"/>
+              <w:left w:w="100" w:type="dxa"/>
+              <w:right w:w="100" w:type="dxa"/>
+            </w:tcMar>
+          </w:tcPr>
+          <w:p>
+            <w:pPr>
+              <w:spacing w:before="0" w:after="0"/>
+            </w:pPr>
+            <w:r>
+              <w:rPr>
+                <w:rFonts w:ascii="Segoe UI" w:hAnsi="Segoe UI"/>
+                <w:color w:val="334155"/>
+                <w:sz w:val="17"/>
+              </w:rPr>
+              <w:t>Operativo / Mando</w:t>
+            </w:r>
+          </w:p>
+        </w:tc>
+        <w:tc>
+          <w:tcPr>
+            <w:tcW w:type="dxa" w:w="1605"/>
+            <w:shd w:val="clear" w:color="auto" w:fill="FFFFFF"/>
+            <w:tcBorders>
+              <w:top w:val="single" w:sz="4" w:space="0" w:color="CBD5E1"/>
+              <w:left w:val="single" w:sz="4" w:space="0" w:color="CBD5E1"/>
+              <w:bottom w:val="single" w:sz="4" w:space="0" w:color="CBD5E1"/>
+              <w:right w:val="single" w:sz="4" w:space="0" w:color="CBD5E1"/>
+            </w:tcBorders>
+            <w:tcMar>
+              <w:top w:w="80" w:type="dxa"/>
+              <w:bottom w:w="80" w:type="dxa"/>
+              <w:left w:w="100" w:type="dxa"/>
+              <w:right w:w="100" w:type="dxa"/>
+            </w:tcMar>
+          </w:tcPr>
+          <w:p>
+            <w:pPr>
+              <w:spacing w:before="0" w:after="0"/>
+            </w:pPr>
+            <w:r>
+              <w:rPr>
+                <w:rFonts w:ascii="Segoe UI" w:hAnsi="Segoe UI"/>
+                <w:color w:val="334155"/>
+                <w:sz w:val="17"/>
+              </w:rPr>
+              <w:t>SÍ (Crítico)</w:t>
+            </w:r>
+          </w:p>
+        </w:tc>
+        <w:tc>
+          <w:tcPr>
+            <w:tcW w:type="dxa" w:w="1605"/>
+            <w:shd w:val="clear" w:color="auto" w:fill="FFFFFF"/>
+            <w:tcBorders>
+              <w:top w:val="single" w:sz="4" w:space="0" w:color="CBD5E1"/>
+              <w:left w:val="single" w:sz="4" w:space="0" w:color="CBD5E1"/>
+              <w:bottom w:val="single" w:sz="4" w:space="0" w:color="CBD5E1"/>
+              <w:right w:val="single" w:sz="4" w:space="0" w:color="CBD5E1"/>
+            </w:tcBorders>
+            <w:tcMar>
+              <w:top w:w="80" w:type="dxa"/>
+              <w:bottom w:w="80" w:type="dxa"/>
+              <w:left w:w="100" w:type="dxa"/>
+              <w:right w:w="100" w:type="dxa"/>
+            </w:tcMar>
+          </w:tcPr>
+          <w:p>
+            <w:pPr>
+              <w:spacing w:before="0" w:after="0"/>
+            </w:pPr>
+            <w:r>
+              <w:rPr>
+                <w:rFonts w:ascii="Segoe UI" w:hAnsi="Segoe UI"/>
+                <w:color w:val="334155"/>
+                <w:sz w:val="17"/>
+              </w:rPr>
+              <w:t>Lunes a Viernes 42h</w:t>
+            </w:r>
+          </w:p>
+        </w:tc>
+        <w:tc>
+          <w:tcPr>
+            <w:tcW w:type="dxa" w:w="1605"/>
+            <w:shd w:val="clear" w:color="auto" w:fill="FFFFFF"/>
+            <w:tcBorders>
+              <w:top w:val="single" w:sz="4" w:space="0" w:color="CBD5E1"/>
+              <w:left w:val="single" w:sz="4" w:space="0" w:color="CBD5E1"/>
+              <w:bottom w:val="single" w:sz="4" w:space="0" w:color="CBD5E1"/>
+              <w:right w:val="single" w:sz="4" w:space="0" w:color="CBD5E1"/>
+            </w:tcBorders>
+            <w:tcMar>
+              <w:top w:w="80" w:type="dxa"/>
+              <w:bottom w:w="80" w:type="dxa"/>
+              <w:left w:w="100" w:type="dxa"/>
+              <w:right w:w="100" w:type="dxa"/>
+            </w:tcMar>
+          </w:tcPr>
+          <w:p>
+            <w:pPr>
+              <w:spacing w:before="0" w:after="0"/>
+            </w:pPr>
+            <w:r>
+              <w:rPr>
+                <w:rFonts w:ascii="Segoe UI" w:hAnsi="Segoe UI"/>
+                <w:color w:val="334155"/>
+                <w:sz w:val="17"/>
+              </w:rPr>
+              <w:t>Sáb/Dom/Festivo (Supervisión y Aprobación Extras)</w:t>
+            </w:r>
+          </w:p>
+        </w:tc>
+      </w:tr>
+      <w:tr>
+        <w:tc>
+          <w:tcPr>
+            <w:tcW w:type="dxa" w:w="1605"/>
+            <w:shd w:val="clear" w:color="auto" w:fill="F8FAFC"/>
+            <w:tcBorders>
+              <w:top w:val="single" w:sz="4" w:space="0" w:color="CBD5E1"/>
+              <w:left w:val="single" w:sz="4" w:space="0" w:color="CBD5E1"/>
+              <w:bottom w:val="single" w:sz="4" w:space="0" w:color="CBD5E1"/>
+              <w:right w:val="single" w:sz="4" w:space="0" w:color="CBD5E1"/>
+            </w:tcBorders>
+            <w:tcMar>
+              <w:top w:w="80" w:type="dxa"/>
+              <w:bottom w:w="80" w:type="dxa"/>
+              <w:left w:w="100" w:type="dxa"/>
+              <w:right w:w="100" w:type="dxa"/>
+            </w:tcMar>
+          </w:tcPr>
+          <w:p>
+            <w:pPr>
+              <w:spacing w:before="0" w:after="0"/>
+            </w:pPr>
+            <w:r>
+              <w:rPr>
+                <w:rFonts w:ascii="Segoe UI" w:hAnsi="Segoe UI"/>
+                <w:b/>
+                <w:color w:val="0F172A"/>
+                <w:sz w:val="17"/>
+              </w:rPr>
+              <w:t>Patio / Maquinaria Pesada</w:t>
+            </w:r>
+          </w:p>
+        </w:tc>
+        <w:tc>
+          <w:tcPr>
+            <w:tcW w:type="dxa" w:w="1605"/>
+            <w:shd w:val="clear" w:color="auto" w:fill="F8FAFC"/>
+            <w:tcBorders>
+              <w:top w:val="single" w:sz="4" w:space="0" w:color="CBD5E1"/>
+              <w:left w:val="single" w:sz="4" w:space="0" w:color="CBD5E1"/>
+              <w:bottom w:val="single" w:sz="4" w:space="0" w:color="CBD5E1"/>
+              <w:right w:val="single" w:sz="4" w:space="0" w:color="CBD5E1"/>
+            </w:tcBorders>
+            <w:tcMar>
+              <w:top w:w="80" w:type="dxa"/>
+              <w:bottom w:w="80" w:type="dxa"/>
+              <w:left w:w="100" w:type="dxa"/>
+              <w:right w:w="100" w:type="dxa"/>
+            </w:tcMar>
+          </w:tcPr>
+          <w:p>
+            <w:pPr>
+              <w:spacing w:before="0" w:after="0"/>
+            </w:pPr>
+            <w:r>
+              <w:rPr>
+                <w:rFonts w:ascii="Segoe UI" w:hAnsi="Segoe UI"/>
+                <w:color w:val="334155"/>
+                <w:sz w:val="17"/>
+              </w:rPr>
+              <w:t>Operador Grúa Pulpo #1</w:t>
+            </w:r>
+          </w:p>
+        </w:tc>
+        <w:tc>
+          <w:tcPr>
+            <w:tcW w:type="dxa" w:w="1605"/>
+            <w:shd w:val="clear" w:color="auto" w:fill="F8FAFC"/>
+            <w:tcBorders>
+              <w:top w:val="single" w:sz="4" w:space="0" w:color="CBD5E1"/>
+              <w:left w:val="single" w:sz="4" w:space="0" w:color="CBD5E1"/>
+              <w:bottom w:val="single" w:sz="4" w:space="0" w:color="CBD5E1"/>
+              <w:right w:val="single" w:sz="4" w:space="0" w:color="CBD5E1"/>
+            </w:tcBorders>
+            <w:tcMar>
+              <w:top w:w="80" w:type="dxa"/>
+              <w:bottom w:w="80" w:type="dxa"/>
+              <w:left w:w="100" w:type="dxa"/>
+              <w:right w:w="100" w:type="dxa"/>
+            </w:tcMar>
+          </w:tcPr>
+          <w:p>
+            <w:pPr>
+              <w:spacing w:before="0" w:after="0"/>
+            </w:pPr>
+            <w:r>
+              <w:rPr>
+                <w:rFonts w:ascii="Segoe UI" w:hAnsi="Segoe UI"/>
+                <w:color w:val="334155"/>
+                <w:sz w:val="17"/>
+              </w:rPr>
+              <w:t>Operativo Patio</w:t>
+            </w:r>
+          </w:p>
+        </w:tc>
+        <w:tc>
+          <w:tcPr>
+            <w:tcW w:type="dxa" w:w="1605"/>
+            <w:shd w:val="clear" w:color="auto" w:fill="F8FAFC"/>
+            <w:tcBorders>
+              <w:top w:val="single" w:sz="4" w:space="0" w:color="CBD5E1"/>
+              <w:left w:val="single" w:sz="4" w:space="0" w:color="CBD5E1"/>
+              <w:bottom w:val="single" w:sz="4" w:space="0" w:color="CBD5E1"/>
+              <w:right w:val="single" w:sz="4" w:space="0" w:color="CBD5E1"/>
+            </w:tcBorders>
+            <w:tcMar>
+              <w:top w:w="80" w:type="dxa"/>
+              <w:bottom w:w="80" w:type="dxa"/>
+              <w:left w:w="100" w:type="dxa"/>
+              <w:right w:w="100" w:type="dxa"/>
+            </w:tcMar>
+          </w:tcPr>
+          <w:p>
+            <w:pPr>
+              <w:spacing w:before="0" w:after="0"/>
+            </w:pPr>
+            <w:r>
+              <w:rPr>
+                <w:rFonts w:ascii="Segoe UI" w:hAnsi="Segoe UI"/>
+                <w:color w:val="334155"/>
+                <w:sz w:val="17"/>
+              </w:rPr>
+              <w:t>SÍ (Crítico)</w:t>
+            </w:r>
+          </w:p>
+        </w:tc>
+        <w:tc>
+          <w:tcPr>
+            <w:tcW w:type="dxa" w:w="1605"/>
+            <w:shd w:val="clear" w:color="auto" w:fill="F8FAFC"/>
+            <w:tcBorders>
+              <w:top w:val="single" w:sz="4" w:space="0" w:color="CBD5E1"/>
+              <w:left w:val="single" w:sz="4" w:space="0" w:color="CBD5E1"/>
+              <w:bottom w:val="single" w:sz="4" w:space="0" w:color="CBD5E1"/>
+              <w:right w:val="single" w:sz="4" w:space="0" w:color="CBD5E1"/>
+            </w:tcBorders>
+            <w:tcMar>
+              <w:top w:w="80" w:type="dxa"/>
+              <w:bottom w:w="80" w:type="dxa"/>
+              <w:left w:w="100" w:type="dxa"/>
+              <w:right w:w="100" w:type="dxa"/>
+            </w:tcMar>
+          </w:tcPr>
+          <w:p>
+            <w:pPr>
+              <w:spacing w:before="0" w:after="0"/>
+            </w:pPr>
+            <w:r>
+              <w:rPr>
+                <w:rFonts w:ascii="Segoe UI" w:hAnsi="Segoe UI"/>
+                <w:color w:val="334155"/>
+                <w:sz w:val="17"/>
+              </w:rPr>
+              <w:t>Lunes a Viernes 42h</w:t>
+            </w:r>
+          </w:p>
+        </w:tc>
+        <w:tc>
+          <w:tcPr>
+            <w:tcW w:type="dxa" w:w="1605"/>
+            <w:shd w:val="clear" w:color="auto" w:fill="F8FAFC"/>
+            <w:tcBorders>
+              <w:top w:val="single" w:sz="4" w:space="0" w:color="CBD5E1"/>
+              <w:left w:val="single" w:sz="4" w:space="0" w:color="CBD5E1"/>
+              <w:bottom w:val="single" w:sz="4" w:space="0" w:color="CBD5E1"/>
+              <w:right w:val="single" w:sz="4" w:space="0" w:color="CBD5E1"/>
+            </w:tcBorders>
+            <w:tcMar>
+              <w:top w:w="80" w:type="dxa"/>
+              <w:bottom w:w="80" w:type="dxa"/>
+              <w:left w:w="100" w:type="dxa"/>
+              <w:right w:w="100" w:type="dxa"/>
+            </w:tcMar>
+          </w:tcPr>
+          <w:p>
+            <w:pPr>
+              <w:spacing w:before="0" w:after="0"/>
+            </w:pPr>
+            <w:r>
+              <w:rPr>
+                <w:rFonts w:ascii="Segoe UI" w:hAnsi="Segoe UI"/>
+                <w:color w:val="334155"/>
+                <w:sz w:val="17"/>
+              </w:rPr>
+              <w:t>Sáb/Dom/Festivo si hay cargue urgente (HED/HEN/RDF)</w:t>
+            </w:r>
+          </w:p>
+        </w:tc>
+      </w:tr>
+      <w:tr>
+        <w:tc>
+          <w:tcPr>
+            <w:tcW w:type="dxa" w:w="1605"/>
+            <w:shd w:val="clear" w:color="auto" w:fill="FFFFFF"/>
+            <w:tcBorders>
+              <w:top w:val="single" w:sz="4" w:space="0" w:color="CBD5E1"/>
+              <w:left w:val="single" w:sz="4" w:space="0" w:color="CBD5E1"/>
+              <w:bottom w:val="single" w:sz="4" w:space="0" w:color="CBD5E1"/>
+              <w:right w:val="single" w:sz="4" w:space="0" w:color="CBD5E1"/>
+            </w:tcBorders>
+            <w:tcMar>
+              <w:top w:w="80" w:type="dxa"/>
+              <w:bottom w:w="80" w:type="dxa"/>
+              <w:left w:w="100" w:type="dxa"/>
+              <w:right w:w="100" w:type="dxa"/>
+            </w:tcMar>
+          </w:tcPr>
+          <w:p>
+            <w:pPr>
+              <w:spacing w:before="0" w:after="0"/>
+            </w:pPr>
+            <w:r>
+              <w:rPr>
+                <w:rFonts w:ascii="Segoe UI" w:hAnsi="Segoe UI"/>
+                <w:b/>
+                <w:color w:val="0F172A"/>
+                <w:sz w:val="17"/>
+              </w:rPr>
+              <w:t>Patio / Maquinaria Pesada</w:t>
+            </w:r>
+          </w:p>
+        </w:tc>
+        <w:tc>
+          <w:tcPr>
+            <w:tcW w:type="dxa" w:w="1605"/>
+            <w:shd w:val="clear" w:color="auto" w:fill="FFFFFF"/>
+            <w:tcBorders>
+              <w:top w:val="single" w:sz="4" w:space="0" w:color="CBD5E1"/>
+              <w:left w:val="single" w:sz="4" w:space="0" w:color="CBD5E1"/>
+              <w:bottom w:val="single" w:sz="4" w:space="0" w:color="CBD5E1"/>
+              <w:right w:val="single" w:sz="4" w:space="0" w:color="CBD5E1"/>
+            </w:tcBorders>
+            <w:tcMar>
+              <w:top w:w="80" w:type="dxa"/>
+              <w:bottom w:w="80" w:type="dxa"/>
+              <w:left w:w="100" w:type="dxa"/>
+              <w:right w:w="100" w:type="dxa"/>
+            </w:tcMar>
+          </w:tcPr>
+          <w:p>
+            <w:pPr>
+              <w:spacing w:before="0" w:after="0"/>
+            </w:pPr>
+            <w:r>
+              <w:rPr>
+                <w:rFonts w:ascii="Segoe UI" w:hAnsi="Segoe UI"/>
+                <w:color w:val="334155"/>
+                <w:sz w:val="17"/>
+              </w:rPr>
+              <w:t>Operador Grúa Pulpo #2</w:t>
+            </w:r>
+          </w:p>
+        </w:tc>
+        <w:tc>
+          <w:tcPr>
+            <w:tcW w:type="dxa" w:w="1605"/>
+            <w:shd w:val="clear" w:color="auto" w:fill="FFFFFF"/>
+            <w:tcBorders>
+              <w:top w:val="single" w:sz="4" w:space="0" w:color="CBD5E1"/>
+              <w:left w:val="single" w:sz="4" w:space="0" w:color="CBD5E1"/>
+              <w:bottom w:val="single" w:sz="4" w:space="0" w:color="CBD5E1"/>
+              <w:right w:val="single" w:sz="4" w:space="0" w:color="CBD5E1"/>
+            </w:tcBorders>
+            <w:tcMar>
+              <w:top w:w="80" w:type="dxa"/>
+              <w:bottom w:w="80" w:type="dxa"/>
+              <w:left w:w="100" w:type="dxa"/>
+              <w:right w:w="100" w:type="dxa"/>
+            </w:tcMar>
+          </w:tcPr>
+          <w:p>
+            <w:pPr>
+              <w:spacing w:before="0" w:after="0"/>
+            </w:pPr>
+            <w:r>
+              <w:rPr>
+                <w:rFonts w:ascii="Segoe UI" w:hAnsi="Segoe UI"/>
+                <w:color w:val="334155"/>
+                <w:sz w:val="17"/>
+              </w:rPr>
+              <w:t>Operativo Patio</w:t>
+            </w:r>
+          </w:p>
+        </w:tc>
+        <w:tc>
+          <w:tcPr>
+            <w:tcW w:type="dxa" w:w="1605"/>
+            <w:shd w:val="clear" w:color="auto" w:fill="FFFFFF"/>
+            <w:tcBorders>
+              <w:top w:val="single" w:sz="4" w:space="0" w:color="CBD5E1"/>
+              <w:left w:val="single" w:sz="4" w:space="0" w:color="CBD5E1"/>
+              <w:bottom w:val="single" w:sz="4" w:space="0" w:color="CBD5E1"/>
+              <w:right w:val="single" w:sz="4" w:space="0" w:color="CBD5E1"/>
+            </w:tcBorders>
+            <w:tcMar>
+              <w:top w:w="80" w:type="dxa"/>
+              <w:bottom w:w="80" w:type="dxa"/>
+              <w:left w:w="100" w:type="dxa"/>
+              <w:right w:w="100" w:type="dxa"/>
+            </w:tcMar>
+          </w:tcPr>
+          <w:p>
+            <w:pPr>
+              <w:spacing w:before="0" w:after="0"/>
+            </w:pPr>
+            <w:r>
+              <w:rPr>
+                <w:rFonts w:ascii="Segoe UI" w:hAnsi="Segoe UI"/>
+                <w:color w:val="334155"/>
+                <w:sz w:val="17"/>
+              </w:rPr>
+              <w:t>SÍ (Crítico)</w:t>
+            </w:r>
+          </w:p>
+        </w:tc>
+        <w:tc>
+          <w:tcPr>
+            <w:tcW w:type="dxa" w:w="1605"/>
+            <w:shd w:val="clear" w:color="auto" w:fill="FFFFFF"/>
+            <w:tcBorders>
+              <w:top w:val="single" w:sz="4" w:space="0" w:color="CBD5E1"/>
+              <w:left w:val="single" w:sz="4" w:space="0" w:color="CBD5E1"/>
+              <w:bottom w:val="single" w:sz="4" w:space="0" w:color="CBD5E1"/>
+              <w:right w:val="single" w:sz="4" w:space="0" w:color="CBD5E1"/>
+            </w:tcBorders>
+            <w:tcMar>
+              <w:top w:w="80" w:type="dxa"/>
+              <w:bottom w:w="80" w:type="dxa"/>
+              <w:left w:w="100" w:type="dxa"/>
+              <w:right w:w="100" w:type="dxa"/>
+            </w:tcMar>
+          </w:tcPr>
+          <w:p>
+            <w:pPr>
+              <w:spacing w:before="0" w:after="0"/>
+            </w:pPr>
+            <w:r>
+              <w:rPr>
+                <w:rFonts w:ascii="Segoe UI" w:hAnsi="Segoe UI"/>
+                <w:color w:val="334155"/>
+                <w:sz w:val="17"/>
+              </w:rPr>
+              <w:t>Lunes a Viernes 42h</w:t>
+            </w:r>
+          </w:p>
+        </w:tc>
+        <w:tc>
+          <w:tcPr>
+            <w:tcW w:type="dxa" w:w="1605"/>
+            <w:shd w:val="clear" w:color="auto" w:fill="FFFFFF"/>
+            <w:tcBorders>
+              <w:top w:val="single" w:sz="4" w:space="0" w:color="CBD5E1"/>
+              <w:left w:val="single" w:sz="4" w:space="0" w:color="CBD5E1"/>
+              <w:bottom w:val="single" w:sz="4" w:space="0" w:color="CBD5E1"/>
+              <w:right w:val="single" w:sz="4" w:space="0" w:color="CBD5E1"/>
+            </w:tcBorders>
+            <w:tcMar>
+              <w:top w:w="80" w:type="dxa"/>
+              <w:bottom w:w="80" w:type="dxa"/>
+              <w:left w:w="100" w:type="dxa"/>
+              <w:right w:w="100" w:type="dxa"/>
+            </w:tcMar>
+          </w:tcPr>
+          <w:p>
+            <w:pPr>
+              <w:spacing w:before="0" w:after="0"/>
+            </w:pPr>
+            <w:r>
+              <w:rPr>
+                <w:rFonts w:ascii="Segoe UI" w:hAnsi="Segoe UI"/>
+                <w:color w:val="334155"/>
+                <w:sz w:val="17"/>
+              </w:rPr>
+              <w:t>Sáb/Dom/Festivo si hay cargue urgente (HED/HEN/RDF)</w:t>
+            </w:r>
+          </w:p>
+        </w:tc>
+      </w:tr>
+      <w:tr>
+        <w:tc>
+          <w:tcPr>
+            <w:tcW w:type="dxa" w:w="1605"/>
+            <w:shd w:val="clear" w:color="auto" w:fill="F8FAFC"/>
+            <w:tcBorders>
+              <w:top w:val="single" w:sz="4" w:space="0" w:color="CBD5E1"/>
+              <w:left w:val="single" w:sz="4" w:space="0" w:color="CBD5E1"/>
+              <w:bottom w:val="single" w:sz="4" w:space="0" w:color="CBD5E1"/>
+              <w:right w:val="single" w:sz="4" w:space="0" w:color="CBD5E1"/>
+            </w:tcBorders>
+            <w:tcMar>
+              <w:top w:w="80" w:type="dxa"/>
+              <w:bottom w:w="80" w:type="dxa"/>
+              <w:left w:w="100" w:type="dxa"/>
+              <w:right w:w="100" w:type="dxa"/>
+            </w:tcMar>
+          </w:tcPr>
+          <w:p>
+            <w:pPr>
+              <w:spacing w:before="0" w:after="0"/>
+            </w:pPr>
+            <w:r>
+              <w:rPr>
+                <w:rFonts w:ascii="Segoe UI" w:hAnsi="Segoe UI"/>
+                <w:b/>
+                <w:color w:val="0F172A"/>
+                <w:sz w:val="17"/>
+              </w:rPr>
+              <w:t>Patio / Maquinaria Pesada</w:t>
+            </w:r>
+          </w:p>
+        </w:tc>
+        <w:tc>
+          <w:tcPr>
+            <w:tcW w:type="dxa" w:w="1605"/>
+            <w:shd w:val="clear" w:color="auto" w:fill="F8FAFC"/>
+            <w:tcBorders>
+              <w:top w:val="single" w:sz="4" w:space="0" w:color="CBD5E1"/>
+              <w:left w:val="single" w:sz="4" w:space="0" w:color="CBD5E1"/>
+              <w:bottom w:val="single" w:sz="4" w:space="0" w:color="CBD5E1"/>
+              <w:right w:val="single" w:sz="4" w:space="0" w:color="CBD5E1"/>
+            </w:tcBorders>
+            <w:tcMar>
+              <w:top w:w="80" w:type="dxa"/>
+              <w:bottom w:w="80" w:type="dxa"/>
+              <w:left w:w="100" w:type="dxa"/>
+              <w:right w:w="100" w:type="dxa"/>
+            </w:tcMar>
+          </w:tcPr>
+          <w:p>
+            <w:pPr>
+              <w:spacing w:before="0" w:after="0"/>
+            </w:pPr>
+            <w:r>
+              <w:rPr>
+                <w:rFonts w:ascii="Segoe UI" w:hAnsi="Segoe UI"/>
+                <w:color w:val="334155"/>
+                <w:sz w:val="17"/>
+              </w:rPr>
+              <w:t>Operador de Montacargas</w:t>
+            </w:r>
+          </w:p>
+        </w:tc>
+        <w:tc>
+          <w:tcPr>
+            <w:tcW w:type="dxa" w:w="1605"/>
+            <w:shd w:val="clear" w:color="auto" w:fill="F8FAFC"/>
+            <w:tcBorders>
+              <w:top w:val="single" w:sz="4" w:space="0" w:color="CBD5E1"/>
+              <w:left w:val="single" w:sz="4" w:space="0" w:color="CBD5E1"/>
+              <w:bottom w:val="single" w:sz="4" w:space="0" w:color="CBD5E1"/>
+              <w:right w:val="single" w:sz="4" w:space="0" w:color="CBD5E1"/>
+            </w:tcBorders>
+            <w:tcMar>
+              <w:top w:w="80" w:type="dxa"/>
+              <w:bottom w:w="80" w:type="dxa"/>
+              <w:left w:w="100" w:type="dxa"/>
+              <w:right w:w="100" w:type="dxa"/>
+            </w:tcMar>
+          </w:tcPr>
+          <w:p>
+            <w:pPr>
+              <w:spacing w:before="0" w:after="0"/>
+            </w:pPr>
+            <w:r>
+              <w:rPr>
+                <w:rFonts w:ascii="Segoe UI" w:hAnsi="Segoe UI"/>
+                <w:color w:val="334155"/>
+                <w:sz w:val="17"/>
+              </w:rPr>
+              <w:t>Operativo Patio</w:t>
+            </w:r>
+          </w:p>
+        </w:tc>
+        <w:tc>
+          <w:tcPr>
+            <w:tcW w:type="dxa" w:w="1605"/>
+            <w:shd w:val="clear" w:color="auto" w:fill="F8FAFC"/>
+            <w:tcBorders>
+              <w:top w:val="single" w:sz="4" w:space="0" w:color="CBD5E1"/>
+              <w:left w:val="single" w:sz="4" w:space="0" w:color="CBD5E1"/>
+              <w:bottom w:val="single" w:sz="4" w:space="0" w:color="CBD5E1"/>
+              <w:right w:val="single" w:sz="4" w:space="0" w:color="CBD5E1"/>
+            </w:tcBorders>
+            <w:tcMar>
+              <w:top w:w="80" w:type="dxa"/>
+              <w:bottom w:w="80" w:type="dxa"/>
+              <w:left w:w="100" w:type="dxa"/>
+              <w:right w:w="100" w:type="dxa"/>
+            </w:tcMar>
+          </w:tcPr>
+          <w:p>
+            <w:pPr>
+              <w:spacing w:before="0" w:after="0"/>
+            </w:pPr>
+            <w:r>
+              <w:rPr>
+                <w:rFonts w:ascii="Segoe UI" w:hAnsi="Segoe UI"/>
+                <w:color w:val="334155"/>
+                <w:sz w:val="17"/>
+              </w:rPr>
+              <w:t>SÍ (Crítico)</w:t>
+            </w:r>
+          </w:p>
+        </w:tc>
+        <w:tc>
+          <w:tcPr>
+            <w:tcW w:type="dxa" w:w="1605"/>
+            <w:shd w:val="clear" w:color="auto" w:fill="F8FAFC"/>
+            <w:tcBorders>
+              <w:top w:val="single" w:sz="4" w:space="0" w:color="CBD5E1"/>
+              <w:left w:val="single" w:sz="4" w:space="0" w:color="CBD5E1"/>
+              <w:bottom w:val="single" w:sz="4" w:space="0" w:color="CBD5E1"/>
+              <w:right w:val="single" w:sz="4" w:space="0" w:color="CBD5E1"/>
+            </w:tcBorders>
+            <w:tcMar>
+              <w:top w:w="80" w:type="dxa"/>
+              <w:bottom w:w="80" w:type="dxa"/>
+              <w:left w:w="100" w:type="dxa"/>
+              <w:right w:w="100" w:type="dxa"/>
+            </w:tcMar>
+          </w:tcPr>
+          <w:p>
+            <w:pPr>
+              <w:spacing w:before="0" w:after="0"/>
+            </w:pPr>
+            <w:r>
+              <w:rPr>
+                <w:rFonts w:ascii="Segoe UI" w:hAnsi="Segoe UI"/>
+                <w:color w:val="334155"/>
+                <w:sz w:val="17"/>
+              </w:rPr>
+              <w:t>Lunes a Viernes 42h</w:t>
+            </w:r>
+          </w:p>
+        </w:tc>
+        <w:tc>
+          <w:tcPr>
+            <w:tcW w:type="dxa" w:w="1605"/>
+            <w:shd w:val="clear" w:color="auto" w:fill="F8FAFC"/>
+            <w:tcBorders>
+              <w:top w:val="single" w:sz="4" w:space="0" w:color="CBD5E1"/>
+              <w:left w:val="single" w:sz="4" w:space="0" w:color="CBD5E1"/>
+              <w:bottom w:val="single" w:sz="4" w:space="0" w:color="CBD5E1"/>
+              <w:right w:val="single" w:sz="4" w:space="0" w:color="CBD5E1"/>
+            </w:tcBorders>
+            <w:tcMar>
+              <w:top w:w="80" w:type="dxa"/>
+              <w:bottom w:w="80" w:type="dxa"/>
+              <w:left w:w="100" w:type="dxa"/>
+              <w:right w:w="100" w:type="dxa"/>
+            </w:tcMar>
+          </w:tcPr>
+          <w:p>
+            <w:pPr>
+              <w:spacing w:before="0" w:after="0"/>
+            </w:pPr>
+            <w:r>
+              <w:rPr>
+                <w:rFonts w:ascii="Segoe UI" w:hAnsi="Segoe UI"/>
+                <w:color w:val="334155"/>
+                <w:sz w:val="17"/>
+              </w:rPr>
+              <w:t>Sáb/Dom/Festivo movimiento de chatarra/pallets</w:t>
+            </w:r>
+          </w:p>
+        </w:tc>
+      </w:tr>
+      <w:tr>
+        <w:tc>
+          <w:tcPr>
+            <w:tcW w:type="dxa" w:w="1605"/>
+            <w:shd w:val="clear" w:color="auto" w:fill="FFFFFF"/>
+            <w:tcBorders>
+              <w:top w:val="single" w:sz="4" w:space="0" w:color="CBD5E1"/>
+              <w:left w:val="single" w:sz="4" w:space="0" w:color="CBD5E1"/>
+              <w:bottom w:val="single" w:sz="4" w:space="0" w:color="CBD5E1"/>
+              <w:right w:val="single" w:sz="4" w:space="0" w:color="CBD5E1"/>
+            </w:tcBorders>
+            <w:tcMar>
+              <w:top w:w="80" w:type="dxa"/>
+              <w:bottom w:w="80" w:type="dxa"/>
+              <w:left w:w="100" w:type="dxa"/>
+              <w:right w:w="100" w:type="dxa"/>
+            </w:tcMar>
+          </w:tcPr>
+          <w:p>
+            <w:pPr>
+              <w:spacing w:before="0" w:after="0"/>
+            </w:pPr>
+            <w:r>
+              <w:rPr>
+                <w:rFonts w:ascii="Segoe UI" w:hAnsi="Segoe UI"/>
+                <w:b/>
+                <w:color w:val="0F172A"/>
+                <w:sz w:val="17"/>
+              </w:rPr>
+              <w:t>Patio / Mantenimiento</w:t>
+            </w:r>
+          </w:p>
+        </w:tc>
+        <w:tc>
+          <w:tcPr>
+            <w:tcW w:type="dxa" w:w="1605"/>
+            <w:shd w:val="clear" w:color="auto" w:fill="FFFFFF"/>
+            <w:tcBorders>
+              <w:top w:val="single" w:sz="4" w:space="0" w:color="CBD5E1"/>
+              <w:left w:val="single" w:sz="4" w:space="0" w:color="CBD5E1"/>
+              <w:bottom w:val="single" w:sz="4" w:space="0" w:color="CBD5E1"/>
+              <w:right w:val="single" w:sz="4" w:space="0" w:color="CBD5E1"/>
+            </w:tcBorders>
+            <w:tcMar>
+              <w:top w:w="80" w:type="dxa"/>
+              <w:bottom w:w="80" w:type="dxa"/>
+              <w:left w:w="100" w:type="dxa"/>
+              <w:right w:w="100" w:type="dxa"/>
+            </w:tcMar>
+          </w:tcPr>
+          <w:p>
+            <w:pPr>
+              <w:spacing w:before="0" w:after="0"/>
+            </w:pPr>
+            <w:r>
+              <w:rPr>
+                <w:rFonts w:ascii="Segoe UI" w:hAnsi="Segoe UI"/>
+                <w:color w:val="334155"/>
+                <w:sz w:val="17"/>
+              </w:rPr>
+              <w:t>Mecánico de Planta</w:t>
+            </w:r>
+          </w:p>
+        </w:tc>
+        <w:tc>
+          <w:tcPr>
+            <w:tcW w:type="dxa" w:w="1605"/>
+            <w:shd w:val="clear" w:color="auto" w:fill="FFFFFF"/>
+            <w:tcBorders>
+              <w:top w:val="single" w:sz="4" w:space="0" w:color="CBD5E1"/>
+              <w:left w:val="single" w:sz="4" w:space="0" w:color="CBD5E1"/>
+              <w:bottom w:val="single" w:sz="4" w:space="0" w:color="CBD5E1"/>
+              <w:right w:val="single" w:sz="4" w:space="0" w:color="CBD5E1"/>
+            </w:tcBorders>
+            <w:tcMar>
+              <w:top w:w="80" w:type="dxa"/>
+              <w:bottom w:w="80" w:type="dxa"/>
+              <w:left w:w="100" w:type="dxa"/>
+              <w:right w:w="100" w:type="dxa"/>
+            </w:tcMar>
+          </w:tcPr>
+          <w:p>
+            <w:pPr>
+              <w:spacing w:before="0" w:after="0"/>
+            </w:pPr>
+            <w:r>
+              <w:rPr>
+                <w:rFonts w:ascii="Segoe UI" w:hAnsi="Segoe UI"/>
+                <w:color w:val="334155"/>
+                <w:sz w:val="17"/>
+              </w:rPr>
+              <w:t>Operativo Técnico</w:t>
+            </w:r>
+          </w:p>
+        </w:tc>
+        <w:tc>
+          <w:tcPr>
+            <w:tcW w:type="dxa" w:w="1605"/>
+            <w:shd w:val="clear" w:color="auto" w:fill="FFFFFF"/>
+            <w:tcBorders>
+              <w:top w:val="single" w:sz="4" w:space="0" w:color="CBD5E1"/>
+              <w:left w:val="single" w:sz="4" w:space="0" w:color="CBD5E1"/>
+              <w:bottom w:val="single" w:sz="4" w:space="0" w:color="CBD5E1"/>
+              <w:right w:val="single" w:sz="4" w:space="0" w:color="CBD5E1"/>
+            </w:tcBorders>
+            <w:tcMar>
+              <w:top w:w="80" w:type="dxa"/>
+              <w:bottom w:w="80" w:type="dxa"/>
+              <w:left w:w="100" w:type="dxa"/>
+              <w:right w:w="100" w:type="dxa"/>
+            </w:tcMar>
+          </w:tcPr>
+          <w:p>
+            <w:pPr>
+              <w:spacing w:before="0" w:after="0"/>
+            </w:pPr>
+            <w:r>
+              <w:rPr>
+                <w:rFonts w:ascii="Segoe UI" w:hAnsi="Segoe UI"/>
+                <w:color w:val="334155"/>
+                <w:sz w:val="17"/>
+              </w:rPr>
+              <w:t>SÍ (Crítico)</w:t>
+            </w:r>
+          </w:p>
+        </w:tc>
+        <w:tc>
+          <w:tcPr>
+            <w:tcW w:type="dxa" w:w="1605"/>
+            <w:shd w:val="clear" w:color="auto" w:fill="FFFFFF"/>
+            <w:tcBorders>
+              <w:top w:val="single" w:sz="4" w:space="0" w:color="CBD5E1"/>
+              <w:left w:val="single" w:sz="4" w:space="0" w:color="CBD5E1"/>
+              <w:bottom w:val="single" w:sz="4" w:space="0" w:color="CBD5E1"/>
+              <w:right w:val="single" w:sz="4" w:space="0" w:color="CBD5E1"/>
+            </w:tcBorders>
+            <w:tcMar>
+              <w:top w:w="80" w:type="dxa"/>
+              <w:bottom w:w="80" w:type="dxa"/>
+              <w:left w:w="100" w:type="dxa"/>
+              <w:right w:w="100" w:type="dxa"/>
+            </w:tcMar>
+          </w:tcPr>
+          <w:p>
+            <w:pPr>
+              <w:spacing w:before="0" w:after="0"/>
+            </w:pPr>
+            <w:r>
+              <w:rPr>
+                <w:rFonts w:ascii="Segoe UI" w:hAnsi="Segoe UI"/>
+                <w:color w:val="334155"/>
+                <w:sz w:val="17"/>
+              </w:rPr>
+              <w:t>Lunes a Viernes 42h</w:t>
+            </w:r>
+          </w:p>
+        </w:tc>
+        <w:tc>
+          <w:tcPr>
+            <w:tcW w:type="dxa" w:w="1605"/>
+            <w:shd w:val="clear" w:color="auto" w:fill="FFFFFF"/>
+            <w:tcBorders>
+              <w:top w:val="single" w:sz="4" w:space="0" w:color="CBD5E1"/>
+              <w:left w:val="single" w:sz="4" w:space="0" w:color="CBD5E1"/>
+              <w:bottom w:val="single" w:sz="4" w:space="0" w:color="CBD5E1"/>
+              <w:right w:val="single" w:sz="4" w:space="0" w:color="CBD5E1"/>
+            </w:tcBorders>
+            <w:tcMar>
+              <w:top w:w="80" w:type="dxa"/>
+              <w:bottom w:w="80" w:type="dxa"/>
+              <w:left w:w="100" w:type="dxa"/>
+              <w:right w:w="100" w:type="dxa"/>
+            </w:tcMar>
+          </w:tcPr>
+          <w:p>
+            <w:pPr>
+              <w:spacing w:before="0" w:after="0"/>
+            </w:pPr>
+            <w:r>
+              <w:rPr>
+                <w:rFonts w:ascii="Segoe UI" w:hAnsi="Segoe UI"/>
+                <w:color w:val="334155"/>
+                <w:sz w:val="17"/>
+              </w:rPr>
+              <w:t>Sábados para mantenimiento preventivo de máquinas</w:t>
+            </w:r>
+          </w:p>
+        </w:tc>
+      </w:tr>
+      <w:tr>
+        <w:tc>
+          <w:tcPr>
+            <w:tcW w:type="dxa" w:w="1605"/>
+            <w:shd w:val="clear" w:color="auto" w:fill="F8FAFC"/>
+            <w:tcBorders>
+              <w:top w:val="single" w:sz="4" w:space="0" w:color="CBD5E1"/>
+              <w:left w:val="single" w:sz="4" w:space="0" w:color="CBD5E1"/>
+              <w:bottom w:val="single" w:sz="4" w:space="0" w:color="CBD5E1"/>
+              <w:right w:val="single" w:sz="4" w:space="0" w:color="CBD5E1"/>
+            </w:tcBorders>
+            <w:tcMar>
+              <w:top w:w="80" w:type="dxa"/>
+              <w:bottom w:w="80" w:type="dxa"/>
+              <w:left w:w="100" w:type="dxa"/>
+              <w:right w:w="100" w:type="dxa"/>
+            </w:tcMar>
+          </w:tcPr>
+          <w:p>
+            <w:pPr>
+              <w:spacing w:before="0" w:after="0"/>
+            </w:pPr>
+            <w:r>
+              <w:rPr>
+                <w:rFonts w:ascii="Segoe UI" w:hAnsi="Segoe UI"/>
+                <w:b/>
+                <w:color w:val="0F172A"/>
+                <w:sz w:val="17"/>
+              </w:rPr>
+              <w:t>Patio / Cuadrilla General</w:t>
+            </w:r>
+          </w:p>
+        </w:tc>
+        <w:tc>
+          <w:tcPr>
+            <w:tcW w:type="dxa" w:w="1605"/>
+            <w:shd w:val="clear" w:color="auto" w:fill="F8FAFC"/>
+            <w:tcBorders>
+              <w:top w:val="single" w:sz="4" w:space="0" w:color="CBD5E1"/>
+              <w:left w:val="single" w:sz="4" w:space="0" w:color="CBD5E1"/>
+              <w:bottom w:val="single" w:sz="4" w:space="0" w:color="CBD5E1"/>
+              <w:right w:val="single" w:sz="4" w:space="0" w:color="CBD5E1"/>
+            </w:tcBorders>
+            <w:tcMar>
+              <w:top w:w="80" w:type="dxa"/>
+              <w:bottom w:w="80" w:type="dxa"/>
+              <w:left w:w="100" w:type="dxa"/>
+              <w:right w:w="100" w:type="dxa"/>
+            </w:tcMar>
+          </w:tcPr>
+          <w:p>
+            <w:pPr>
+              <w:spacing w:before="0" w:after="0"/>
+            </w:pPr>
+            <w:r>
+              <w:rPr>
+                <w:rFonts w:ascii="Segoe UI" w:hAnsi="Segoe UI"/>
+                <w:color w:val="334155"/>
+                <w:sz w:val="17"/>
+              </w:rPr>
+              <w:t>Ayudantes de Patio</w:t>
+            </w:r>
+          </w:p>
+        </w:tc>
+        <w:tc>
+          <w:tcPr>
+            <w:tcW w:type="dxa" w:w="1605"/>
+            <w:shd w:val="clear" w:color="auto" w:fill="F8FAFC"/>
+            <w:tcBorders>
+              <w:top w:val="single" w:sz="4" w:space="0" w:color="CBD5E1"/>
+              <w:left w:val="single" w:sz="4" w:space="0" w:color="CBD5E1"/>
+              <w:bottom w:val="single" w:sz="4" w:space="0" w:color="CBD5E1"/>
+              <w:right w:val="single" w:sz="4" w:space="0" w:color="CBD5E1"/>
+            </w:tcBorders>
+            <w:tcMar>
+              <w:top w:w="80" w:type="dxa"/>
+              <w:bottom w:w="80" w:type="dxa"/>
+              <w:left w:w="100" w:type="dxa"/>
+              <w:right w:w="100" w:type="dxa"/>
+            </w:tcMar>
+          </w:tcPr>
+          <w:p>
+            <w:pPr>
+              <w:spacing w:before="0" w:after="0"/>
+            </w:pPr>
+            <w:r>
+              <w:rPr>
+                <w:rFonts w:ascii="Segoe UI" w:hAnsi="Segoe UI"/>
+                <w:color w:val="334155"/>
+                <w:sz w:val="17"/>
+              </w:rPr>
+              <w:t>Operativo Patio</w:t>
+            </w:r>
+          </w:p>
+        </w:tc>
+        <w:tc>
+          <w:tcPr>
+            <w:tcW w:type="dxa" w:w="1605"/>
+            <w:shd w:val="clear" w:color="auto" w:fill="F8FAFC"/>
+            <w:tcBorders>
+              <w:top w:val="single" w:sz="4" w:space="0" w:color="CBD5E1"/>
+              <w:left w:val="single" w:sz="4" w:space="0" w:color="CBD5E1"/>
+              <w:bottom w:val="single" w:sz="4" w:space="0" w:color="CBD5E1"/>
+              <w:right w:val="single" w:sz="4" w:space="0" w:color="CBD5E1"/>
+            </w:tcBorders>
+            <w:tcMar>
+              <w:top w:w="80" w:type="dxa"/>
+              <w:bottom w:w="80" w:type="dxa"/>
+              <w:left w:w="100" w:type="dxa"/>
+              <w:right w:w="100" w:type="dxa"/>
+            </w:tcMar>
+          </w:tcPr>
+          <w:p>
+            <w:pPr>
+              <w:spacing w:before="0" w:after="0"/>
+            </w:pPr>
+            <w:r>
+              <w:rPr>
+                <w:rFonts w:ascii="Segoe UI" w:hAnsi="Segoe UI"/>
+                <w:color w:val="334155"/>
+                <w:sz w:val="17"/>
+              </w:rPr>
+              <w:t>NO</w:t>
+            </w:r>
+          </w:p>
+        </w:tc>
+        <w:tc>
+          <w:tcPr>
+            <w:tcW w:type="dxa" w:w="1605"/>
+            <w:shd w:val="clear" w:color="auto" w:fill="F8FAFC"/>
+            <w:tcBorders>
+              <w:top w:val="single" w:sz="4" w:space="0" w:color="CBD5E1"/>
+              <w:left w:val="single" w:sz="4" w:space="0" w:color="CBD5E1"/>
+              <w:bottom w:val="single" w:sz="4" w:space="0" w:color="CBD5E1"/>
+              <w:right w:val="single" w:sz="4" w:space="0" w:color="CBD5E1"/>
+            </w:tcBorders>
+            <w:tcMar>
+              <w:top w:w="80" w:type="dxa"/>
+              <w:bottom w:w="80" w:type="dxa"/>
+              <w:left w:w="100" w:type="dxa"/>
+              <w:right w:w="100" w:type="dxa"/>
+            </w:tcMar>
+          </w:tcPr>
+          <w:p>
+            <w:pPr>
+              <w:spacing w:before="0" w:after="0"/>
+            </w:pPr>
+            <w:r>
+              <w:rPr>
+                <w:rFonts w:ascii="Segoe UI" w:hAnsi="Segoe UI"/>
+                <w:color w:val="334155"/>
+                <w:sz w:val="17"/>
+              </w:rPr>
+              <w:t>Lunes a Viernes 42h</w:t>
+            </w:r>
+          </w:p>
+        </w:tc>
+        <w:tc>
+          <w:tcPr>
+            <w:tcW w:type="dxa" w:w="1605"/>
+            <w:shd w:val="clear" w:color="auto" w:fill="F8FAFC"/>
+            <w:tcBorders>
+              <w:top w:val="single" w:sz="4" w:space="0" w:color="CBD5E1"/>
+              <w:left w:val="single" w:sz="4" w:space="0" w:color="CBD5E1"/>
+              <w:bottom w:val="single" w:sz="4" w:space="0" w:color="CBD5E1"/>
+              <w:right w:val="single" w:sz="4" w:space="0" w:color="CBD5E1"/>
+            </w:tcBorders>
+            <w:tcMar>
+              <w:top w:w="80" w:type="dxa"/>
+              <w:bottom w:w="80" w:type="dxa"/>
+              <w:left w:w="100" w:type="dxa"/>
+              <w:right w:w="100" w:type="dxa"/>
+            </w:tcMar>
+          </w:tcPr>
+          <w:p>
+            <w:pPr>
+              <w:spacing w:before="0" w:after="0"/>
+            </w:pPr>
+            <w:r>
+              <w:rPr>
+                <w:rFonts w:ascii="Segoe UI" w:hAnsi="Segoe UI"/>
+                <w:color w:val="334155"/>
+                <w:sz w:val="17"/>
+              </w:rPr>
+              <w:t>Sáb/Dom/Festivo según requerimiento de cuadrilla</w:t>
+            </w:r>
+          </w:p>
+        </w:tc>
+      </w:tr>
+      <w:tr>
+        <w:tc>
+          <w:tcPr>
+            <w:tcW w:type="dxa" w:w="1605"/>
+            <w:shd w:val="clear" w:color="auto" w:fill="FFFFFF"/>
+            <w:tcBorders>
+              <w:top w:val="single" w:sz="4" w:space="0" w:color="CBD5E1"/>
+              <w:left w:val="single" w:sz="4" w:space="0" w:color="CBD5E1"/>
+              <w:bottom w:val="single" w:sz="4" w:space="0" w:color="CBD5E1"/>
+              <w:right w:val="single" w:sz="4" w:space="0" w:color="CBD5E1"/>
+            </w:tcBorders>
+            <w:tcMar>
+              <w:top w:w="80" w:type="dxa"/>
+              <w:bottom w:w="80" w:type="dxa"/>
+              <w:left w:w="100" w:type="dxa"/>
+              <w:right w:w="100" w:type="dxa"/>
+            </w:tcMar>
+          </w:tcPr>
+          <w:p>
+            <w:pPr>
+              <w:spacing w:before="0" w:after="0"/>
+            </w:pPr>
+            <w:r>
+              <w:rPr>
+                <w:rFonts w:ascii="Segoe UI" w:hAnsi="Segoe UI"/>
+                <w:b/>
+                <w:color w:val="0F172A"/>
+                <w:sz w:val="17"/>
+              </w:rPr>
+              <w:t>Patio / Oxicorte</w:t>
+            </w:r>
+          </w:p>
+        </w:tc>
+        <w:tc>
+          <w:tcPr>
+            <w:tcW w:type="dxa" w:w="1605"/>
+            <w:shd w:val="clear" w:color="auto" w:fill="FFFFFF"/>
+            <w:tcBorders>
+              <w:top w:val="single" w:sz="4" w:space="0" w:color="CBD5E1"/>
+              <w:left w:val="single" w:sz="4" w:space="0" w:color="CBD5E1"/>
+              <w:bottom w:val="single" w:sz="4" w:space="0" w:color="CBD5E1"/>
+              <w:right w:val="single" w:sz="4" w:space="0" w:color="CBD5E1"/>
+            </w:tcBorders>
+            <w:tcMar>
+              <w:top w:w="80" w:type="dxa"/>
+              <w:bottom w:w="80" w:type="dxa"/>
+              <w:left w:w="100" w:type="dxa"/>
+              <w:right w:w="100" w:type="dxa"/>
+            </w:tcMar>
+          </w:tcPr>
+          <w:p>
+            <w:pPr>
+              <w:spacing w:before="0" w:after="0"/>
+            </w:pPr>
+            <w:r>
+              <w:rPr>
+                <w:rFonts w:ascii="Segoe UI" w:hAnsi="Segoe UI"/>
+                <w:color w:val="334155"/>
+                <w:sz w:val="17"/>
+              </w:rPr>
+              <w:t>Oxigenista / Clasificador</w:t>
+            </w:r>
+          </w:p>
+        </w:tc>
+        <w:tc>
+          <w:tcPr>
+            <w:tcW w:type="dxa" w:w="1605"/>
+            <w:shd w:val="clear" w:color="auto" w:fill="FFFFFF"/>
+            <w:tcBorders>
+              <w:top w:val="single" w:sz="4" w:space="0" w:color="CBD5E1"/>
+              <w:left w:val="single" w:sz="4" w:space="0" w:color="CBD5E1"/>
+              <w:bottom w:val="single" w:sz="4" w:space="0" w:color="CBD5E1"/>
+              <w:right w:val="single" w:sz="4" w:space="0" w:color="CBD5E1"/>
+            </w:tcBorders>
+            <w:tcMar>
+              <w:top w:w="80" w:type="dxa"/>
+              <w:bottom w:w="80" w:type="dxa"/>
+              <w:left w:w="100" w:type="dxa"/>
+              <w:right w:w="100" w:type="dxa"/>
+            </w:tcMar>
+          </w:tcPr>
+          <w:p>
+            <w:pPr>
+              <w:spacing w:before="0" w:after="0"/>
+            </w:pPr>
+            <w:r>
+              <w:rPr>
+                <w:rFonts w:ascii="Segoe UI" w:hAnsi="Segoe UI"/>
+                <w:color w:val="334155"/>
+                <w:sz w:val="17"/>
+              </w:rPr>
+              <w:t>Operativo Patio</w:t>
+            </w:r>
+          </w:p>
+        </w:tc>
+        <w:tc>
+          <w:tcPr>
+            <w:tcW w:type="dxa" w:w="1605"/>
+            <w:shd w:val="clear" w:color="auto" w:fill="FFFFFF"/>
+            <w:tcBorders>
+              <w:top w:val="single" w:sz="4" w:space="0" w:color="CBD5E1"/>
+              <w:left w:val="single" w:sz="4" w:space="0" w:color="CBD5E1"/>
+              <w:bottom w:val="single" w:sz="4" w:space="0" w:color="CBD5E1"/>
+              <w:right w:val="single" w:sz="4" w:space="0" w:color="CBD5E1"/>
+            </w:tcBorders>
+            <w:tcMar>
+              <w:top w:w="80" w:type="dxa"/>
+              <w:bottom w:w="80" w:type="dxa"/>
+              <w:left w:w="100" w:type="dxa"/>
+              <w:right w:w="100" w:type="dxa"/>
+            </w:tcMar>
+          </w:tcPr>
+          <w:p>
+            <w:pPr>
+              <w:spacing w:before="0" w:after="0"/>
+            </w:pPr>
+            <w:r>
+              <w:rPr>
+                <w:rFonts w:ascii="Segoe UI" w:hAnsi="Segoe UI"/>
+                <w:color w:val="334155"/>
+                <w:sz w:val="17"/>
+              </w:rPr>
+              <w:t>SÍ (Crítico)</w:t>
+            </w:r>
+          </w:p>
+        </w:tc>
+        <w:tc>
+          <w:tcPr>
+            <w:tcW w:type="dxa" w:w="1605"/>
+            <w:shd w:val="clear" w:color="auto" w:fill="FFFFFF"/>
+            <w:tcBorders>
+              <w:top w:val="single" w:sz="4" w:space="0" w:color="CBD5E1"/>
+              <w:left w:val="single" w:sz="4" w:space="0" w:color="CBD5E1"/>
+              <w:bottom w:val="single" w:sz="4" w:space="0" w:color="CBD5E1"/>
+              <w:right w:val="single" w:sz="4" w:space="0" w:color="CBD5E1"/>
+            </w:tcBorders>
+            <w:tcMar>
+              <w:top w:w="80" w:type="dxa"/>
+              <w:bottom w:w="80" w:type="dxa"/>
+              <w:left w:w="100" w:type="dxa"/>
+              <w:right w:w="100" w:type="dxa"/>
+            </w:tcMar>
+          </w:tcPr>
+          <w:p>
+            <w:pPr>
+              <w:spacing w:before="0" w:after="0"/>
+            </w:pPr>
+            <w:r>
+              <w:rPr>
+                <w:rFonts w:ascii="Segoe UI" w:hAnsi="Segoe UI"/>
+                <w:color w:val="334155"/>
+                <w:sz w:val="17"/>
+              </w:rPr>
+              <w:t>Lunes a Viernes 42h</w:t>
+            </w:r>
+          </w:p>
+        </w:tc>
+        <w:tc>
+          <w:tcPr>
+            <w:tcW w:type="dxa" w:w="1605"/>
+            <w:shd w:val="clear" w:color="auto" w:fill="FFFFFF"/>
+            <w:tcBorders>
+              <w:top w:val="single" w:sz="4" w:space="0" w:color="CBD5E1"/>
+              <w:left w:val="single" w:sz="4" w:space="0" w:color="CBD5E1"/>
+              <w:bottom w:val="single" w:sz="4" w:space="0" w:color="CBD5E1"/>
+              <w:right w:val="single" w:sz="4" w:space="0" w:color="CBD5E1"/>
+            </w:tcBorders>
+            <w:tcMar>
+              <w:top w:w="80" w:type="dxa"/>
+              <w:bottom w:w="80" w:type="dxa"/>
+              <w:left w:w="100" w:type="dxa"/>
+              <w:right w:w="100" w:type="dxa"/>
+            </w:tcMar>
+          </w:tcPr>
+          <w:p>
+            <w:pPr>
+              <w:spacing w:before="0" w:after="0"/>
+            </w:pPr>
+            <w:r>
+              <w:rPr>
+                <w:rFonts w:ascii="Segoe UI" w:hAnsi="Segoe UI"/>
+                <w:color w:val="334155"/>
+                <w:sz w:val="17"/>
+              </w:rPr>
+              <w:t>Sábados en jornadas de corte de vigas/estructuras</w:t>
+            </w:r>
+          </w:p>
+        </w:tc>
+      </w:tr>
+      <w:tr>
+        <w:tc>
+          <w:tcPr>
+            <w:tcW w:type="dxa" w:w="1605"/>
+            <w:shd w:val="clear" w:color="auto" w:fill="F8FAFC"/>
+            <w:tcBorders>
+              <w:top w:val="single" w:sz="4" w:space="0" w:color="CBD5E1"/>
+              <w:left w:val="single" w:sz="4" w:space="0" w:color="CBD5E1"/>
+              <w:bottom w:val="single" w:sz="4" w:space="0" w:color="CBD5E1"/>
+              <w:right w:val="single" w:sz="4" w:space="0" w:color="CBD5E1"/>
+            </w:tcBorders>
+            <w:tcMar>
+              <w:top w:w="80" w:type="dxa"/>
+              <w:bottom w:w="80" w:type="dxa"/>
+              <w:left w:w="100" w:type="dxa"/>
+              <w:right w:w="100" w:type="dxa"/>
+            </w:tcMar>
+          </w:tcPr>
+          <w:p>
+            <w:pPr>
+              <w:spacing w:before="0" w:after="0"/>
+            </w:pPr>
+            <w:r>
+              <w:rPr>
+                <w:rFonts w:ascii="Segoe UI" w:hAnsi="Segoe UI"/>
+                <w:b/>
+                <w:color w:val="0F172A"/>
+                <w:sz w:val="17"/>
+              </w:rPr>
+              <w:t>Portería y Pesaje</w:t>
+            </w:r>
+          </w:p>
+        </w:tc>
+        <w:tc>
+          <w:tcPr>
+            <w:tcW w:type="dxa" w:w="1605"/>
+            <w:shd w:val="clear" w:color="auto" w:fill="F8FAFC"/>
+            <w:tcBorders>
+              <w:top w:val="single" w:sz="4" w:space="0" w:color="CBD5E1"/>
+              <w:left w:val="single" w:sz="4" w:space="0" w:color="CBD5E1"/>
+              <w:bottom w:val="single" w:sz="4" w:space="0" w:color="CBD5E1"/>
+              <w:right w:val="single" w:sz="4" w:space="0" w:color="CBD5E1"/>
+            </w:tcBorders>
+            <w:tcMar>
+              <w:top w:w="80" w:type="dxa"/>
+              <w:bottom w:w="80" w:type="dxa"/>
+              <w:left w:w="100" w:type="dxa"/>
+              <w:right w:w="100" w:type="dxa"/>
+            </w:tcMar>
+          </w:tcPr>
+          <w:p>
+            <w:pPr>
+              <w:spacing w:before="0" w:after="0"/>
+            </w:pPr>
+            <w:r>
+              <w:rPr>
+                <w:rFonts w:ascii="Segoe UI" w:hAnsi="Segoe UI"/>
+                <w:color w:val="334155"/>
+                <w:sz w:val="17"/>
+              </w:rPr>
+              <w:t>Operador Báscula / Garita</w:t>
+            </w:r>
+          </w:p>
+        </w:tc>
+        <w:tc>
+          <w:tcPr>
+            <w:tcW w:type="dxa" w:w="1605"/>
+            <w:shd w:val="clear" w:color="auto" w:fill="F8FAFC"/>
+            <w:tcBorders>
+              <w:top w:val="single" w:sz="4" w:space="0" w:color="CBD5E1"/>
+              <w:left w:val="single" w:sz="4" w:space="0" w:color="CBD5E1"/>
+              <w:bottom w:val="single" w:sz="4" w:space="0" w:color="CBD5E1"/>
+              <w:right w:val="single" w:sz="4" w:space="0" w:color="CBD5E1"/>
+            </w:tcBorders>
+            <w:tcMar>
+              <w:top w:w="80" w:type="dxa"/>
+              <w:bottom w:w="80" w:type="dxa"/>
+              <w:left w:w="100" w:type="dxa"/>
+              <w:right w:w="100" w:type="dxa"/>
+            </w:tcMar>
+          </w:tcPr>
+          <w:p>
+            <w:pPr>
+              <w:spacing w:before="0" w:after="0"/>
+            </w:pPr>
+            <w:r>
+              <w:rPr>
+                <w:rFonts w:ascii="Segoe UI" w:hAnsi="Segoe UI"/>
+                <w:color w:val="334155"/>
+                <w:sz w:val="17"/>
+              </w:rPr>
+              <w:t>Operativo Control</w:t>
+            </w:r>
+          </w:p>
+        </w:tc>
+        <w:tc>
+          <w:tcPr>
+            <w:tcW w:type="dxa" w:w="1605"/>
+            <w:shd w:val="clear" w:color="auto" w:fill="F8FAFC"/>
+            <w:tcBorders>
+              <w:top w:val="single" w:sz="4" w:space="0" w:color="CBD5E1"/>
+              <w:left w:val="single" w:sz="4" w:space="0" w:color="CBD5E1"/>
+              <w:bottom w:val="single" w:sz="4" w:space="0" w:color="CBD5E1"/>
+              <w:right w:val="single" w:sz="4" w:space="0" w:color="CBD5E1"/>
+            </w:tcBorders>
+            <w:tcMar>
+              <w:top w:w="80" w:type="dxa"/>
+              <w:bottom w:w="80" w:type="dxa"/>
+              <w:left w:w="100" w:type="dxa"/>
+              <w:right w:w="100" w:type="dxa"/>
+            </w:tcMar>
+          </w:tcPr>
+          <w:p>
+            <w:pPr>
+              <w:spacing w:before="0" w:after="0"/>
+            </w:pPr>
+            <w:r>
+              <w:rPr>
+                <w:rFonts w:ascii="Segoe UI" w:hAnsi="Segoe UI"/>
+                <w:color w:val="334155"/>
+                <w:sz w:val="17"/>
+              </w:rPr>
+              <w:t>SÍ (Crítico)</w:t>
+            </w:r>
+          </w:p>
+        </w:tc>
+        <w:tc>
+          <w:tcPr>
+            <w:tcW w:type="dxa" w:w="1605"/>
+            <w:shd w:val="clear" w:color="auto" w:fill="F8FAFC"/>
+            <w:tcBorders>
+              <w:top w:val="single" w:sz="4" w:space="0" w:color="CBD5E1"/>
+              <w:left w:val="single" w:sz="4" w:space="0" w:color="CBD5E1"/>
+              <w:bottom w:val="single" w:sz="4" w:space="0" w:color="CBD5E1"/>
+              <w:right w:val="single" w:sz="4" w:space="0" w:color="CBD5E1"/>
+            </w:tcBorders>
+            <w:tcMar>
+              <w:top w:w="80" w:type="dxa"/>
+              <w:bottom w:w="80" w:type="dxa"/>
+              <w:left w:w="100" w:type="dxa"/>
+              <w:right w:w="100" w:type="dxa"/>
+            </w:tcMar>
+          </w:tcPr>
+          <w:p>
+            <w:pPr>
+              <w:spacing w:before="0" w:after="0"/>
+            </w:pPr>
+            <w:r>
+              <w:rPr>
+                <w:rFonts w:ascii="Segoe UI" w:hAnsi="Segoe UI"/>
+                <w:color w:val="334155"/>
+                <w:sz w:val="17"/>
+              </w:rPr>
+              <w:t>Lunes a Viernes 42h</w:t>
+            </w:r>
+          </w:p>
+        </w:tc>
+        <w:tc>
+          <w:tcPr>
+            <w:tcW w:type="dxa" w:w="1605"/>
+            <w:shd w:val="clear" w:color="auto" w:fill="F8FAFC"/>
+            <w:tcBorders>
+              <w:top w:val="single" w:sz="4" w:space="0" w:color="CBD5E1"/>
+              <w:left w:val="single" w:sz="4" w:space="0" w:color="CBD5E1"/>
+              <w:bottom w:val="single" w:sz="4" w:space="0" w:color="CBD5E1"/>
+              <w:right w:val="single" w:sz="4" w:space="0" w:color="CBD5E1"/>
+            </w:tcBorders>
+            <w:tcMar>
+              <w:top w:w="80" w:type="dxa"/>
+              <w:bottom w:w="80" w:type="dxa"/>
+              <w:left w:w="100" w:type="dxa"/>
+              <w:right w:w="100" w:type="dxa"/>
+            </w:tcMar>
+          </w:tcPr>
+          <w:p>
+            <w:pPr>
+              <w:spacing w:before="0" w:after="0"/>
+            </w:pPr>
+            <w:r>
+              <w:rPr>
+                <w:rFonts w:ascii="Segoe UI" w:hAnsi="Segoe UI"/>
+                <w:color w:val="334155"/>
+                <w:sz w:val="17"/>
+              </w:rPr>
+              <w:t>Turno especial si entran camiones en fin de semana</w:t>
+            </w:r>
+          </w:p>
+        </w:tc>
+      </w:tr>
+      <w:tr>
+        <w:tc>
+          <w:tcPr>
+            <w:tcW w:type="dxa" w:w="1605"/>
+            <w:shd w:val="clear" w:color="auto" w:fill="FFFFFF"/>
+            <w:tcBorders>
+              <w:top w:val="single" w:sz="4" w:space="0" w:color="CBD5E1"/>
+              <w:left w:val="single" w:sz="4" w:space="0" w:color="CBD5E1"/>
+              <w:bottom w:val="single" w:sz="4" w:space="0" w:color="CBD5E1"/>
+              <w:right w:val="single" w:sz="4" w:space="0" w:color="CBD5E1"/>
+            </w:tcBorders>
+            <w:tcMar>
+              <w:top w:w="80" w:type="dxa"/>
+              <w:bottom w:w="80" w:type="dxa"/>
+              <w:left w:w="100" w:type="dxa"/>
+              <w:right w:w="100" w:type="dxa"/>
+            </w:tcMar>
+          </w:tcPr>
+          <w:p>
+            <w:pPr>
+              <w:spacing w:before="0" w:after="0"/>
+            </w:pPr>
+            <w:r>
+              <w:rPr>
+                <w:rFonts w:ascii="Segoe UI" w:hAnsi="Segoe UI"/>
+                <w:b/>
+                <w:color w:val="0F172A"/>
+                <w:sz w:val="17"/>
+              </w:rPr>
+              <w:t>Administración / Contable</w:t>
+            </w:r>
+          </w:p>
+        </w:tc>
+        <w:tc>
+          <w:tcPr>
+            <w:tcW w:type="dxa" w:w="1605"/>
+            <w:shd w:val="clear" w:color="auto" w:fill="FFFFFF"/>
+            <w:tcBorders>
+              <w:top w:val="single" w:sz="4" w:space="0" w:color="CBD5E1"/>
+              <w:left w:val="single" w:sz="4" w:space="0" w:color="CBD5E1"/>
+              <w:bottom w:val="single" w:sz="4" w:space="0" w:color="CBD5E1"/>
+              <w:right w:val="single" w:sz="4" w:space="0" w:color="CBD5E1"/>
+            </w:tcBorders>
+            <w:tcMar>
+              <w:top w:w="80" w:type="dxa"/>
+              <w:bottom w:w="80" w:type="dxa"/>
+              <w:left w:w="100" w:type="dxa"/>
+              <w:right w:w="100" w:type="dxa"/>
+            </w:tcMar>
+          </w:tcPr>
+          <w:p>
+            <w:pPr>
+              <w:spacing w:before="0" w:after="0"/>
+            </w:pPr>
+            <w:r>
+              <w:rPr>
+                <w:rFonts w:ascii="Segoe UI" w:hAnsi="Segoe UI"/>
+                <w:color w:val="334155"/>
+                <w:sz w:val="17"/>
+              </w:rPr>
+              <w:t>Contadores / Contador General</w:t>
+            </w:r>
+          </w:p>
+        </w:tc>
+        <w:tc>
+          <w:tcPr>
+            <w:tcW w:type="dxa" w:w="1605"/>
+            <w:shd w:val="clear" w:color="auto" w:fill="FFFFFF"/>
+            <w:tcBorders>
+              <w:top w:val="single" w:sz="4" w:space="0" w:color="CBD5E1"/>
+              <w:left w:val="single" w:sz="4" w:space="0" w:color="CBD5E1"/>
+              <w:bottom w:val="single" w:sz="4" w:space="0" w:color="CBD5E1"/>
+              <w:right w:val="single" w:sz="4" w:space="0" w:color="CBD5E1"/>
+            </w:tcBorders>
+            <w:tcMar>
+              <w:top w:w="80" w:type="dxa"/>
+              <w:bottom w:w="80" w:type="dxa"/>
+              <w:left w:w="100" w:type="dxa"/>
+              <w:right w:w="100" w:type="dxa"/>
+            </w:tcMar>
+          </w:tcPr>
+          <w:p>
+            <w:pPr>
+              <w:spacing w:before="0" w:after="0"/>
+            </w:pPr>
+            <w:r>
+              <w:rPr>
+                <w:rFonts w:ascii="Segoe UI" w:hAnsi="Segoe UI"/>
+                <w:color w:val="334155"/>
+                <w:sz w:val="17"/>
+              </w:rPr>
+              <w:t>Administrativo</w:t>
+            </w:r>
+          </w:p>
+        </w:tc>
+        <w:tc>
+          <w:tcPr>
+            <w:tcW w:type="dxa" w:w="1605"/>
+            <w:shd w:val="clear" w:color="auto" w:fill="FFFFFF"/>
+            <w:tcBorders>
+              <w:top w:val="single" w:sz="4" w:space="0" w:color="CBD5E1"/>
+              <w:left w:val="single" w:sz="4" w:space="0" w:color="CBD5E1"/>
+              <w:bottom w:val="single" w:sz="4" w:space="0" w:color="CBD5E1"/>
+              <w:right w:val="single" w:sz="4" w:space="0" w:color="CBD5E1"/>
+            </w:tcBorders>
+            <w:tcMar>
+              <w:top w:w="80" w:type="dxa"/>
+              <w:bottom w:w="80" w:type="dxa"/>
+              <w:left w:w="100" w:type="dxa"/>
+              <w:right w:w="100" w:type="dxa"/>
+            </w:tcMar>
+          </w:tcPr>
+          <w:p>
+            <w:pPr>
+              <w:spacing w:before="0" w:after="0"/>
+            </w:pPr>
+            <w:r>
+              <w:rPr>
+                <w:rFonts w:ascii="Segoe UI" w:hAnsi="Segoe UI"/>
+                <w:color w:val="334155"/>
+                <w:sz w:val="17"/>
+              </w:rPr>
+              <w:t>NO</w:t>
+            </w:r>
+          </w:p>
+        </w:tc>
+        <w:tc>
+          <w:tcPr>
+            <w:tcW w:type="dxa" w:w="1605"/>
+            <w:shd w:val="clear" w:color="auto" w:fill="FFFFFF"/>
+            <w:tcBorders>
+              <w:top w:val="single" w:sz="4" w:space="0" w:color="CBD5E1"/>
+              <w:left w:val="single" w:sz="4" w:space="0" w:color="CBD5E1"/>
+              <w:bottom w:val="single" w:sz="4" w:space="0" w:color="CBD5E1"/>
+              <w:right w:val="single" w:sz="4" w:space="0" w:color="CBD5E1"/>
+            </w:tcBorders>
+            <w:tcMar>
+              <w:top w:w="80" w:type="dxa"/>
+              <w:bottom w:w="80" w:type="dxa"/>
+              <w:left w:w="100" w:type="dxa"/>
+              <w:right w:w="100" w:type="dxa"/>
+            </w:tcMar>
+          </w:tcPr>
+          <w:p>
+            <w:pPr>
+              <w:spacing w:before="0" w:after="0"/>
+            </w:pPr>
+            <w:r>
+              <w:rPr>
+                <w:rFonts w:ascii="Segoe UI" w:hAnsi="Segoe UI"/>
+                <w:color w:val="334155"/>
+                <w:sz w:val="17"/>
+              </w:rPr>
+              <w:t>Lunes a Viernes 42h</w:t>
+            </w:r>
+          </w:p>
+        </w:tc>
+        <w:tc>
+          <w:tcPr>
+            <w:tcW w:type="dxa" w:w="1605"/>
+            <w:shd w:val="clear" w:color="auto" w:fill="FFFFFF"/>
+            <w:tcBorders>
+              <w:top w:val="single" w:sz="4" w:space="0" w:color="CBD5E1"/>
+              <w:left w:val="single" w:sz="4" w:space="0" w:color="CBD5E1"/>
+              <w:bottom w:val="single" w:sz="4" w:space="0" w:color="CBD5E1"/>
+              <w:right w:val="single" w:sz="4" w:space="0" w:color="CBD5E1"/>
+            </w:tcBorders>
+            <w:tcMar>
+              <w:top w:w="80" w:type="dxa"/>
+              <w:bottom w:w="80" w:type="dxa"/>
+              <w:left w:w="100" w:type="dxa"/>
+              <w:right w:w="100" w:type="dxa"/>
+            </w:tcMar>
+          </w:tcPr>
+          <w:p>
+            <w:pPr>
+              <w:spacing w:before="0" w:after="0"/>
+            </w:pPr>
+            <w:r>
+              <w:rPr>
+                <w:rFonts w:ascii="Segoe UI" w:hAnsi="Segoe UI"/>
+                <w:color w:val="334155"/>
+                <w:sz w:val="17"/>
+              </w:rPr>
+              <w:t>NO LABORAL (Descanso obligatorio remunerado)</w:t>
+            </w:r>
+          </w:p>
+        </w:tc>
+      </w:tr>
+      <w:tr>
+        <w:tc>
+          <w:tcPr>
+            <w:tcW w:type="dxa" w:w="1605"/>
+            <w:shd w:val="clear" w:color="auto" w:fill="F8FAFC"/>
+            <w:tcBorders>
+              <w:top w:val="single" w:sz="4" w:space="0" w:color="CBD5E1"/>
+              <w:left w:val="single" w:sz="4" w:space="0" w:color="CBD5E1"/>
+              <w:bottom w:val="single" w:sz="4" w:space="0" w:color="CBD5E1"/>
+              <w:right w:val="single" w:sz="4" w:space="0" w:color="CBD5E1"/>
+            </w:tcBorders>
+            <w:tcMar>
+              <w:top w:w="80" w:type="dxa"/>
+              <w:bottom w:w="80" w:type="dxa"/>
+              <w:left w:w="100" w:type="dxa"/>
+              <w:right w:w="100" w:type="dxa"/>
+            </w:tcMar>
+          </w:tcPr>
+          <w:p>
+            <w:pPr>
+              <w:spacing w:before="0" w:after="0"/>
+            </w:pPr>
+            <w:r>
+              <w:rPr>
+                <w:rFonts w:ascii="Segoe UI" w:hAnsi="Segoe UI"/>
+                <w:b/>
+                <w:color w:val="0F172A"/>
+                <w:sz w:val="17"/>
+              </w:rPr>
+              <w:t>Administración / Contable</w:t>
+            </w:r>
+          </w:p>
+        </w:tc>
+        <w:tc>
+          <w:tcPr>
+            <w:tcW w:type="dxa" w:w="1605"/>
+            <w:shd w:val="clear" w:color="auto" w:fill="F8FAFC"/>
+            <w:tcBorders>
+              <w:top w:val="single" w:sz="4" w:space="0" w:color="CBD5E1"/>
+              <w:left w:val="single" w:sz="4" w:space="0" w:color="CBD5E1"/>
+              <w:bottom w:val="single" w:sz="4" w:space="0" w:color="CBD5E1"/>
+              <w:right w:val="single" w:sz="4" w:space="0" w:color="CBD5E1"/>
+            </w:tcBorders>
+            <w:tcMar>
+              <w:top w:w="80" w:type="dxa"/>
+              <w:bottom w:w="80" w:type="dxa"/>
+              <w:left w:w="100" w:type="dxa"/>
+              <w:right w:w="100" w:type="dxa"/>
+            </w:tcMar>
+          </w:tcPr>
+          <w:p>
+            <w:pPr>
+              <w:spacing w:before="0" w:after="0"/>
+            </w:pPr>
+            <w:r>
+              <w:rPr>
+                <w:rFonts w:ascii="Segoe UI" w:hAnsi="Segoe UI"/>
+                <w:color w:val="334155"/>
+                <w:sz w:val="17"/>
+              </w:rPr>
+              <w:t>Auxiliar Contable</w:t>
+            </w:r>
+          </w:p>
+        </w:tc>
+        <w:tc>
+          <w:tcPr>
+            <w:tcW w:type="dxa" w:w="1605"/>
+            <w:shd w:val="clear" w:color="auto" w:fill="F8FAFC"/>
+            <w:tcBorders>
+              <w:top w:val="single" w:sz="4" w:space="0" w:color="CBD5E1"/>
+              <w:left w:val="single" w:sz="4" w:space="0" w:color="CBD5E1"/>
+              <w:bottom w:val="single" w:sz="4" w:space="0" w:color="CBD5E1"/>
+              <w:right w:val="single" w:sz="4" w:space="0" w:color="CBD5E1"/>
+            </w:tcBorders>
+            <w:tcMar>
+              <w:top w:w="80" w:type="dxa"/>
+              <w:bottom w:w="80" w:type="dxa"/>
+              <w:left w:w="100" w:type="dxa"/>
+              <w:right w:w="100" w:type="dxa"/>
+            </w:tcMar>
+          </w:tcPr>
+          <w:p>
+            <w:pPr>
+              <w:spacing w:before="0" w:after="0"/>
+            </w:pPr>
+            <w:r>
+              <w:rPr>
+                <w:rFonts w:ascii="Segoe UI" w:hAnsi="Segoe UI"/>
+                <w:color w:val="334155"/>
+                <w:sz w:val="17"/>
+              </w:rPr>
+              <w:t>Administrativo</w:t>
+            </w:r>
+          </w:p>
+        </w:tc>
+        <w:tc>
+          <w:tcPr>
+            <w:tcW w:type="dxa" w:w="1605"/>
+            <w:shd w:val="clear" w:color="auto" w:fill="F8FAFC"/>
+            <w:tcBorders>
+              <w:top w:val="single" w:sz="4" w:space="0" w:color="CBD5E1"/>
+              <w:left w:val="single" w:sz="4" w:space="0" w:color="CBD5E1"/>
+              <w:bottom w:val="single" w:sz="4" w:space="0" w:color="CBD5E1"/>
+              <w:right w:val="single" w:sz="4" w:space="0" w:color="CBD5E1"/>
+            </w:tcBorders>
+            <w:tcMar>
+              <w:top w:w="80" w:type="dxa"/>
+              <w:bottom w:w="80" w:type="dxa"/>
+              <w:left w:w="100" w:type="dxa"/>
+              <w:right w:w="100" w:type="dxa"/>
+            </w:tcMar>
+          </w:tcPr>
+          <w:p>
+            <w:pPr>
+              <w:spacing w:before="0" w:after="0"/>
+            </w:pPr>
+            <w:r>
+              <w:rPr>
+                <w:rFonts w:ascii="Segoe UI" w:hAnsi="Segoe UI"/>
+                <w:color w:val="334155"/>
+                <w:sz w:val="17"/>
+              </w:rPr>
+              <w:t>NO</w:t>
+            </w:r>
+          </w:p>
+        </w:tc>
+        <w:tc>
+          <w:tcPr>
+            <w:tcW w:type="dxa" w:w="1605"/>
+            <w:shd w:val="clear" w:color="auto" w:fill="F8FAFC"/>
+            <w:tcBorders>
+              <w:top w:val="single" w:sz="4" w:space="0" w:color="CBD5E1"/>
+              <w:left w:val="single" w:sz="4" w:space="0" w:color="CBD5E1"/>
+              <w:bottom w:val="single" w:sz="4" w:space="0" w:color="CBD5E1"/>
+              <w:right w:val="single" w:sz="4" w:space="0" w:color="CBD5E1"/>
+            </w:tcBorders>
+            <w:tcMar>
+              <w:top w:w="80" w:type="dxa"/>
+              <w:bottom w:w="80" w:type="dxa"/>
+              <w:left w:w="100" w:type="dxa"/>
+              <w:right w:w="100" w:type="dxa"/>
+            </w:tcMar>
+          </w:tcPr>
+          <w:p>
+            <w:pPr>
+              <w:spacing w:before="0" w:after="0"/>
+            </w:pPr>
+            <w:r>
+              <w:rPr>
+                <w:rFonts w:ascii="Segoe UI" w:hAnsi="Segoe UI"/>
+                <w:color w:val="334155"/>
+                <w:sz w:val="17"/>
+              </w:rPr>
+              <w:t>Lunes a Viernes 42h</w:t>
+            </w:r>
+          </w:p>
+        </w:tc>
+        <w:tc>
+          <w:tcPr>
+            <w:tcW w:type="dxa" w:w="1605"/>
+            <w:shd w:val="clear" w:color="auto" w:fill="F8FAFC"/>
+            <w:tcBorders>
+              <w:top w:val="single" w:sz="4" w:space="0" w:color="CBD5E1"/>
+              <w:left w:val="single" w:sz="4" w:space="0" w:color="CBD5E1"/>
+              <w:bottom w:val="single" w:sz="4" w:space="0" w:color="CBD5E1"/>
+              <w:right w:val="single" w:sz="4" w:space="0" w:color="CBD5E1"/>
+            </w:tcBorders>
+            <w:tcMar>
+              <w:top w:w="80" w:type="dxa"/>
+              <w:bottom w:w="80" w:type="dxa"/>
+              <w:left w:w="100" w:type="dxa"/>
+              <w:right w:w="100" w:type="dxa"/>
+            </w:tcMar>
+          </w:tcPr>
+          <w:p>
+            <w:pPr>
+              <w:spacing w:before="0" w:after="0"/>
+            </w:pPr>
+            <w:r>
+              <w:rPr>
+                <w:rFonts w:ascii="Segoe UI" w:hAnsi="Segoe UI"/>
+                <w:color w:val="334155"/>
+                <w:sz w:val="17"/>
+              </w:rPr>
+              <w:t>NO LABORAL (Descanso obligatorio remunerado)</w:t>
+            </w:r>
+          </w:p>
+        </w:tc>
+      </w:tr>
+      <w:tr>
+        <w:tc>
+          <w:tcPr>
+            <w:tcW w:type="dxa" w:w="1605"/>
+            <w:shd w:val="clear" w:color="auto" w:fill="FFFFFF"/>
+            <w:tcBorders>
+              <w:top w:val="single" w:sz="4" w:space="0" w:color="CBD5E1"/>
+              <w:left w:val="single" w:sz="4" w:space="0" w:color="CBD5E1"/>
+              <w:bottom w:val="single" w:sz="4" w:space="0" w:color="CBD5E1"/>
+              <w:right w:val="single" w:sz="4" w:space="0" w:color="CBD5E1"/>
+            </w:tcBorders>
+            <w:tcMar>
+              <w:top w:w="80" w:type="dxa"/>
+              <w:bottom w:w="80" w:type="dxa"/>
+              <w:left w:w="100" w:type="dxa"/>
+              <w:right w:w="100" w:type="dxa"/>
+            </w:tcMar>
+          </w:tcPr>
+          <w:p>
+            <w:pPr>
+              <w:spacing w:before="0" w:after="0"/>
+            </w:pPr>
+            <w:r>
+              <w:rPr>
+                <w:rFonts w:ascii="Segoe UI" w:hAnsi="Segoe UI"/>
+                <w:b/>
+                <w:color w:val="0F172A"/>
+                <w:sz w:val="17"/>
+              </w:rPr>
+              <w:t>Administración / Gestión</w:t>
+            </w:r>
+          </w:p>
+        </w:tc>
+        <w:tc>
+          <w:tcPr>
+            <w:tcW w:type="dxa" w:w="1605"/>
+            <w:shd w:val="clear" w:color="auto" w:fill="FFFFFF"/>
+            <w:tcBorders>
+              <w:top w:val="single" w:sz="4" w:space="0" w:color="CBD5E1"/>
+              <w:left w:val="single" w:sz="4" w:space="0" w:color="CBD5E1"/>
+              <w:bottom w:val="single" w:sz="4" w:space="0" w:color="CBD5E1"/>
+              <w:right w:val="single" w:sz="4" w:space="0" w:color="CBD5E1"/>
+            </w:tcBorders>
+            <w:tcMar>
+              <w:top w:w="80" w:type="dxa"/>
+              <w:bottom w:w="80" w:type="dxa"/>
+              <w:left w:w="100" w:type="dxa"/>
+              <w:right w:w="100" w:type="dxa"/>
+            </w:tcMar>
+          </w:tcPr>
+          <w:p>
+            <w:pPr>
+              <w:spacing w:before="0" w:after="0"/>
+            </w:pPr>
+            <w:r>
+              <w:rPr>
+                <w:rFonts w:ascii="Segoe UI" w:hAnsi="Segoe UI"/>
+                <w:color w:val="334155"/>
+                <w:sz w:val="17"/>
+              </w:rPr>
+              <w:t>Auxiliares Administrativos</w:t>
+            </w:r>
+          </w:p>
+        </w:tc>
+        <w:tc>
+          <w:tcPr>
+            <w:tcW w:type="dxa" w:w="1605"/>
+            <w:shd w:val="clear" w:color="auto" w:fill="FFFFFF"/>
+            <w:tcBorders>
+              <w:top w:val="single" w:sz="4" w:space="0" w:color="CBD5E1"/>
+              <w:left w:val="single" w:sz="4" w:space="0" w:color="CBD5E1"/>
+              <w:bottom w:val="single" w:sz="4" w:space="0" w:color="CBD5E1"/>
+              <w:right w:val="single" w:sz="4" w:space="0" w:color="CBD5E1"/>
+            </w:tcBorders>
+            <w:tcMar>
+              <w:top w:w="80" w:type="dxa"/>
+              <w:bottom w:w="80" w:type="dxa"/>
+              <w:left w:w="100" w:type="dxa"/>
+              <w:right w:w="100" w:type="dxa"/>
+            </w:tcMar>
+          </w:tcPr>
+          <w:p>
+            <w:pPr>
+              <w:spacing w:before="0" w:after="0"/>
+            </w:pPr>
+            <w:r>
+              <w:rPr>
+                <w:rFonts w:ascii="Segoe UI" w:hAnsi="Segoe UI"/>
+                <w:color w:val="334155"/>
+                <w:sz w:val="17"/>
+              </w:rPr>
+              <w:t>Administrativo</w:t>
+            </w:r>
+          </w:p>
+        </w:tc>
+        <w:tc>
+          <w:tcPr>
+            <w:tcW w:type="dxa" w:w="1605"/>
+            <w:shd w:val="clear" w:color="auto" w:fill="FFFFFF"/>
+            <w:tcBorders>
+              <w:top w:val="single" w:sz="4" w:space="0" w:color="CBD5E1"/>
+              <w:left w:val="single" w:sz="4" w:space="0" w:color="CBD5E1"/>
+              <w:bottom w:val="single" w:sz="4" w:space="0" w:color="CBD5E1"/>
+              <w:right w:val="single" w:sz="4" w:space="0" w:color="CBD5E1"/>
+            </w:tcBorders>
+            <w:tcMar>
+              <w:top w:w="80" w:type="dxa"/>
+              <w:bottom w:w="80" w:type="dxa"/>
+              <w:left w:w="100" w:type="dxa"/>
+              <w:right w:w="100" w:type="dxa"/>
+            </w:tcMar>
+          </w:tcPr>
+          <w:p>
+            <w:pPr>
+              <w:spacing w:before="0" w:after="0"/>
+            </w:pPr>
+            <w:r>
+              <w:rPr>
+                <w:rFonts w:ascii="Segoe UI" w:hAnsi="Segoe UI"/>
+                <w:color w:val="334155"/>
+                <w:sz w:val="17"/>
+              </w:rPr>
+              <w:t>NO</w:t>
+            </w:r>
+          </w:p>
+        </w:tc>
+        <w:tc>
+          <w:tcPr>
+            <w:tcW w:type="dxa" w:w="1605"/>
+            <w:shd w:val="clear" w:color="auto" w:fill="FFFFFF"/>
+            <w:tcBorders>
+              <w:top w:val="single" w:sz="4" w:space="0" w:color="CBD5E1"/>
+              <w:left w:val="single" w:sz="4" w:space="0" w:color="CBD5E1"/>
+              <w:bottom w:val="single" w:sz="4" w:space="0" w:color="CBD5E1"/>
+              <w:right w:val="single" w:sz="4" w:space="0" w:color="CBD5E1"/>
+            </w:tcBorders>
+            <w:tcMar>
+              <w:top w:w="80" w:type="dxa"/>
+              <w:bottom w:w="80" w:type="dxa"/>
+              <w:left w:w="100" w:type="dxa"/>
+              <w:right w:w="100" w:type="dxa"/>
+            </w:tcMar>
+          </w:tcPr>
+          <w:p>
+            <w:pPr>
+              <w:spacing w:before="0" w:after="0"/>
+            </w:pPr>
+            <w:r>
+              <w:rPr>
+                <w:rFonts w:ascii="Segoe UI" w:hAnsi="Segoe UI"/>
+                <w:color w:val="334155"/>
+                <w:sz w:val="17"/>
+              </w:rPr>
+              <w:t>Lunes a Viernes 42h</w:t>
+            </w:r>
+          </w:p>
+        </w:tc>
+        <w:tc>
+          <w:tcPr>
+            <w:tcW w:type="dxa" w:w="1605"/>
+            <w:shd w:val="clear" w:color="auto" w:fill="FFFFFF"/>
+            <w:tcBorders>
+              <w:top w:val="single" w:sz="4" w:space="0" w:color="CBD5E1"/>
+              <w:left w:val="single" w:sz="4" w:space="0" w:color="CBD5E1"/>
+              <w:bottom w:val="single" w:sz="4" w:space="0" w:color="CBD5E1"/>
+              <w:right w:val="single" w:sz="4" w:space="0" w:color="CBD5E1"/>
+            </w:tcBorders>
+            <w:tcMar>
+              <w:top w:w="80" w:type="dxa"/>
+              <w:bottom w:w="80" w:type="dxa"/>
+              <w:left w:w="100" w:type="dxa"/>
+              <w:right w:w="100" w:type="dxa"/>
+            </w:tcMar>
+          </w:tcPr>
+          <w:p>
+            <w:pPr>
+              <w:spacing w:before="0" w:after="0"/>
+            </w:pPr>
+            <w:r>
+              <w:rPr>
+                <w:rFonts w:ascii="Segoe UI" w:hAnsi="Segoe UI"/>
+                <w:color w:val="334155"/>
+                <w:sz w:val="17"/>
+              </w:rPr>
+              <w:t>NO LABORAL (Descanso obligatorio remunerado)</w:t>
+            </w:r>
+          </w:p>
+        </w:tc>
+      </w:tr>
+      <w:tr>
+        <w:tc>
+          <w:tcPr>
+            <w:tcW w:type="dxa" w:w="1605"/>
+            <w:shd w:val="clear" w:color="auto" w:fill="F8FAFC"/>
+            <w:tcBorders>
+              <w:top w:val="single" w:sz="4" w:space="0" w:color="CBD5E1"/>
+              <w:left w:val="single" w:sz="4" w:space="0" w:color="CBD5E1"/>
+              <w:bottom w:val="single" w:sz="4" w:space="0" w:color="CBD5E1"/>
+              <w:right w:val="single" w:sz="4" w:space="0" w:color="CBD5E1"/>
+            </w:tcBorders>
+            <w:tcMar>
+              <w:top w:w="80" w:type="dxa"/>
+              <w:bottom w:w="80" w:type="dxa"/>
+              <w:left w:w="100" w:type="dxa"/>
+              <w:right w:w="100" w:type="dxa"/>
+            </w:tcMar>
+          </w:tcPr>
+          <w:p>
+            <w:pPr>
+              <w:spacing w:before="0" w:after="0"/>
+            </w:pPr>
+            <w:r>
+              <w:rPr>
+                <w:rFonts w:ascii="Segoe UI" w:hAnsi="Segoe UI"/>
+                <w:b/>
+                <w:color w:val="0F172A"/>
+                <w:sz w:val="17"/>
+              </w:rPr>
+              <w:t>Administración / SENA</w:t>
+            </w:r>
+          </w:p>
+        </w:tc>
+        <w:tc>
+          <w:tcPr>
+            <w:tcW w:type="dxa" w:w="1605"/>
+            <w:shd w:val="clear" w:color="auto" w:fill="F8FAFC"/>
+            <w:tcBorders>
+              <w:top w:val="single" w:sz="4" w:space="0" w:color="CBD5E1"/>
+              <w:left w:val="single" w:sz="4" w:space="0" w:color="CBD5E1"/>
+              <w:bottom w:val="single" w:sz="4" w:space="0" w:color="CBD5E1"/>
+              <w:right w:val="single" w:sz="4" w:space="0" w:color="CBD5E1"/>
+            </w:tcBorders>
+            <w:tcMar>
+              <w:top w:w="80" w:type="dxa"/>
+              <w:bottom w:w="80" w:type="dxa"/>
+              <w:left w:w="100" w:type="dxa"/>
+              <w:right w:w="100" w:type="dxa"/>
+            </w:tcMar>
+          </w:tcPr>
+          <w:p>
+            <w:pPr>
+              <w:spacing w:before="0" w:after="0"/>
+            </w:pPr>
+            <w:r>
+              <w:rPr>
+                <w:rFonts w:ascii="Segoe UI" w:hAnsi="Segoe UI"/>
+                <w:color w:val="334155"/>
+                <w:sz w:val="17"/>
+              </w:rPr>
+              <w:t>Auxiliares SENA (Aprendices)</w:t>
+            </w:r>
+          </w:p>
+        </w:tc>
+        <w:tc>
+          <w:tcPr>
+            <w:tcW w:type="dxa" w:w="1605"/>
+            <w:shd w:val="clear" w:color="auto" w:fill="F8FAFC"/>
+            <w:tcBorders>
+              <w:top w:val="single" w:sz="4" w:space="0" w:color="CBD5E1"/>
+              <w:left w:val="single" w:sz="4" w:space="0" w:color="CBD5E1"/>
+              <w:bottom w:val="single" w:sz="4" w:space="0" w:color="CBD5E1"/>
+              <w:right w:val="single" w:sz="4" w:space="0" w:color="CBD5E1"/>
+            </w:tcBorders>
+            <w:tcMar>
+              <w:top w:w="80" w:type="dxa"/>
+              <w:bottom w:w="80" w:type="dxa"/>
+              <w:left w:w="100" w:type="dxa"/>
+              <w:right w:w="100" w:type="dxa"/>
+            </w:tcMar>
+          </w:tcPr>
+          <w:p>
+            <w:pPr>
+              <w:spacing w:before="0" w:after="0"/>
+            </w:pPr>
+            <w:r>
+              <w:rPr>
+                <w:rFonts w:ascii="Segoe UI" w:hAnsi="Segoe UI"/>
+                <w:color w:val="334155"/>
+                <w:sz w:val="17"/>
+              </w:rPr>
+              <w:t>Aprendices Apoyo</w:t>
+            </w:r>
+          </w:p>
+        </w:tc>
+        <w:tc>
+          <w:tcPr>
+            <w:tcW w:type="dxa" w:w="1605"/>
+            <w:shd w:val="clear" w:color="auto" w:fill="F8FAFC"/>
+            <w:tcBorders>
+              <w:top w:val="single" w:sz="4" w:space="0" w:color="CBD5E1"/>
+              <w:left w:val="single" w:sz="4" w:space="0" w:color="CBD5E1"/>
+              <w:bottom w:val="single" w:sz="4" w:space="0" w:color="CBD5E1"/>
+              <w:right w:val="single" w:sz="4" w:space="0" w:color="CBD5E1"/>
+            </w:tcBorders>
+            <w:tcMar>
+              <w:top w:w="80" w:type="dxa"/>
+              <w:bottom w:w="80" w:type="dxa"/>
+              <w:left w:w="100" w:type="dxa"/>
+              <w:right w:w="100" w:type="dxa"/>
+            </w:tcMar>
+          </w:tcPr>
+          <w:p>
+            <w:pPr>
+              <w:spacing w:before="0" w:after="0"/>
+            </w:pPr>
+            <w:r>
+              <w:rPr>
+                <w:rFonts w:ascii="Segoe UI" w:hAnsi="Segoe UI"/>
+                <w:color w:val="334155"/>
+                <w:sz w:val="17"/>
+              </w:rPr>
+              <w:t>NO</w:t>
+            </w:r>
+          </w:p>
+        </w:tc>
+        <w:tc>
+          <w:tcPr>
+            <w:tcW w:type="dxa" w:w="1605"/>
+            <w:shd w:val="clear" w:color="auto" w:fill="F8FAFC"/>
+            <w:tcBorders>
+              <w:top w:val="single" w:sz="4" w:space="0" w:color="CBD5E1"/>
+              <w:left w:val="single" w:sz="4" w:space="0" w:color="CBD5E1"/>
+              <w:bottom w:val="single" w:sz="4" w:space="0" w:color="CBD5E1"/>
+              <w:right w:val="single" w:sz="4" w:space="0" w:color="CBD5E1"/>
+            </w:tcBorders>
+            <w:tcMar>
+              <w:top w:w="80" w:type="dxa"/>
+              <w:bottom w:w="80" w:type="dxa"/>
+              <w:left w:w="100" w:type="dxa"/>
+              <w:right w:w="100" w:type="dxa"/>
+            </w:tcMar>
+          </w:tcPr>
+          <w:p>
+            <w:pPr>
+              <w:spacing w:before="0" w:after="0"/>
+            </w:pPr>
+            <w:r>
+              <w:rPr>
+                <w:rFonts w:ascii="Segoe UI" w:hAnsi="Segoe UI"/>
+                <w:color w:val="334155"/>
+                <w:sz w:val="17"/>
+              </w:rPr>
+              <w:t>Lunes a Viernes 42h</w:t>
+            </w:r>
+          </w:p>
+        </w:tc>
+        <w:tc>
+          <w:tcPr>
+            <w:tcW w:type="dxa" w:w="1605"/>
+            <w:shd w:val="clear" w:color="auto" w:fill="F8FAFC"/>
+            <w:tcBorders>
+              <w:top w:val="single" w:sz="4" w:space="0" w:color="CBD5E1"/>
+              <w:left w:val="single" w:sz="4" w:space="0" w:color="CBD5E1"/>
+              <w:bottom w:val="single" w:sz="4" w:space="0" w:color="CBD5E1"/>
+              <w:right w:val="single" w:sz="4" w:space="0" w:color="CBD5E1"/>
+            </w:tcBorders>
+            <w:tcMar>
+              <w:top w:w="80" w:type="dxa"/>
+              <w:bottom w:w="80" w:type="dxa"/>
+              <w:left w:w="100" w:type="dxa"/>
+              <w:right w:w="100" w:type="dxa"/>
+            </w:tcMar>
+          </w:tcPr>
+          <w:p>
+            <w:pPr>
+              <w:spacing w:before="0" w:after="0"/>
+            </w:pPr>
+            <w:r>
+              <w:rPr>
+                <w:rFonts w:ascii="Segoe UI" w:hAnsi="Segoe UI"/>
+                <w:color w:val="334155"/>
+                <w:sz w:val="17"/>
+              </w:rPr>
+              <w:t>NO LABORAL (Estricto según Contrato de Aprendizaje)</w:t>
+            </w:r>
+          </w:p>
+        </w:tc>
+      </w:tr>
+    </w:tbl>
+    <w:p>
+      <w:pPr>
+        <w:spacing w:after="80"/>
+      </w:pPr>
+    </w:p>
+    <w:p>
+      <w:pPr>
+        <w:pStyle w:val="Heading2"/>
+        <w:spacing w:before="240" w:after="80"/>
+      </w:pPr>
+      <w:r>
+        <w:rPr>
+          <w:rFonts w:ascii="Segoe UI" w:hAnsi="Segoe UI"/>
+          <w:b/>
+          <w:color w:val="EA580C"/>
+          <w:sz w:val="24"/>
+        </w:rPr>
+        <w:t>Particularidades Operativas por Cargo</w:t>
+      </w:r>
+    </w:p>
+    <w:p>
+      <w:pPr>
+        <w:pStyle w:val="ListBullet"/>
+        <w:spacing w:before="20" w:after="60"/>
+      </w:pPr>
+      <w:r>
+        <w:rPr>
+          <w:rFonts w:ascii="Segoe UI" w:hAnsi="Segoe UI"/>
+          <w:b/>
+          <w:color w:val="0F172A"/>
+          <w:sz w:val="18"/>
+        </w:rPr>
+        <w:t xml:space="preserve">1. Operadores de Maquinaria Pesada (2 Pulpos y 1 Montacargas): </w:t>
+      </w:r>
+      <w:r>
+        <w:rPr>
+          <w:rFonts w:ascii="Segoe UI" w:hAnsi="Segoe UI"/>
+          <w:color w:val="334155"/>
+          <w:sz w:val="18"/>
+        </w:rPr>
+        <w:t>Son el corazón del movimiento de chatarra y alimentación de prensas. Su presencia puntual es indispensable para que los ayudantes de patio y camiones puedan operar. Si uno de ellos falta, el sistema dispara alerta inmediata al Jefe de Patio.</w:t>
+      </w:r>
+    </w:p>
+    <w:p>
+      <w:pPr>
+        <w:pStyle w:val="ListBullet"/>
+        <w:spacing w:before="20" w:after="60"/>
+      </w:pPr>
+      <w:r>
+        <w:rPr>
+          <w:rFonts w:ascii="Segoe UI" w:hAnsi="Segoe UI"/>
+          <w:b/>
+          <w:color w:val="0F172A"/>
+          <w:sz w:val="18"/>
+        </w:rPr>
+        <w:t xml:space="preserve">2. Mecánico de Planta / Mantenimiento: </w:t>
+      </w:r>
+      <w:r>
+        <w:rPr>
+          <w:rFonts w:ascii="Segoe UI" w:hAnsi="Segoe UI"/>
+          <w:color w:val="334155"/>
+          <w:sz w:val="18"/>
+        </w:rPr>
+        <w:t>Mantiene operativas las grúas pulpo, el montacargas y los sistemas hidráulicos. Frecuentemente labora los sábados aprovechando que la planta tiene menor afluencia para realizar mantenimientos mayores.</w:t>
+      </w:r>
+    </w:p>
+    <w:p>
+      <w:pPr>
+        <w:pStyle w:val="ListBullet"/>
+        <w:spacing w:before="20" w:after="60"/>
+      </w:pPr>
+      <w:r>
+        <w:rPr>
+          <w:rFonts w:ascii="Segoe UI" w:hAnsi="Segoe UI"/>
+          <w:b/>
+          <w:color w:val="0F172A"/>
+          <w:sz w:val="18"/>
+        </w:rPr>
+        <w:t xml:space="preserve">3. Ayudantes de Patio: </w:t>
+      </w:r>
+      <w:r>
+        <w:rPr>
+          <w:rFonts w:ascii="Segoe UI" w:hAnsi="Segoe UI"/>
+          <w:color w:val="334155"/>
+          <w:sz w:val="18"/>
+        </w:rPr>
+        <w:t>Cuadrilla de clasificación manual, separación de metales, estiba y apoyo en patio. Fichan masivamente en garita y su tiempo se computa al minuto.</w:t>
+      </w:r>
+    </w:p>
+    <w:p>
+      <w:pPr>
+        <w:pStyle w:val="ListBullet"/>
+        <w:spacing w:before="20" w:after="60"/>
+      </w:pPr>
+      <w:r>
+        <w:rPr>
+          <w:rFonts w:ascii="Segoe UI" w:hAnsi="Segoe UI"/>
+          <w:b/>
+          <w:color w:val="0F172A"/>
+          <w:sz w:val="18"/>
+        </w:rPr>
+        <w:t xml:space="preserve">4. Personal Administrativo (Contadores, Auxiliares Contables y Administrativos): </w:t>
+      </w:r>
+      <w:r>
+        <w:rPr>
+          <w:rFonts w:ascii="Segoe UI" w:hAnsi="Segoe UI"/>
+          <w:color w:val="334155"/>
+          <w:sz w:val="18"/>
+        </w:rPr>
+        <w:t>Laboran estrictamente en la jornada ordinaria de lunes a viernes (42 horas). No laboran sábados ni domingos, salvo cierres de balance autorizados.</w:t>
+      </w:r>
+    </w:p>
+    <w:p>
+      <w:pPr>
+        <w:pStyle w:val="ListBullet"/>
+        <w:spacing w:before="20" w:after="60"/>
+      </w:pPr>
+      <w:r>
+        <w:rPr>
+          <w:rFonts w:ascii="Segoe UI" w:hAnsi="Segoe UI"/>
+          <w:b/>
+          <w:color w:val="0F172A"/>
+          <w:sz w:val="18"/>
+        </w:rPr>
+        <w:t xml:space="preserve">5. Auxiliares SENA (Aprendices en Etapa Lectiva o Productiva): </w:t>
+      </w:r>
+      <w:r>
+        <w:rPr>
+          <w:rFonts w:ascii="Segoe UI" w:hAnsi="Segoe UI"/>
+          <w:color w:val="334155"/>
+          <w:sz w:val="18"/>
+        </w:rPr>
+        <w:t>Bajo la legislación colombiana (Ley 789 de 2002), su vinculación es formativa mediante contrato de aprendizaje. El sistema garantiza que no se les asignen horas extras y genera el certificado de cumplimiento de asistencia quincenal para el SENA.</w:t>
+      </w:r>
+    </w:p>
+    <w:p>
+      <w:pPr>
+        <w:pStyle w:val="Heading1"/>
+        <w:spacing w:before="320" w:after="80"/>
+      </w:pPr>
+      <w:r>
+        <w:rPr>
+          <w:rFonts w:ascii="Segoe UI" w:hAnsi="Segoe UI"/>
+          <w:b/>
+          <w:color w:val="0F172A"/>
+          <w:sz w:val="31"/>
+        </w:rPr>
+        <w:t>3. Horario Laboral Oficial de la Empresa (Memorando Septiembre 2026)</w:t>
       </w:r>
     </w:p>
     <w:p>
@@ -2191,7 +4904,7 @@
                 <w:color w:val="334155"/>
                 <w:sz w:val="17"/>
               </w:rPr>
-              <w:t>NO LABORAL (Admin)</w:t>
+              <w:t>NO LABORAL (Admin/SENA)</w:t>
             </w:r>
           </w:p>
         </w:tc>
@@ -2380,7 +5093,7 @@
                 <w:color w:val="334155"/>
                 <w:sz w:val="17"/>
               </w:rPr>
-              <w:t>NO LABORAL (Admin)</w:t>
+              <w:t>NO LABORAL (Admin/SENA)</w:t>
             </w:r>
           </w:p>
         </w:tc>
@@ -2706,113 +5419,6 @@
     </w:p>
     <w:p>
       <w:pPr>
-        <w:pStyle w:val="Heading2"/>
-        <w:spacing w:before="240" w:after="80"/>
-      </w:pPr>
-      <w:r>
-        <w:rPr>
-          <w:rFonts w:ascii="Segoe UI" w:hAnsi="Segoe UI"/>
-          <w:b/>
-          <w:color w:val="EA580C"/>
-          <w:sz w:val="24"/>
-        </w:rPr>
-        <w:t>Particularidad del Personal de Patio (Fines de Semana)</w:t>
-      </w:r>
-    </w:p>
-    <w:p>
-      <w:pPr>
-        <w:pStyle w:val="ListBullet"/>
-        <w:spacing w:before="20" w:after="60"/>
-      </w:pPr>
-      <w:r>
-        <w:rPr>
-          <w:rFonts w:ascii="Segoe UI" w:hAnsi="Segoe UI"/>
-          <w:b/>
-          <w:color w:val="0F172A"/>
-          <w:sz w:val="18"/>
-        </w:rPr>
-        <w:t xml:space="preserve">• Régimen del Personal Administrativo: </w:t>
-      </w:r>
-      <w:r>
-        <w:rPr>
-          <w:rFonts w:ascii="Segoe UI" w:hAnsi="Segoe UI"/>
-          <w:color w:val="334155"/>
-          <w:sz w:val="18"/>
-        </w:rPr>
-        <w:t>Labora estrictamente de Lunes a Viernes (42 horas semanales). Sábados, domingos y festivos son días de descanso obligatorio.</w:t>
-      </w:r>
-    </w:p>
-    <w:p>
-      <w:pPr>
-        <w:pStyle w:val="ListBullet"/>
-        <w:spacing w:before="20" w:after="60"/>
-      </w:pPr>
-      <w:r>
-        <w:rPr>
-          <w:rFonts w:ascii="Segoe UI" w:hAnsi="Segoe UI"/>
-          <w:b/>
-          <w:color w:val="0F172A"/>
-          <w:sz w:val="18"/>
-        </w:rPr>
-        <w:t xml:space="preserve">• Régimen del Personal Operativo de Patio: </w:t>
-      </w:r>
-      <w:r>
-        <w:rPr>
-          <w:rFonts w:ascii="Segoe UI" w:hAnsi="Segoe UI"/>
-          <w:color w:val="334155"/>
-          <w:sz w:val="18"/>
-        </w:rPr>
-        <w:t>Cuando las necesidades operativas de la planta lo requieren (llegada de buques chatarra, camiones pesados o cargues urgentes), el personal de patio trabaja los sábados, domingos e incluso días festivos.</w:t>
-      </w:r>
-    </w:p>
-    <w:p>
-      <w:pPr>
-        <w:pStyle w:val="ListBullet"/>
-        <w:spacing w:before="20" w:after="60"/>
-      </w:pPr>
-      <w:r>
-        <w:rPr>
-          <w:rFonts w:ascii="Segoe UI" w:hAnsi="Segoe UI"/>
-          <w:b/>
-          <w:color w:val="0F172A"/>
-          <w:sz w:val="18"/>
-        </w:rPr>
-        <w:t xml:space="preserve">• Tratamiento de Horas en Sábado: </w:t>
-      </w:r>
-      <w:r>
-        <w:rPr>
-          <w:rFonts w:ascii="Segoe UI" w:hAnsi="Segoe UI"/>
-          <w:color w:val="334155"/>
-          <w:sz w:val="18"/>
-        </w:rPr>
-        <w:t>Al haberse cumplido las 42 horas ordinarias entre lunes y viernes, todo tiempo laborado en sábado por el personal de patio se liquida automáticamente como Horas Extras Diurnas (HED +25%) o Nocturnas (HEN +75%).</w:t>
-      </w:r>
-    </w:p>
-    <w:p>
-      <w:pPr>
-        <w:pStyle w:val="ListBullet"/>
-        <w:spacing w:before="20" w:after="60"/>
-      </w:pPr>
-      <w:r>
-        <w:rPr>
-          <w:rFonts w:ascii="Segoe UI" w:hAnsi="Segoe UI"/>
-          <w:b/>
-          <w:color w:val="0F172A"/>
-          <w:sz w:val="18"/>
-        </w:rPr>
-        <w:t xml:space="preserve">• Tratamiento de Horas en Domingo y Festivo: </w:t>
-      </w:r>
-      <w:r>
-        <w:rPr>
-          <w:rFonts w:ascii="Segoe UI" w:hAnsi="Segoe UI"/>
-          <w:color w:val="334155"/>
-          <w:sz w:val="18"/>
-        </w:rPr>
-        <w:t>Se liquida con el Recargo Dominical/Festivo de Ley (75% a 100%) más horas extras dominicales (HEDDF +100% / HENDF +150%), previa autorización formal del Jefe de Patio.</w:t>
-      </w:r>
-    </w:p>
-    <w:p>
-      <w:pPr>
         <w:spacing w:before="120" w:after="40"/>
         <w:jc w:val="center"/>
       </w:pPr>
@@ -2878,7 +5484,7 @@
           <w:color w:val="0F172A"/>
           <w:sz w:val="31"/>
         </w:rPr>
-        <w:t>3. El Kiosco de Garita: Experiencia del Trabajador con Cédula</w:t>
+        <w:t>4. El Kiosco de Garita: Experiencia del Trabajador con Cédula</w:t>
       </w:r>
     </w:p>
     <w:p>
@@ -3107,7 +5713,7 @@
           <w:color w:val="0F172A"/>
           <w:sz w:val="31"/>
         </w:rPr>
-        <w:t>4. Portal del Jefe de Área / Supervisor de Patio en Tiempo Real</w:t>
+        <w:t>5. Portal del Jefe de Área / Supervisor de Patio en Tiempo Real</w:t>
       </w:r>
     </w:p>
     <w:p>
@@ -3128,7 +5734,7 @@
           <w:color w:val="334155"/>
           <w:sz w:val="19"/>
         </w:rPr>
-        <w:t>Los jefes de cuadrilla y supervisores de patio necesitan saber con certeza qué trabajadores están disponibles antes de arrancar equipos pesados (grúas, prensas, equipos de oxicorte). El Jefe de Patio dispondrá de una web app móvil accesible desde su celular o tablet:</w:t>
+        <w:t>El Jefe de Patio cuenta con una web app móvil para supervisar la disponibilidad de sus cuadrillas y maquinaria pesada:</w:t>
       </w:r>
     </w:p>
     <w:tbl>
@@ -3461,7 +6067,7 @@
                 <w:color w:val="0F172A"/>
                 <w:sz w:val="17"/>
               </w:rPr>
-              <w:t>Alerta Automática a los 15 Minutos</w:t>
+              <w:t>Alertas de Maquinaria Pesada (15 min)</w:t>
             </w:r>
           </w:p>
         </w:tc>
@@ -3492,7 +6098,7 @@
                 <w:color w:val="334155"/>
                 <w:sz w:val="17"/>
               </w:rPr>
-              <w:t>A las 7:45 AM (Mar-Vie) u 8:15 AM (Lunes), el sistema alerta al celular si falta un puesto crítico (Oxigenista, Chofer de Grúa, Báscula).</w:t>
+              <w:t>A las 7:45 AM (Mar-Vie) u 8:15 AM (Lunes), alerta al celular si falta el Operador de Grúa Pulpo #1, Pulpo #2 o Montacargas.</w:t>
             </w:r>
           </w:p>
         </w:tc>
@@ -3523,7 +6129,7 @@
                 <w:color w:val="334155"/>
                 <w:sz w:val="17"/>
               </w:rPr>
-              <w:t>Evita paradas operativas en patio por falta de personal clave.</w:t>
+              <w:t>Evita paradas operativas en patio por falta de operadores de maquinaria clave.</w:t>
             </w:r>
           </w:p>
         </w:tc>
@@ -3778,7 +6384,7 @@
           <w:color w:val="EA580C"/>
           <w:sz w:val="17"/>
         </w:rPr>
-        <w:t>Figura Oficial: Diagrama 04: Secuencia — Monitoreo de Cuadrilla y Alertas de Puestos Críticos (docs/diagramas_naranjo_png/04_Secuencia_Monitoreo_Cuadrilla_Jefe_Patio.png)</w:t>
+        <w:t>Figura Oficial: Diagrama 04: Secuencia — Monitoreo de Cuadrilla y Alertas de Maquinaria Pesada (docs/diagramas_naranjo_png/04_Secuencia_Monitoreo_Cuadrilla_Jefe_Patio.png)</w:t>
       </w:r>
     </w:p>
     <w:p>
@@ -3793,7 +6399,7 @@
           <w:color w:val="0F172A"/>
           <w:sz w:val="31"/>
         </w:rPr>
-        <w:t>5. Motor de Liquidación de Jornadas y Horas Extras (CST Colombia)</w:t>
+        <w:t>6. Motor de Liquidación de Jornadas y Horas Extras (CST Colombia)</w:t>
       </w:r>
     </w:p>
     <w:p>
@@ -4077,7 +6683,7 @@
           <w:color w:val="0F172A"/>
           <w:sz w:val="31"/>
         </w:rPr>
-        <w:t>6. Modelo de Datos Relacional y Despliegue en Planta</w:t>
+        <w:t>7. Modelo de Datos Relacional y Despliegue en Planta</w:t>
       </w:r>
     </w:p>
     <w:p>
@@ -4343,7 +6949,7 @@
           <w:color w:val="0F172A"/>
           <w:sz w:val="31"/>
         </w:rPr>
-        <w:t>7. Cronograma de Implementación Propuesto (4 Semanas)</w:t>
+        <w:t>8. Cronograma de Implementación Propuesto (4 Semanas)</w:t>
       </w:r>
     </w:p>
     <w:p>
@@ -4492,7 +7098,7 @@
                 <w:color w:val="0F172A"/>
                 <w:sz w:val="17"/>
               </w:rPr>
-              <w:t>Semana 1: Configuración Horario 42h y Padrón</w:t>
+              <w:t>Semana 1: Horarios 42h y Padrón de Cargos</w:t>
             </w:r>
           </w:p>
         </w:tc>
@@ -4523,11 +7129,11 @@
                 <w:color w:val="334155"/>
                 <w:sz w:val="17"/>
               </w:rPr>
-              <w:t>• Parametrización del horario oficial Lunes a Viernes (L 8:00–16:30, M/V 7:30–17:00, M/J 7:30–17:30).</w:t>
+              <w:t>• Parametrización del horario oficial Lunes a Viernes.</w:t>
               <w:br/>
-              <w:t>• Carga del padrón de colaboradores con Cédulas de Ciudadanía.</w:t>
+              <w:t>• Carga de colaboradores: Jefe de Patio, 2 Pulpos, Montacargas, Mecánico, Ayudantes, Contadores, Auxiliares y SENA.</w:t>
               <w:br/>
-              <w:t>• Definición de cargos de Patio y Administración.</w:t>
+              <w:t>• Configuración de roles y permisos.</w:t>
             </w:r>
           </w:p>
         </w:tc>
@@ -4558,7 +7164,7 @@
                 <w:color w:val="334155"/>
                 <w:sz w:val="17"/>
               </w:rPr>
-              <w:t>Base de datos inicial parametrizada con los horarios y empleados reales de Naranjo.</w:t>
+              <w:t>Base de datos parametrizada con el personal y cargos reales de Naranjo.</w:t>
             </w:r>
           </w:p>
         </w:tc>
@@ -4725,7 +7331,7 @@
               </w:rPr>
               <w:t>• Construcción del portal móvil 'Mi Cuadrilla en Vivo' para supervisores de patio.</w:t>
               <w:br/>
-              <w:t>• Alertas de puestos críticos a 15 min.</w:t>
+              <w:t>• Alertas de puestos críticos de maquinaria a los 15 min.</w:t>
               <w:br/>
               <w:t>• Módulo de autorización de horas extras de sábado/domingo y exportador a Excel.</w:t>
             </w:r>
@@ -4938,7 +7544,7 @@
         <w:color w:val="64748B"/>
         <w:sz w:val="16"/>
       </w:rPr>
-      <w:t>Recuperaciones Naranjo Recycling S.A.S. — Sistema de Control de Acceso y Asistencia 42h (Cartagena)</w:t>
+      <w:t>Recuperaciones Naranjo Recycling S.A.S. — Control de Acceso, Asistencia 42h y Cargos de Planta (Cartagena)</w:t>
     </w:r>
   </w:p>
 </w:hdr>

</xml_diff>